<commit_message>
docs: populate the contents list and both page-number columns
Page numbers are taken from the rendered 49-page PDF export rather than
left to a field. A Word TOC field renders blank in Google Docs until it
is explicitly refreshed, and the document is read there, so the entries
are now static text with dot leaders and right-aligned numbers. The same
applies to the List of Tables and List of Figures, whose Page No.
columns the template asks for and which were previously empty in all 21
rows.

Also corrects the chapter 8 table numbering. Inserting the observability
section shifted the two table numbers to 8.03 and 8.04, leaving 8.01 and
8.02 unused; the sequence is contiguous again.

Adds paginate.js, which extracts the pagination from a PDF export, and
pagination.json recording the figures used, so the lists can be
regenerated rather than hand-maintained if the content changes.
</commit_message>
<xml_diff>
--- a/docs/ResumeForge_Applied_Software_Project_Report.docx
+++ b/docs/ResumeForge_Applied_Software_Project_Report.docx
@@ -734,25 +734,345 @@
         <w:t xml:space="preserve">Table of Contents</w:t>
       </w:r>
     </w:p>
-    <w:sdt>
-      <w:sdtPr>
-        <w:alias w:val="Contents"/>
-      </w:sdtPr>
-      <w:sdtContent>
-        <w:p>
-          <w:r>
-            <w:fldChar w:fldCharType="begin" w:dirty="true"/>
-            <w:instrText xml:space="preserve">TOC \h \o "1-2"</w:instrText>
-            <w:fldChar w:fldCharType="separate"/>
-          </w:r>
-        </w:p>
-        <w:p>
-          <w:r>
-            <w:fldChar w:fldCharType="end"/>
-          </w:r>
-        </w:p>
-      </w:sdtContent>
-    </w:sdt>
+    <w:p>
+      <w:pPr>
+        <w:spacing w:after="0" w:line="360"/>
+      </w:pPr>
+      <w:r>
+        <w:rPr>
+          <w:rFonts w:ascii="Times New Roman" w:cs="Times New Roman" w:eastAsia="Times New Roman" w:hAnsi="Times New Roman"/>
+          <w:color w:val="000000"/>
+          <w:sz w:val="24"/>
+          <w:szCs w:val="24"/>
+        </w:rPr>
+        <w:t xml:space="preserve"/>
+      </w:r>
+    </w:p>
+    <w:p>
+      <w:pPr>
+        <w:spacing w:after="90" w:line="240"/>
+        <w:ind w:left="0"/>
+      </w:pPr>
+      <w:r>
+        <w:rPr>
+          <w:rFonts w:ascii="Times New Roman" w:cs="Times New Roman" w:eastAsia="Times New Roman" w:hAnsi="Times New Roman"/>
+          <w:color w:val="000000"/>
+          <w:sz w:val="24"/>
+          <w:szCs w:val="24"/>
+        </w:rPr>
+        <w:t xml:space="preserve">List of Tables</w:t>
+      </w:r>
+      <w:r>
+        <w:rPr>
+          <w:rFonts w:ascii="Times New Roman" w:cs="Times New Roman" w:eastAsia="Times New Roman" w:hAnsi="Times New Roman"/>
+          <w:color w:val="000000"/>
+          <w:sz w:val="24"/>
+          <w:szCs w:val="24"/>
+        </w:rPr>
+        <w:ptab w:alignment="right" w:relativeTo="margin" w:leader="dot"/>
+        <w:t xml:space="preserve">6</w:t>
+      </w:r>
+    </w:p>
+    <w:p>
+      <w:pPr>
+        <w:spacing w:after="90" w:line="240"/>
+        <w:ind w:left="0"/>
+      </w:pPr>
+      <w:r>
+        <w:rPr>
+          <w:rFonts w:ascii="Times New Roman" w:cs="Times New Roman" w:eastAsia="Times New Roman" w:hAnsi="Times New Roman"/>
+          <w:color w:val="000000"/>
+          <w:sz w:val="24"/>
+          <w:szCs w:val="24"/>
+        </w:rPr>
+        <w:t xml:space="preserve">List of Figures</w:t>
+      </w:r>
+      <w:r>
+        <w:rPr>
+          <w:rFonts w:ascii="Times New Roman" w:cs="Times New Roman" w:eastAsia="Times New Roman" w:hAnsi="Times New Roman"/>
+          <w:color w:val="000000"/>
+          <w:sz w:val="24"/>
+          <w:szCs w:val="24"/>
+        </w:rPr>
+        <w:ptab w:alignment="right" w:relativeTo="margin" w:leader="dot"/>
+        <w:t xml:space="preserve">7</w:t>
+      </w:r>
+    </w:p>
+    <w:p>
+      <w:pPr>
+        <w:spacing w:after="90" w:line="240"/>
+        <w:ind w:left="0"/>
+      </w:pPr>
+      <w:r>
+        <w:rPr>
+          <w:rFonts w:ascii="Times New Roman" w:cs="Times New Roman" w:eastAsia="Times New Roman" w:hAnsi="Times New Roman"/>
+          <w:color w:val="000000"/>
+          <w:sz w:val="24"/>
+          <w:szCs w:val="24"/>
+        </w:rPr>
+        <w:t xml:space="preserve">Applied Software Project</w:t>
+      </w:r>
+      <w:r>
+        <w:rPr>
+          <w:rFonts w:ascii="Times New Roman" w:cs="Times New Roman" w:eastAsia="Times New Roman" w:hAnsi="Times New Roman"/>
+          <w:color w:val="000000"/>
+          <w:sz w:val="24"/>
+          <w:szCs w:val="24"/>
+        </w:rPr>
+        <w:ptab w:alignment="right" w:relativeTo="margin" w:leader="dot"/>
+        <w:t xml:space="preserve">8</w:t>
+      </w:r>
+    </w:p>
+    <w:p>
+      <w:pPr>
+        <w:spacing w:after="90" w:line="240"/>
+        <w:ind w:left="300"/>
+      </w:pPr>
+      <w:r>
+        <w:rPr>
+          <w:rFonts w:ascii="Times New Roman" w:cs="Times New Roman" w:eastAsia="Times New Roman" w:hAnsi="Times New Roman"/>
+          <w:color w:val="000000"/>
+          <w:sz w:val="24"/>
+          <w:szCs w:val="24"/>
+        </w:rPr>
+        <w:t xml:space="preserve">Abstract</w:t>
+      </w:r>
+      <w:r>
+        <w:rPr>
+          <w:rFonts w:ascii="Times New Roman" w:cs="Times New Roman" w:eastAsia="Times New Roman" w:hAnsi="Times New Roman"/>
+          <w:color w:val="000000"/>
+          <w:sz w:val="24"/>
+          <w:szCs w:val="24"/>
+        </w:rPr>
+        <w:ptab w:alignment="right" w:relativeTo="margin" w:leader="dot"/>
+        <w:t xml:space="preserve">8</w:t>
+      </w:r>
+    </w:p>
+    <w:p>
+      <w:pPr>
+        <w:spacing w:after="90" w:line="240"/>
+        <w:ind w:left="300"/>
+      </w:pPr>
+      <w:r>
+        <w:rPr>
+          <w:rFonts w:ascii="Times New Roman" w:cs="Times New Roman" w:eastAsia="Times New Roman" w:hAnsi="Times New Roman"/>
+          <w:color w:val="000000"/>
+          <w:sz w:val="24"/>
+          <w:szCs w:val="24"/>
+        </w:rPr>
+        <w:t xml:space="preserve">Project Description</w:t>
+      </w:r>
+      <w:r>
+        <w:rPr>
+          <w:rFonts w:ascii="Times New Roman" w:cs="Times New Roman" w:eastAsia="Times New Roman" w:hAnsi="Times New Roman"/>
+          <w:color w:val="000000"/>
+          <w:sz w:val="24"/>
+          <w:szCs w:val="24"/>
+        </w:rPr>
+        <w:ptab w:alignment="right" w:relativeTo="margin" w:leader="dot"/>
+        <w:t xml:space="preserve">10</w:t>
+      </w:r>
+    </w:p>
+    <w:p>
+      <w:pPr>
+        <w:spacing w:after="90" w:line="240"/>
+        <w:ind w:left="300"/>
+      </w:pPr>
+      <w:r>
+        <w:rPr>
+          <w:rFonts w:ascii="Times New Roman" w:cs="Times New Roman" w:eastAsia="Times New Roman" w:hAnsi="Times New Roman"/>
+          <w:color w:val="000000"/>
+          <w:sz w:val="24"/>
+          <w:szCs w:val="24"/>
+        </w:rPr>
+        <w:t xml:space="preserve">Requirement Gathering</w:t>
+      </w:r>
+      <w:r>
+        <w:rPr>
+          <w:rFonts w:ascii="Times New Roman" w:cs="Times New Roman" w:eastAsia="Times New Roman" w:hAnsi="Times New Roman"/>
+          <w:color w:val="000000"/>
+          <w:sz w:val="24"/>
+          <w:szCs w:val="24"/>
+        </w:rPr>
+        <w:ptab w:alignment="right" w:relativeTo="margin" w:leader="dot"/>
+        <w:t xml:space="preserve">13</w:t>
+      </w:r>
+    </w:p>
+    <w:p>
+      <w:pPr>
+        <w:spacing w:after="90" w:line="240"/>
+        <w:ind w:left="300"/>
+      </w:pPr>
+      <w:r>
+        <w:rPr>
+          <w:rFonts w:ascii="Times New Roman" w:cs="Times New Roman" w:eastAsia="Times New Roman" w:hAnsi="Times New Roman"/>
+          <w:color w:val="000000"/>
+          <w:sz w:val="24"/>
+          <w:szCs w:val="24"/>
+        </w:rPr>
+        <w:t xml:space="preserve">Class Diagrams</w:t>
+      </w:r>
+      <w:r>
+        <w:rPr>
+          <w:rFonts w:ascii="Times New Roman" w:cs="Times New Roman" w:eastAsia="Times New Roman" w:hAnsi="Times New Roman"/>
+          <w:color w:val="000000"/>
+          <w:sz w:val="24"/>
+          <w:szCs w:val="24"/>
+        </w:rPr>
+        <w:ptab w:alignment="right" w:relativeTo="margin" w:leader="dot"/>
+        <w:t xml:space="preserve">19</w:t>
+      </w:r>
+    </w:p>
+    <w:p>
+      <w:pPr>
+        <w:spacing w:after="90" w:line="240"/>
+        <w:ind w:left="300"/>
+      </w:pPr>
+      <w:r>
+        <w:rPr>
+          <w:rFonts w:ascii="Times New Roman" w:cs="Times New Roman" w:eastAsia="Times New Roman" w:hAnsi="Times New Roman"/>
+          <w:color w:val="000000"/>
+          <w:sz w:val="24"/>
+          <w:szCs w:val="24"/>
+        </w:rPr>
+        <w:t xml:space="preserve">Database Schema Design</w:t>
+      </w:r>
+      <w:r>
+        <w:rPr>
+          <w:rFonts w:ascii="Times New Roman" w:cs="Times New Roman" w:eastAsia="Times New Roman" w:hAnsi="Times New Roman"/>
+          <w:color w:val="000000"/>
+          <w:sz w:val="24"/>
+          <w:szCs w:val="24"/>
+        </w:rPr>
+        <w:ptab w:alignment="right" w:relativeTo="margin" w:leader="dot"/>
+        <w:t xml:space="preserve">23</w:t>
+      </w:r>
+    </w:p>
+    <w:p>
+      <w:pPr>
+        <w:spacing w:after="90" w:line="240"/>
+        <w:ind w:left="300"/>
+      </w:pPr>
+      <w:r>
+        <w:rPr>
+          <w:rFonts w:ascii="Times New Roman" w:cs="Times New Roman" w:eastAsia="Times New Roman" w:hAnsi="Times New Roman"/>
+          <w:color w:val="000000"/>
+          <w:sz w:val="24"/>
+          <w:szCs w:val="24"/>
+        </w:rPr>
+        <w:t xml:space="preserve">Feature Development Process</w:t>
+      </w:r>
+      <w:r>
+        <w:rPr>
+          <w:rFonts w:ascii="Times New Roman" w:cs="Times New Roman" w:eastAsia="Times New Roman" w:hAnsi="Times New Roman"/>
+          <w:color w:val="000000"/>
+          <w:sz w:val="24"/>
+          <w:szCs w:val="24"/>
+        </w:rPr>
+        <w:ptab w:alignment="right" w:relativeTo="margin" w:leader="dot"/>
+        <w:t xml:space="preserve">28</w:t>
+      </w:r>
+    </w:p>
+    <w:p>
+      <w:pPr>
+        <w:spacing w:after="90" w:line="240"/>
+        <w:ind w:left="300"/>
+      </w:pPr>
+      <w:r>
+        <w:rPr>
+          <w:rFonts w:ascii="Times New Roman" w:cs="Times New Roman" w:eastAsia="Times New Roman" w:hAnsi="Times New Roman"/>
+          <w:color w:val="000000"/>
+          <w:sz w:val="24"/>
+          <w:szCs w:val="24"/>
+        </w:rPr>
+        <w:t xml:space="preserve">Deployment Flow</w:t>
+      </w:r>
+      <w:r>
+        <w:rPr>
+          <w:rFonts w:ascii="Times New Roman" w:cs="Times New Roman" w:eastAsia="Times New Roman" w:hAnsi="Times New Roman"/>
+          <w:color w:val="000000"/>
+          <w:sz w:val="24"/>
+          <w:szCs w:val="24"/>
+        </w:rPr>
+        <w:ptab w:alignment="right" w:relativeTo="margin" w:leader="dot"/>
+        <w:t xml:space="preserve">33</w:t>
+      </w:r>
+    </w:p>
+    <w:p>
+      <w:pPr>
+        <w:spacing w:after="90" w:line="240"/>
+        <w:ind w:left="300"/>
+      </w:pPr>
+      <w:r>
+        <w:rPr>
+          <w:rFonts w:ascii="Times New Roman" w:cs="Times New Roman" w:eastAsia="Times New Roman" w:hAnsi="Times New Roman"/>
+          <w:color w:val="000000"/>
+          <w:sz w:val="24"/>
+          <w:szCs w:val="24"/>
+        </w:rPr>
+        <w:t xml:space="preserve">Technologies Used</w:t>
+      </w:r>
+      <w:r>
+        <w:rPr>
+          <w:rFonts w:ascii="Times New Roman" w:cs="Times New Roman" w:eastAsia="Times New Roman" w:hAnsi="Times New Roman"/>
+          <w:color w:val="000000"/>
+          <w:sz w:val="24"/>
+          <w:szCs w:val="24"/>
+        </w:rPr>
+        <w:ptab w:alignment="right" w:relativeTo="margin" w:leader="dot"/>
+        <w:t xml:space="preserve">37</w:t>
+      </w:r>
+    </w:p>
+    <w:p>
+      <w:pPr>
+        <w:spacing w:after="90" w:line="240"/>
+        <w:ind w:left="300"/>
+      </w:pPr>
+      <w:r>
+        <w:rPr>
+          <w:rFonts w:ascii="Times New Roman" w:cs="Times New Roman" w:eastAsia="Times New Roman" w:hAnsi="Times New Roman"/>
+          <w:color w:val="000000"/>
+          <w:sz w:val="24"/>
+          <w:szCs w:val="24"/>
+        </w:rPr>
+        <w:t xml:space="preserve">Conclusion</w:t>
+      </w:r>
+      <w:r>
+        <w:rPr>
+          <w:rFonts w:ascii="Times New Roman" w:cs="Times New Roman" w:eastAsia="Times New Roman" w:hAnsi="Times New Roman"/>
+          <w:color w:val="000000"/>
+          <w:sz w:val="24"/>
+          <w:szCs w:val="24"/>
+        </w:rPr>
+        <w:ptab w:alignment="right" w:relativeTo="margin" w:leader="dot"/>
+        <w:t xml:space="preserve">44</w:t>
+      </w:r>
+    </w:p>
+    <w:p>
+      <w:pPr>
+        <w:spacing w:after="90" w:line="240"/>
+        <w:ind w:left="300"/>
+      </w:pPr>
+      <w:r>
+        <w:rPr>
+          <w:rFonts w:ascii="Times New Roman" w:cs="Times New Roman" w:eastAsia="Times New Roman" w:hAnsi="Times New Roman"/>
+          <w:color w:val="000000"/>
+          <w:sz w:val="24"/>
+          <w:szCs w:val="24"/>
+        </w:rPr>
+        <w:t xml:space="preserve">References</w:t>
+      </w:r>
+      <w:r>
+        <w:rPr>
+          <w:rFonts w:ascii="Times New Roman" w:cs="Times New Roman" w:eastAsia="Times New Roman" w:hAnsi="Times New Roman"/>
+          <w:color w:val="000000"/>
+          <w:sz w:val="24"/>
+          <w:szCs w:val="24"/>
+        </w:rPr>
+        <w:ptab w:alignment="right" w:relativeTo="margin" w:leader="dot"/>
+        <w:t xml:space="preserve">48</w:t>
+      </w:r>
+    </w:p>
     <w:p>
       <w:r>
         <w:br w:type="page"/>
@@ -997,7 +1317,7 @@
                 <w:sz w:val="22"/>
                 <w:szCs w:val="22"/>
               </w:rPr>
-              <w:t xml:space="preserve"/>
+              <w:t xml:space="preserve">13</w:t>
             </w:r>
           </w:p>
         </w:tc>
@@ -1083,7 +1403,7 @@
                 <w:sz w:val="22"/>
                 <w:szCs w:val="22"/>
               </w:rPr>
-              <w:t xml:space="preserve"/>
+              <w:t xml:space="preserve">13</w:t>
             </w:r>
           </w:p>
         </w:tc>
@@ -1169,7 +1489,7 @@
                 <w:sz w:val="22"/>
                 <w:szCs w:val="22"/>
               </w:rPr>
-              <w:t xml:space="preserve"/>
+              <w:t xml:space="preserve">16</w:t>
             </w:r>
           </w:p>
         </w:tc>
@@ -1255,7 +1575,7 @@
                 <w:sz w:val="22"/>
                 <w:szCs w:val="22"/>
               </w:rPr>
-              <w:t xml:space="preserve"/>
+              <w:t xml:space="preserve">17</w:t>
             </w:r>
           </w:p>
         </w:tc>
@@ -1341,7 +1661,7 @@
                 <w:sz w:val="22"/>
                 <w:szCs w:val="22"/>
               </w:rPr>
-              <w:t xml:space="preserve"/>
+              <w:t xml:space="preserve">21</w:t>
             </w:r>
           </w:p>
         </w:tc>
@@ -1427,7 +1747,7 @@
                 <w:sz w:val="22"/>
                 <w:szCs w:val="22"/>
               </w:rPr>
-              <w:t xml:space="preserve"/>
+              <w:t xml:space="preserve">24</w:t>
             </w:r>
           </w:p>
         </w:tc>
@@ -1513,7 +1833,7 @@
                 <w:sz w:val="22"/>
                 <w:szCs w:val="22"/>
               </w:rPr>
-              <w:t xml:space="preserve"/>
+              <w:t xml:space="preserve">24</w:t>
             </w:r>
           </w:p>
         </w:tc>
@@ -1599,7 +1919,7 @@
                 <w:sz w:val="22"/>
                 <w:szCs w:val="22"/>
               </w:rPr>
-              <w:t xml:space="preserve"/>
+              <w:t xml:space="preserve">25</w:t>
             </w:r>
           </w:p>
         </w:tc>
@@ -1685,7 +2005,7 @@
                 <w:sz w:val="22"/>
                 <w:szCs w:val="22"/>
               </w:rPr>
-              <w:t xml:space="preserve"/>
+              <w:t xml:space="preserve">31</w:t>
             </w:r>
           </w:p>
         </w:tc>
@@ -1715,7 +2035,7 @@
                 <w:sz w:val="22"/>
                 <w:szCs w:val="22"/>
               </w:rPr>
-              <w:t xml:space="preserve">8.03</w:t>
+              <w:t xml:space="preserve">8.01</w:t>
             </w:r>
           </w:p>
         </w:tc>
@@ -1771,7 +2091,7 @@
                 <w:sz w:val="22"/>
                 <w:szCs w:val="22"/>
               </w:rPr>
-              <w:t xml:space="preserve"/>
+              <w:t xml:space="preserve">41</w:t>
             </w:r>
           </w:p>
         </w:tc>
@@ -1801,7 +2121,7 @@
                 <w:sz w:val="22"/>
                 <w:szCs w:val="22"/>
               </w:rPr>
-              <w:t xml:space="preserve">8.04</w:t>
+              <w:t xml:space="preserve">8.02</w:t>
             </w:r>
           </w:p>
         </w:tc>
@@ -1857,7 +2177,7 @@
                 <w:sz w:val="22"/>
                 <w:szCs w:val="22"/>
               </w:rPr>
-              <w:t xml:space="preserve"/>
+              <w:t xml:space="preserve">43</w:t>
             </w:r>
           </w:p>
         </w:tc>
@@ -1943,7 +2263,7 @@
                 <w:sz w:val="22"/>
                 <w:szCs w:val="22"/>
               </w:rPr>
-              <w:t xml:space="preserve"/>
+              <w:t xml:space="preserve">45</w:t>
             </w:r>
           </w:p>
         </w:tc>
@@ -2193,7 +2513,7 @@
                 <w:sz w:val="22"/>
                 <w:szCs w:val="22"/>
               </w:rPr>
-              <w:t xml:space="preserve"/>
+              <w:t xml:space="preserve">11</w:t>
             </w:r>
           </w:p>
         </w:tc>
@@ -2279,7 +2599,7 @@
                 <w:sz w:val="22"/>
                 <w:szCs w:val="22"/>
               </w:rPr>
-              <w:t xml:space="preserve"/>
+              <w:t xml:space="preserve">12</w:t>
             </w:r>
           </w:p>
         </w:tc>
@@ -2365,7 +2685,7 @@
                 <w:sz w:val="22"/>
                 <w:szCs w:val="22"/>
               </w:rPr>
-              <w:t xml:space="preserve"/>
+              <w:t xml:space="preserve">15</w:t>
             </w:r>
           </w:p>
         </w:tc>
@@ -2451,7 +2771,7 @@
                 <w:sz w:val="22"/>
                 <w:szCs w:val="22"/>
               </w:rPr>
-              <w:t xml:space="preserve"/>
+              <w:t xml:space="preserve">19</w:t>
             </w:r>
           </w:p>
         </w:tc>
@@ -2537,7 +2857,7 @@
                 <w:sz w:val="22"/>
                 <w:szCs w:val="22"/>
               </w:rPr>
-              <w:t xml:space="preserve"/>
+              <w:t xml:space="preserve">20</w:t>
             </w:r>
           </w:p>
         </w:tc>
@@ -2623,7 +2943,7 @@
                 <w:sz w:val="22"/>
                 <w:szCs w:val="22"/>
               </w:rPr>
-              <w:t xml:space="preserve"/>
+              <w:t xml:space="preserve">26</w:t>
             </w:r>
           </w:p>
         </w:tc>
@@ -2709,7 +3029,7 @@
                 <w:sz w:val="22"/>
                 <w:szCs w:val="22"/>
               </w:rPr>
-              <w:t xml:space="preserve"/>
+              <w:t xml:space="preserve">29</w:t>
             </w:r>
           </w:p>
         </w:tc>
@@ -2795,7 +3115,7 @@
                 <w:sz w:val="22"/>
                 <w:szCs w:val="22"/>
               </w:rPr>
-              <w:t xml:space="preserve"/>
+              <w:t xml:space="preserve">31</w:t>
             </w:r>
           </w:p>
         </w:tc>
@@ -2881,7 +3201,7 @@
                 <w:sz w:val="22"/>
                 <w:szCs w:val="22"/>
               </w:rPr>
-              <w:t xml:space="preserve"/>
+              <w:t xml:space="preserve">33</w:t>
             </w:r>
           </w:p>
         </w:tc>
@@ -15756,7 +16076,7 @@
           <w:sz w:val="22"/>
           <w:szCs w:val="22"/>
         </w:rPr>
-        <w:t xml:space="preserve">Table 8.03: Automated test suites</w:t>
+        <w:t xml:space="preserve">Table 8.01: Automated test suites</w:t>
       </w:r>
     </w:p>
     <w:tbl>
@@ -16670,7 +16990,7 @@
           <w:sz w:val="22"/>
           <w:szCs w:val="22"/>
         </w:rPr>
-        <w:t xml:space="preserve">Table 8.04: Technology selection and rationale</w:t>
+        <w:t xml:space="preserve">Table 8.02: Technology selection and rationale</w:t>
       </w:r>
     </w:p>
     <w:tbl>

</xml_diff>

<commit_message>
docs: fix three layout defects found by reviewing the rendered document
Inspecting the uploaded file in the browser rather than the XML surfaced
three problems that static checks had missed.

Tables overflowed the right margin. TW was set to 8700 twips, but A4 is
11906 and the 1.25in margins take 3600, leaving 8306 usable. Every table
therefore ran 394 twips past the text block. Reduced to 8300.

The contents list rendered with page numbers hard against the titles and
no dot leader. The cause was PositionalTab, a later OOXML feature Google
Docs does not honour; replaced with a conventional right tab stop with a
dot leader, which is core Word behaviour and renders everywhere.

The Req. ID column of table 3.04 was too narrow and broke 'Requirement'
across lines mid-word. Header shortened and the column weights
rebalanced.

Page numbers themselves were spot-checked against the rendered document
and are correct: Conclusion resolves to page 44 as listed.
</commit_message>
<xml_diff>
--- a/docs/ResumeForge_Applied_Software_Project_Report.docx
+++ b/docs/ResumeForge_Applied_Software_Project_Report.docx
@@ -750,6 +750,9 @@
     </w:p>
     <w:p>
       <w:pPr>
+        <w:tabs>
+          <w:tab w:val="right" w:pos="8300" w:leader="dot"/>
+        </w:tabs>
         <w:spacing w:after="90" w:line="240"/>
         <w:ind w:left="0"/>
       </w:pPr>
@@ -769,12 +772,15 @@
           <w:sz w:val="24"/>
           <w:szCs w:val="24"/>
         </w:rPr>
-        <w:ptab w:alignment="right" w:relativeTo="margin" w:leader="dot"/>
+        <w:tab/>
         <w:t xml:space="preserve">6</w:t>
       </w:r>
     </w:p>
     <w:p>
       <w:pPr>
+        <w:tabs>
+          <w:tab w:val="right" w:pos="8300" w:leader="dot"/>
+        </w:tabs>
         <w:spacing w:after="90" w:line="240"/>
         <w:ind w:left="0"/>
       </w:pPr>
@@ -794,12 +800,15 @@
           <w:sz w:val="24"/>
           <w:szCs w:val="24"/>
         </w:rPr>
-        <w:ptab w:alignment="right" w:relativeTo="margin" w:leader="dot"/>
+        <w:tab/>
         <w:t xml:space="preserve">7</w:t>
       </w:r>
     </w:p>
     <w:p>
       <w:pPr>
+        <w:tabs>
+          <w:tab w:val="right" w:pos="8300" w:leader="dot"/>
+        </w:tabs>
         <w:spacing w:after="90" w:line="240"/>
         <w:ind w:left="0"/>
       </w:pPr>
@@ -819,12 +828,15 @@
           <w:sz w:val="24"/>
           <w:szCs w:val="24"/>
         </w:rPr>
-        <w:ptab w:alignment="right" w:relativeTo="margin" w:leader="dot"/>
+        <w:tab/>
         <w:t xml:space="preserve">8</w:t>
       </w:r>
     </w:p>
     <w:p>
       <w:pPr>
+        <w:tabs>
+          <w:tab w:val="right" w:pos="8300" w:leader="dot"/>
+        </w:tabs>
         <w:spacing w:after="90" w:line="240"/>
         <w:ind w:left="300"/>
       </w:pPr>
@@ -844,12 +856,15 @@
           <w:sz w:val="24"/>
           <w:szCs w:val="24"/>
         </w:rPr>
-        <w:ptab w:alignment="right" w:relativeTo="margin" w:leader="dot"/>
+        <w:tab/>
         <w:t xml:space="preserve">8</w:t>
       </w:r>
     </w:p>
     <w:p>
       <w:pPr>
+        <w:tabs>
+          <w:tab w:val="right" w:pos="8300" w:leader="dot"/>
+        </w:tabs>
         <w:spacing w:after="90" w:line="240"/>
         <w:ind w:left="300"/>
       </w:pPr>
@@ -869,12 +884,15 @@
           <w:sz w:val="24"/>
           <w:szCs w:val="24"/>
         </w:rPr>
-        <w:ptab w:alignment="right" w:relativeTo="margin" w:leader="dot"/>
+        <w:tab/>
         <w:t xml:space="preserve">10</w:t>
       </w:r>
     </w:p>
     <w:p>
       <w:pPr>
+        <w:tabs>
+          <w:tab w:val="right" w:pos="8300" w:leader="dot"/>
+        </w:tabs>
         <w:spacing w:after="90" w:line="240"/>
         <w:ind w:left="300"/>
       </w:pPr>
@@ -894,12 +912,15 @@
           <w:sz w:val="24"/>
           <w:szCs w:val="24"/>
         </w:rPr>
-        <w:ptab w:alignment="right" w:relativeTo="margin" w:leader="dot"/>
+        <w:tab/>
         <w:t xml:space="preserve">13</w:t>
       </w:r>
     </w:p>
     <w:p>
       <w:pPr>
+        <w:tabs>
+          <w:tab w:val="right" w:pos="8300" w:leader="dot"/>
+        </w:tabs>
         <w:spacing w:after="90" w:line="240"/>
         <w:ind w:left="300"/>
       </w:pPr>
@@ -919,12 +940,15 @@
           <w:sz w:val="24"/>
           <w:szCs w:val="24"/>
         </w:rPr>
-        <w:ptab w:alignment="right" w:relativeTo="margin" w:leader="dot"/>
+        <w:tab/>
         <w:t xml:space="preserve">19</w:t>
       </w:r>
     </w:p>
     <w:p>
       <w:pPr>
+        <w:tabs>
+          <w:tab w:val="right" w:pos="8300" w:leader="dot"/>
+        </w:tabs>
         <w:spacing w:after="90" w:line="240"/>
         <w:ind w:left="300"/>
       </w:pPr>
@@ -944,12 +968,15 @@
           <w:sz w:val="24"/>
           <w:szCs w:val="24"/>
         </w:rPr>
-        <w:ptab w:alignment="right" w:relativeTo="margin" w:leader="dot"/>
+        <w:tab/>
         <w:t xml:space="preserve">23</w:t>
       </w:r>
     </w:p>
     <w:p>
       <w:pPr>
+        <w:tabs>
+          <w:tab w:val="right" w:pos="8300" w:leader="dot"/>
+        </w:tabs>
         <w:spacing w:after="90" w:line="240"/>
         <w:ind w:left="300"/>
       </w:pPr>
@@ -969,12 +996,15 @@
           <w:sz w:val="24"/>
           <w:szCs w:val="24"/>
         </w:rPr>
-        <w:ptab w:alignment="right" w:relativeTo="margin" w:leader="dot"/>
+        <w:tab/>
         <w:t xml:space="preserve">28</w:t>
       </w:r>
     </w:p>
     <w:p>
       <w:pPr>
+        <w:tabs>
+          <w:tab w:val="right" w:pos="8300" w:leader="dot"/>
+        </w:tabs>
         <w:spacing w:after="90" w:line="240"/>
         <w:ind w:left="300"/>
       </w:pPr>
@@ -994,12 +1024,15 @@
           <w:sz w:val="24"/>
           <w:szCs w:val="24"/>
         </w:rPr>
-        <w:ptab w:alignment="right" w:relativeTo="margin" w:leader="dot"/>
+        <w:tab/>
         <w:t xml:space="preserve">33</w:t>
       </w:r>
     </w:p>
     <w:p>
       <w:pPr>
+        <w:tabs>
+          <w:tab w:val="right" w:pos="8300" w:leader="dot"/>
+        </w:tabs>
         <w:spacing w:after="90" w:line="240"/>
         <w:ind w:left="300"/>
       </w:pPr>
@@ -1019,12 +1052,15 @@
           <w:sz w:val="24"/>
           <w:szCs w:val="24"/>
         </w:rPr>
-        <w:ptab w:alignment="right" w:relativeTo="margin" w:leader="dot"/>
+        <w:tab/>
         <w:t xml:space="preserve">37</w:t>
       </w:r>
     </w:p>
     <w:p>
       <w:pPr>
+        <w:tabs>
+          <w:tab w:val="right" w:pos="8300" w:leader="dot"/>
+        </w:tabs>
         <w:spacing w:after="90" w:line="240"/>
         <w:ind w:left="300"/>
       </w:pPr>
@@ -1044,12 +1080,15 @@
           <w:sz w:val="24"/>
           <w:szCs w:val="24"/>
         </w:rPr>
-        <w:ptab w:alignment="right" w:relativeTo="margin" w:leader="dot"/>
+        <w:tab/>
         <w:t xml:space="preserve">44</w:t>
       </w:r>
     </w:p>
     <w:p>
       <w:pPr>
+        <w:tabs>
+          <w:tab w:val="right" w:pos="8300" w:leader="dot"/>
+        </w:tabs>
         <w:spacing w:after="90" w:line="240"/>
         <w:ind w:left="300"/>
       </w:pPr>
@@ -1069,7 +1108,7 @@
           <w:sz w:val="24"/>
           <w:szCs w:val="24"/>
         </w:rPr>
-        <w:ptab w:alignment="right" w:relativeTo="margin" w:leader="dot"/>
+        <w:tab/>
         <w:t xml:space="preserve">48</w:t>
       </w:r>
     </w:p>
@@ -1129,7 +1168,7 @@
     </w:p>
     <w:tbl>
       <w:tblPr>
-        <w:tblW w:type="dxa" w:w="8700"/>
+        <w:tblW w:type="dxa" w:w="8300"/>
         <w:tblBorders>
           <w:top w:val="single" w:color="auto" w:sz="4"/>
           <w:left w:val="single" w:color="auto" w:sz="4"/>
@@ -1140,9 +1179,9 @@
         </w:tblBorders>
       </w:tblPr>
       <w:tblGrid>
-        <w:gridCol w:w="1411"/>
-        <w:gridCol w:w="5878"/>
-        <w:gridCol w:w="1411"/>
+        <w:gridCol w:w="1346"/>
+        <w:gridCol w:w="5608"/>
+        <w:gridCol w:w="1346"/>
       </w:tblGrid>
       <w:tr>
         <w:trPr>
@@ -1150,7 +1189,7 @@
         </w:trPr>
         <w:tc>
           <w:tcPr>
-            <w:tcW w:type="dxa" w:w="1411"/>
+            <w:tcW w:type="dxa" w:w="1346"/>
             <w:shd w:fill="D9D9D9" w:val="clear"/>
             <w:tcMar>
               <w:top w:type="dxa" w:w="70"/>
@@ -1179,7 +1218,7 @@
         </w:tc>
         <w:tc>
           <w:tcPr>
-            <w:tcW w:type="dxa" w:w="5878"/>
+            <w:tcW w:type="dxa" w:w="5608"/>
             <w:shd w:fill="D9D9D9" w:val="clear"/>
             <w:tcMar>
               <w:top w:type="dxa" w:w="70"/>
@@ -1208,7 +1247,7 @@
         </w:tc>
         <w:tc>
           <w:tcPr>
-            <w:tcW w:type="dxa" w:w="1411"/>
+            <w:tcW w:type="dxa" w:w="1346"/>
             <w:shd w:fill="D9D9D9" w:val="clear"/>
             <w:tcMar>
               <w:top w:type="dxa" w:w="70"/>
@@ -1239,7 +1278,7 @@
       <w:tr>
         <w:tc>
           <w:tcPr>
-            <w:tcW w:type="dxa" w:w="1411"/>
+            <w:tcW w:type="dxa" w:w="1346"/>
             <w:tcMar>
               <w:top w:type="dxa" w:w="70"/>
               <w:left w:type="dxa" w:w="110"/>
@@ -1267,7 +1306,7 @@
         </w:tc>
         <w:tc>
           <w:tcPr>
-            <w:tcW w:type="dxa" w:w="5878"/>
+            <w:tcW w:type="dxa" w:w="5608"/>
             <w:tcMar>
               <w:top w:type="dxa" w:w="70"/>
               <w:left w:type="dxa" w:w="110"/>
@@ -1295,7 +1334,7 @@
         </w:tc>
         <w:tc>
           <w:tcPr>
-            <w:tcW w:type="dxa" w:w="1411"/>
+            <w:tcW w:type="dxa" w:w="1346"/>
             <w:tcMar>
               <w:top w:type="dxa" w:w="70"/>
               <w:left w:type="dxa" w:w="110"/>
@@ -1325,7 +1364,7 @@
       <w:tr>
         <w:tc>
           <w:tcPr>
-            <w:tcW w:type="dxa" w:w="1411"/>
+            <w:tcW w:type="dxa" w:w="1346"/>
             <w:tcMar>
               <w:top w:type="dxa" w:w="70"/>
               <w:left w:type="dxa" w:w="110"/>
@@ -1353,7 +1392,7 @@
         </w:tc>
         <w:tc>
           <w:tcPr>
-            <w:tcW w:type="dxa" w:w="5878"/>
+            <w:tcW w:type="dxa" w:w="5608"/>
             <w:tcMar>
               <w:top w:type="dxa" w:w="70"/>
               <w:left w:type="dxa" w:w="110"/>
@@ -1381,7 +1420,7 @@
         </w:tc>
         <w:tc>
           <w:tcPr>
-            <w:tcW w:type="dxa" w:w="1411"/>
+            <w:tcW w:type="dxa" w:w="1346"/>
             <w:tcMar>
               <w:top w:type="dxa" w:w="70"/>
               <w:left w:type="dxa" w:w="110"/>
@@ -1411,7 +1450,7 @@
       <w:tr>
         <w:tc>
           <w:tcPr>
-            <w:tcW w:type="dxa" w:w="1411"/>
+            <w:tcW w:type="dxa" w:w="1346"/>
             <w:tcMar>
               <w:top w:type="dxa" w:w="70"/>
               <w:left w:type="dxa" w:w="110"/>
@@ -1439,7 +1478,7 @@
         </w:tc>
         <w:tc>
           <w:tcPr>
-            <w:tcW w:type="dxa" w:w="5878"/>
+            <w:tcW w:type="dxa" w:w="5608"/>
             <w:tcMar>
               <w:top w:type="dxa" w:w="70"/>
               <w:left w:type="dxa" w:w="110"/>
@@ -1467,7 +1506,7 @@
         </w:tc>
         <w:tc>
           <w:tcPr>
-            <w:tcW w:type="dxa" w:w="1411"/>
+            <w:tcW w:type="dxa" w:w="1346"/>
             <w:tcMar>
               <w:top w:type="dxa" w:w="70"/>
               <w:left w:type="dxa" w:w="110"/>
@@ -1497,7 +1536,7 @@
       <w:tr>
         <w:tc>
           <w:tcPr>
-            <w:tcW w:type="dxa" w:w="1411"/>
+            <w:tcW w:type="dxa" w:w="1346"/>
             <w:tcMar>
               <w:top w:type="dxa" w:w="70"/>
               <w:left w:type="dxa" w:w="110"/>
@@ -1525,7 +1564,7 @@
         </w:tc>
         <w:tc>
           <w:tcPr>
-            <w:tcW w:type="dxa" w:w="5878"/>
+            <w:tcW w:type="dxa" w:w="5608"/>
             <w:tcMar>
               <w:top w:type="dxa" w:w="70"/>
               <w:left w:type="dxa" w:w="110"/>
@@ -1553,7 +1592,7 @@
         </w:tc>
         <w:tc>
           <w:tcPr>
-            <w:tcW w:type="dxa" w:w="1411"/>
+            <w:tcW w:type="dxa" w:w="1346"/>
             <w:tcMar>
               <w:top w:type="dxa" w:w="70"/>
               <w:left w:type="dxa" w:w="110"/>
@@ -1583,7 +1622,7 @@
       <w:tr>
         <w:tc>
           <w:tcPr>
-            <w:tcW w:type="dxa" w:w="1411"/>
+            <w:tcW w:type="dxa" w:w="1346"/>
             <w:tcMar>
               <w:top w:type="dxa" w:w="70"/>
               <w:left w:type="dxa" w:w="110"/>
@@ -1611,7 +1650,7 @@
         </w:tc>
         <w:tc>
           <w:tcPr>
-            <w:tcW w:type="dxa" w:w="5878"/>
+            <w:tcW w:type="dxa" w:w="5608"/>
             <w:tcMar>
               <w:top w:type="dxa" w:w="70"/>
               <w:left w:type="dxa" w:w="110"/>
@@ -1639,7 +1678,7 @@
         </w:tc>
         <w:tc>
           <w:tcPr>
-            <w:tcW w:type="dxa" w:w="1411"/>
+            <w:tcW w:type="dxa" w:w="1346"/>
             <w:tcMar>
               <w:top w:type="dxa" w:w="70"/>
               <w:left w:type="dxa" w:w="110"/>
@@ -1669,7 +1708,7 @@
       <w:tr>
         <w:tc>
           <w:tcPr>
-            <w:tcW w:type="dxa" w:w="1411"/>
+            <w:tcW w:type="dxa" w:w="1346"/>
             <w:tcMar>
               <w:top w:type="dxa" w:w="70"/>
               <w:left w:type="dxa" w:w="110"/>
@@ -1697,7 +1736,7 @@
         </w:tc>
         <w:tc>
           <w:tcPr>
-            <w:tcW w:type="dxa" w:w="5878"/>
+            <w:tcW w:type="dxa" w:w="5608"/>
             <w:tcMar>
               <w:top w:type="dxa" w:w="70"/>
               <w:left w:type="dxa" w:w="110"/>
@@ -1725,7 +1764,7 @@
         </w:tc>
         <w:tc>
           <w:tcPr>
-            <w:tcW w:type="dxa" w:w="1411"/>
+            <w:tcW w:type="dxa" w:w="1346"/>
             <w:tcMar>
               <w:top w:type="dxa" w:w="70"/>
               <w:left w:type="dxa" w:w="110"/>
@@ -1755,7 +1794,7 @@
       <w:tr>
         <w:tc>
           <w:tcPr>
-            <w:tcW w:type="dxa" w:w="1411"/>
+            <w:tcW w:type="dxa" w:w="1346"/>
             <w:tcMar>
               <w:top w:type="dxa" w:w="70"/>
               <w:left w:type="dxa" w:w="110"/>
@@ -1783,7 +1822,7 @@
         </w:tc>
         <w:tc>
           <w:tcPr>
-            <w:tcW w:type="dxa" w:w="5878"/>
+            <w:tcW w:type="dxa" w:w="5608"/>
             <w:tcMar>
               <w:top w:type="dxa" w:w="70"/>
               <w:left w:type="dxa" w:w="110"/>
@@ -1811,7 +1850,7 @@
         </w:tc>
         <w:tc>
           <w:tcPr>
-            <w:tcW w:type="dxa" w:w="1411"/>
+            <w:tcW w:type="dxa" w:w="1346"/>
             <w:tcMar>
               <w:top w:type="dxa" w:w="70"/>
               <w:left w:type="dxa" w:w="110"/>
@@ -1841,7 +1880,7 @@
       <w:tr>
         <w:tc>
           <w:tcPr>
-            <w:tcW w:type="dxa" w:w="1411"/>
+            <w:tcW w:type="dxa" w:w="1346"/>
             <w:tcMar>
               <w:top w:type="dxa" w:w="70"/>
               <w:left w:type="dxa" w:w="110"/>
@@ -1869,7 +1908,7 @@
         </w:tc>
         <w:tc>
           <w:tcPr>
-            <w:tcW w:type="dxa" w:w="5878"/>
+            <w:tcW w:type="dxa" w:w="5608"/>
             <w:tcMar>
               <w:top w:type="dxa" w:w="70"/>
               <w:left w:type="dxa" w:w="110"/>
@@ -1897,7 +1936,7 @@
         </w:tc>
         <w:tc>
           <w:tcPr>
-            <w:tcW w:type="dxa" w:w="1411"/>
+            <w:tcW w:type="dxa" w:w="1346"/>
             <w:tcMar>
               <w:top w:type="dxa" w:w="70"/>
               <w:left w:type="dxa" w:w="110"/>
@@ -1927,7 +1966,7 @@
       <w:tr>
         <w:tc>
           <w:tcPr>
-            <w:tcW w:type="dxa" w:w="1411"/>
+            <w:tcW w:type="dxa" w:w="1346"/>
             <w:tcMar>
               <w:top w:type="dxa" w:w="70"/>
               <w:left w:type="dxa" w:w="110"/>
@@ -1955,7 +1994,7 @@
         </w:tc>
         <w:tc>
           <w:tcPr>
-            <w:tcW w:type="dxa" w:w="5878"/>
+            <w:tcW w:type="dxa" w:w="5608"/>
             <w:tcMar>
               <w:top w:type="dxa" w:w="70"/>
               <w:left w:type="dxa" w:w="110"/>
@@ -1983,7 +2022,7 @@
         </w:tc>
         <w:tc>
           <w:tcPr>
-            <w:tcW w:type="dxa" w:w="1411"/>
+            <w:tcW w:type="dxa" w:w="1346"/>
             <w:tcMar>
               <w:top w:type="dxa" w:w="70"/>
               <w:left w:type="dxa" w:w="110"/>
@@ -2013,7 +2052,7 @@
       <w:tr>
         <w:tc>
           <w:tcPr>
-            <w:tcW w:type="dxa" w:w="1411"/>
+            <w:tcW w:type="dxa" w:w="1346"/>
             <w:tcMar>
               <w:top w:type="dxa" w:w="70"/>
               <w:left w:type="dxa" w:w="110"/>
@@ -2041,7 +2080,7 @@
         </w:tc>
         <w:tc>
           <w:tcPr>
-            <w:tcW w:type="dxa" w:w="5878"/>
+            <w:tcW w:type="dxa" w:w="5608"/>
             <w:tcMar>
               <w:top w:type="dxa" w:w="70"/>
               <w:left w:type="dxa" w:w="110"/>
@@ -2069,7 +2108,7 @@
         </w:tc>
         <w:tc>
           <w:tcPr>
-            <w:tcW w:type="dxa" w:w="1411"/>
+            <w:tcW w:type="dxa" w:w="1346"/>
             <w:tcMar>
               <w:top w:type="dxa" w:w="70"/>
               <w:left w:type="dxa" w:w="110"/>
@@ -2099,7 +2138,7 @@
       <w:tr>
         <w:tc>
           <w:tcPr>
-            <w:tcW w:type="dxa" w:w="1411"/>
+            <w:tcW w:type="dxa" w:w="1346"/>
             <w:tcMar>
               <w:top w:type="dxa" w:w="70"/>
               <w:left w:type="dxa" w:w="110"/>
@@ -2127,7 +2166,7 @@
         </w:tc>
         <w:tc>
           <w:tcPr>
-            <w:tcW w:type="dxa" w:w="5878"/>
+            <w:tcW w:type="dxa" w:w="5608"/>
             <w:tcMar>
               <w:top w:type="dxa" w:w="70"/>
               <w:left w:type="dxa" w:w="110"/>
@@ -2155,7 +2194,7 @@
         </w:tc>
         <w:tc>
           <w:tcPr>
-            <w:tcW w:type="dxa" w:w="1411"/>
+            <w:tcW w:type="dxa" w:w="1346"/>
             <w:tcMar>
               <w:top w:type="dxa" w:w="70"/>
               <w:left w:type="dxa" w:w="110"/>
@@ -2185,7 +2224,7 @@
       <w:tr>
         <w:tc>
           <w:tcPr>
-            <w:tcW w:type="dxa" w:w="1411"/>
+            <w:tcW w:type="dxa" w:w="1346"/>
             <w:tcMar>
               <w:top w:type="dxa" w:w="70"/>
               <w:left w:type="dxa" w:w="110"/>
@@ -2213,7 +2252,7 @@
         </w:tc>
         <w:tc>
           <w:tcPr>
-            <w:tcW w:type="dxa" w:w="5878"/>
+            <w:tcW w:type="dxa" w:w="5608"/>
             <w:tcMar>
               <w:top w:type="dxa" w:w="70"/>
               <w:left w:type="dxa" w:w="110"/>
@@ -2241,7 +2280,7 @@
         </w:tc>
         <w:tc>
           <w:tcPr>
-            <w:tcW w:type="dxa" w:w="1411"/>
+            <w:tcW w:type="dxa" w:w="1346"/>
             <w:tcMar>
               <w:top w:type="dxa" w:w="70"/>
               <w:left w:type="dxa" w:w="110"/>
@@ -2325,7 +2364,7 @@
     </w:p>
     <w:tbl>
       <w:tblPr>
-        <w:tblW w:type="dxa" w:w="8700"/>
+        <w:tblW w:type="dxa" w:w="8300"/>
         <w:tblBorders>
           <w:top w:val="single" w:color="auto" w:sz="4"/>
           <w:left w:val="single" w:color="auto" w:sz="4"/>
@@ -2336,9 +2375,9 @@
         </w:tblBorders>
       </w:tblPr>
       <w:tblGrid>
-        <w:gridCol w:w="1411"/>
-        <w:gridCol w:w="5878"/>
-        <w:gridCol w:w="1411"/>
+        <w:gridCol w:w="1346"/>
+        <w:gridCol w:w="5608"/>
+        <w:gridCol w:w="1346"/>
       </w:tblGrid>
       <w:tr>
         <w:trPr>
@@ -2346,7 +2385,7 @@
         </w:trPr>
         <w:tc>
           <w:tcPr>
-            <w:tcW w:type="dxa" w:w="1411"/>
+            <w:tcW w:type="dxa" w:w="1346"/>
             <w:shd w:fill="D9D9D9" w:val="clear"/>
             <w:tcMar>
               <w:top w:type="dxa" w:w="70"/>
@@ -2375,7 +2414,7 @@
         </w:tc>
         <w:tc>
           <w:tcPr>
-            <w:tcW w:type="dxa" w:w="5878"/>
+            <w:tcW w:type="dxa" w:w="5608"/>
             <w:shd w:fill="D9D9D9" w:val="clear"/>
             <w:tcMar>
               <w:top w:type="dxa" w:w="70"/>
@@ -2404,7 +2443,7 @@
         </w:tc>
         <w:tc>
           <w:tcPr>
-            <w:tcW w:type="dxa" w:w="1411"/>
+            <w:tcW w:type="dxa" w:w="1346"/>
             <w:shd w:fill="D9D9D9" w:val="clear"/>
             <w:tcMar>
               <w:top w:type="dxa" w:w="70"/>
@@ -2435,7 +2474,7 @@
       <w:tr>
         <w:tc>
           <w:tcPr>
-            <w:tcW w:type="dxa" w:w="1411"/>
+            <w:tcW w:type="dxa" w:w="1346"/>
             <w:tcMar>
               <w:top w:type="dxa" w:w="70"/>
               <w:left w:type="dxa" w:w="110"/>
@@ -2463,7 +2502,7 @@
         </w:tc>
         <w:tc>
           <w:tcPr>
-            <w:tcW w:type="dxa" w:w="5878"/>
+            <w:tcW w:type="dxa" w:w="5608"/>
             <w:tcMar>
               <w:top w:type="dxa" w:w="70"/>
               <w:left w:type="dxa" w:w="110"/>
@@ -2491,7 +2530,7 @@
         </w:tc>
         <w:tc>
           <w:tcPr>
-            <w:tcW w:type="dxa" w:w="1411"/>
+            <w:tcW w:type="dxa" w:w="1346"/>
             <w:tcMar>
               <w:top w:type="dxa" w:w="70"/>
               <w:left w:type="dxa" w:w="110"/>
@@ -2521,7 +2560,7 @@
       <w:tr>
         <w:tc>
           <w:tcPr>
-            <w:tcW w:type="dxa" w:w="1411"/>
+            <w:tcW w:type="dxa" w:w="1346"/>
             <w:tcMar>
               <w:top w:type="dxa" w:w="70"/>
               <w:left w:type="dxa" w:w="110"/>
@@ -2549,7 +2588,7 @@
         </w:tc>
         <w:tc>
           <w:tcPr>
-            <w:tcW w:type="dxa" w:w="5878"/>
+            <w:tcW w:type="dxa" w:w="5608"/>
             <w:tcMar>
               <w:top w:type="dxa" w:w="70"/>
               <w:left w:type="dxa" w:w="110"/>
@@ -2577,7 +2616,7 @@
         </w:tc>
         <w:tc>
           <w:tcPr>
-            <w:tcW w:type="dxa" w:w="1411"/>
+            <w:tcW w:type="dxa" w:w="1346"/>
             <w:tcMar>
               <w:top w:type="dxa" w:w="70"/>
               <w:left w:type="dxa" w:w="110"/>
@@ -2607,7 +2646,7 @@
       <w:tr>
         <w:tc>
           <w:tcPr>
-            <w:tcW w:type="dxa" w:w="1411"/>
+            <w:tcW w:type="dxa" w:w="1346"/>
             <w:tcMar>
               <w:top w:type="dxa" w:w="70"/>
               <w:left w:type="dxa" w:w="110"/>
@@ -2635,7 +2674,7 @@
         </w:tc>
         <w:tc>
           <w:tcPr>
-            <w:tcW w:type="dxa" w:w="5878"/>
+            <w:tcW w:type="dxa" w:w="5608"/>
             <w:tcMar>
               <w:top w:type="dxa" w:w="70"/>
               <w:left w:type="dxa" w:w="110"/>
@@ -2663,7 +2702,7 @@
         </w:tc>
         <w:tc>
           <w:tcPr>
-            <w:tcW w:type="dxa" w:w="1411"/>
+            <w:tcW w:type="dxa" w:w="1346"/>
             <w:tcMar>
               <w:top w:type="dxa" w:w="70"/>
               <w:left w:type="dxa" w:w="110"/>
@@ -2693,7 +2732,7 @@
       <w:tr>
         <w:tc>
           <w:tcPr>
-            <w:tcW w:type="dxa" w:w="1411"/>
+            <w:tcW w:type="dxa" w:w="1346"/>
             <w:tcMar>
               <w:top w:type="dxa" w:w="70"/>
               <w:left w:type="dxa" w:w="110"/>
@@ -2721,7 +2760,7 @@
         </w:tc>
         <w:tc>
           <w:tcPr>
-            <w:tcW w:type="dxa" w:w="5878"/>
+            <w:tcW w:type="dxa" w:w="5608"/>
             <w:tcMar>
               <w:top w:type="dxa" w:w="70"/>
               <w:left w:type="dxa" w:w="110"/>
@@ -2749,7 +2788,7 @@
         </w:tc>
         <w:tc>
           <w:tcPr>
-            <w:tcW w:type="dxa" w:w="1411"/>
+            <w:tcW w:type="dxa" w:w="1346"/>
             <w:tcMar>
               <w:top w:type="dxa" w:w="70"/>
               <w:left w:type="dxa" w:w="110"/>
@@ -2779,7 +2818,7 @@
       <w:tr>
         <w:tc>
           <w:tcPr>
-            <w:tcW w:type="dxa" w:w="1411"/>
+            <w:tcW w:type="dxa" w:w="1346"/>
             <w:tcMar>
               <w:top w:type="dxa" w:w="70"/>
               <w:left w:type="dxa" w:w="110"/>
@@ -2807,7 +2846,7 @@
         </w:tc>
         <w:tc>
           <w:tcPr>
-            <w:tcW w:type="dxa" w:w="5878"/>
+            <w:tcW w:type="dxa" w:w="5608"/>
             <w:tcMar>
               <w:top w:type="dxa" w:w="70"/>
               <w:left w:type="dxa" w:w="110"/>
@@ -2835,7 +2874,7 @@
         </w:tc>
         <w:tc>
           <w:tcPr>
-            <w:tcW w:type="dxa" w:w="1411"/>
+            <w:tcW w:type="dxa" w:w="1346"/>
             <w:tcMar>
               <w:top w:type="dxa" w:w="70"/>
               <w:left w:type="dxa" w:w="110"/>
@@ -2865,7 +2904,7 @@
       <w:tr>
         <w:tc>
           <w:tcPr>
-            <w:tcW w:type="dxa" w:w="1411"/>
+            <w:tcW w:type="dxa" w:w="1346"/>
             <w:tcMar>
               <w:top w:type="dxa" w:w="70"/>
               <w:left w:type="dxa" w:w="110"/>
@@ -2893,7 +2932,7 @@
         </w:tc>
         <w:tc>
           <w:tcPr>
-            <w:tcW w:type="dxa" w:w="5878"/>
+            <w:tcW w:type="dxa" w:w="5608"/>
             <w:tcMar>
               <w:top w:type="dxa" w:w="70"/>
               <w:left w:type="dxa" w:w="110"/>
@@ -2921,7 +2960,7 @@
         </w:tc>
         <w:tc>
           <w:tcPr>
-            <w:tcW w:type="dxa" w:w="1411"/>
+            <w:tcW w:type="dxa" w:w="1346"/>
             <w:tcMar>
               <w:top w:type="dxa" w:w="70"/>
               <w:left w:type="dxa" w:w="110"/>
@@ -2951,7 +2990,7 @@
       <w:tr>
         <w:tc>
           <w:tcPr>
-            <w:tcW w:type="dxa" w:w="1411"/>
+            <w:tcW w:type="dxa" w:w="1346"/>
             <w:tcMar>
               <w:top w:type="dxa" w:w="70"/>
               <w:left w:type="dxa" w:w="110"/>
@@ -2979,7 +3018,7 @@
         </w:tc>
         <w:tc>
           <w:tcPr>
-            <w:tcW w:type="dxa" w:w="5878"/>
+            <w:tcW w:type="dxa" w:w="5608"/>
             <w:tcMar>
               <w:top w:type="dxa" w:w="70"/>
               <w:left w:type="dxa" w:w="110"/>
@@ -3007,7 +3046,7 @@
         </w:tc>
         <w:tc>
           <w:tcPr>
-            <w:tcW w:type="dxa" w:w="1411"/>
+            <w:tcW w:type="dxa" w:w="1346"/>
             <w:tcMar>
               <w:top w:type="dxa" w:w="70"/>
               <w:left w:type="dxa" w:w="110"/>
@@ -3037,7 +3076,7 @@
       <w:tr>
         <w:tc>
           <w:tcPr>
-            <w:tcW w:type="dxa" w:w="1411"/>
+            <w:tcW w:type="dxa" w:w="1346"/>
             <w:tcMar>
               <w:top w:type="dxa" w:w="70"/>
               <w:left w:type="dxa" w:w="110"/>
@@ -3065,7 +3104,7 @@
         </w:tc>
         <w:tc>
           <w:tcPr>
-            <w:tcW w:type="dxa" w:w="5878"/>
+            <w:tcW w:type="dxa" w:w="5608"/>
             <w:tcMar>
               <w:top w:type="dxa" w:w="70"/>
               <w:left w:type="dxa" w:w="110"/>
@@ -3093,7 +3132,7 @@
         </w:tc>
         <w:tc>
           <w:tcPr>
-            <w:tcW w:type="dxa" w:w="1411"/>
+            <w:tcW w:type="dxa" w:w="1346"/>
             <w:tcMar>
               <w:top w:type="dxa" w:w="70"/>
               <w:left w:type="dxa" w:w="110"/>
@@ -3123,7 +3162,7 @@
       <w:tr>
         <w:tc>
           <w:tcPr>
-            <w:tcW w:type="dxa" w:w="1411"/>
+            <w:tcW w:type="dxa" w:w="1346"/>
             <w:tcMar>
               <w:top w:type="dxa" w:w="70"/>
               <w:left w:type="dxa" w:w="110"/>
@@ -3151,7 +3190,7 @@
         </w:tc>
         <w:tc>
           <w:tcPr>
-            <w:tcW w:type="dxa" w:w="5878"/>
+            <w:tcW w:type="dxa" w:w="5608"/>
             <w:tcMar>
               <w:top w:type="dxa" w:w="70"/>
               <w:left w:type="dxa" w:w="110"/>
@@ -3179,7 +3218,7 @@
         </w:tc>
         <w:tc>
           <w:tcPr>
-            <w:tcW w:type="dxa" w:w="1411"/>
+            <w:tcW w:type="dxa" w:w="1346"/>
             <w:tcMar>
               <w:top w:type="dxa" w:w="70"/>
               <w:left w:type="dxa" w:w="110"/>
@@ -3876,7 +3915,7 @@
     </w:p>
     <w:tbl>
       <w:tblPr>
-        <w:tblW w:type="dxa" w:w="8700"/>
+        <w:tblW w:type="dxa" w:w="8300"/>
         <w:tblBorders>
           <w:top w:val="single" w:color="auto" w:sz="4"/>
           <w:left w:val="single" w:color="auto" w:sz="4"/>
@@ -3887,9 +3926,9 @@
         </w:tblBorders>
       </w:tblPr>
       <w:tblGrid>
-        <w:gridCol w:w="946"/>
-        <w:gridCol w:w="6620"/>
-        <w:gridCol w:w="1134"/>
+        <w:gridCol w:w="902"/>
+        <w:gridCol w:w="6315"/>
+        <w:gridCol w:w="1083"/>
       </w:tblGrid>
       <w:tr>
         <w:trPr>
@@ -3897,7 +3936,7 @@
         </w:trPr>
         <w:tc>
           <w:tcPr>
-            <w:tcW w:type="dxa" w:w="946"/>
+            <w:tcW w:type="dxa" w:w="902"/>
             <w:shd w:fill="D9D9D9" w:val="clear"/>
             <w:tcMar>
               <w:top w:type="dxa" w:w="70"/>
@@ -3926,7 +3965,7 @@
         </w:tc>
         <w:tc>
           <w:tcPr>
-            <w:tcW w:type="dxa" w:w="6620"/>
+            <w:tcW w:type="dxa" w:w="6315"/>
             <w:shd w:fill="D9D9D9" w:val="clear"/>
             <w:tcMar>
               <w:top w:type="dxa" w:w="70"/>
@@ -3955,7 +3994,7 @@
         </w:tc>
         <w:tc>
           <w:tcPr>
-            <w:tcW w:type="dxa" w:w="1134"/>
+            <w:tcW w:type="dxa" w:w="1083"/>
             <w:shd w:fill="D9D9D9" w:val="clear"/>
             <w:tcMar>
               <w:top w:type="dxa" w:w="70"/>
@@ -3986,7 +4025,7 @@
       <w:tr>
         <w:tc>
           <w:tcPr>
-            <w:tcW w:type="dxa" w:w="946"/>
+            <w:tcW w:type="dxa" w:w="902"/>
             <w:tcMar>
               <w:top w:type="dxa" w:w="70"/>
               <w:left w:type="dxa" w:w="110"/>
@@ -4014,7 +4053,7 @@
         </w:tc>
         <w:tc>
           <w:tcPr>
-            <w:tcW w:type="dxa" w:w="6620"/>
+            <w:tcW w:type="dxa" w:w="6315"/>
             <w:tcMar>
               <w:top w:type="dxa" w:w="70"/>
               <w:left w:type="dxa" w:w="110"/>
@@ -4042,7 +4081,7 @@
         </w:tc>
         <w:tc>
           <w:tcPr>
-            <w:tcW w:type="dxa" w:w="1134"/>
+            <w:tcW w:type="dxa" w:w="1083"/>
             <w:tcMar>
               <w:top w:type="dxa" w:w="70"/>
               <w:left w:type="dxa" w:w="110"/>
@@ -4072,7 +4111,7 @@
       <w:tr>
         <w:tc>
           <w:tcPr>
-            <w:tcW w:type="dxa" w:w="946"/>
+            <w:tcW w:type="dxa" w:w="902"/>
             <w:tcMar>
               <w:top w:type="dxa" w:w="70"/>
               <w:left w:type="dxa" w:w="110"/>
@@ -4100,7 +4139,7 @@
         </w:tc>
         <w:tc>
           <w:tcPr>
-            <w:tcW w:type="dxa" w:w="6620"/>
+            <w:tcW w:type="dxa" w:w="6315"/>
             <w:tcMar>
               <w:top w:type="dxa" w:w="70"/>
               <w:left w:type="dxa" w:w="110"/>
@@ -4128,7 +4167,7 @@
         </w:tc>
         <w:tc>
           <w:tcPr>
-            <w:tcW w:type="dxa" w:w="1134"/>
+            <w:tcW w:type="dxa" w:w="1083"/>
             <w:tcMar>
               <w:top w:type="dxa" w:w="70"/>
               <w:left w:type="dxa" w:w="110"/>
@@ -4158,7 +4197,7 @@
       <w:tr>
         <w:tc>
           <w:tcPr>
-            <w:tcW w:type="dxa" w:w="946"/>
+            <w:tcW w:type="dxa" w:w="902"/>
             <w:tcMar>
               <w:top w:type="dxa" w:w="70"/>
               <w:left w:type="dxa" w:w="110"/>
@@ -4186,7 +4225,7 @@
         </w:tc>
         <w:tc>
           <w:tcPr>
-            <w:tcW w:type="dxa" w:w="6620"/>
+            <w:tcW w:type="dxa" w:w="6315"/>
             <w:tcMar>
               <w:top w:type="dxa" w:w="70"/>
               <w:left w:type="dxa" w:w="110"/>
@@ -4214,7 +4253,7 @@
         </w:tc>
         <w:tc>
           <w:tcPr>
-            <w:tcW w:type="dxa" w:w="1134"/>
+            <w:tcW w:type="dxa" w:w="1083"/>
             <w:tcMar>
               <w:top w:type="dxa" w:w="70"/>
               <w:left w:type="dxa" w:w="110"/>
@@ -4244,7 +4283,7 @@
       <w:tr>
         <w:tc>
           <w:tcPr>
-            <w:tcW w:type="dxa" w:w="946"/>
+            <w:tcW w:type="dxa" w:w="902"/>
             <w:tcMar>
               <w:top w:type="dxa" w:w="70"/>
               <w:left w:type="dxa" w:w="110"/>
@@ -4272,7 +4311,7 @@
         </w:tc>
         <w:tc>
           <w:tcPr>
-            <w:tcW w:type="dxa" w:w="6620"/>
+            <w:tcW w:type="dxa" w:w="6315"/>
             <w:tcMar>
               <w:top w:type="dxa" w:w="70"/>
               <w:left w:type="dxa" w:w="110"/>
@@ -4300,7 +4339,7 @@
         </w:tc>
         <w:tc>
           <w:tcPr>
-            <w:tcW w:type="dxa" w:w="1134"/>
+            <w:tcW w:type="dxa" w:w="1083"/>
             <w:tcMar>
               <w:top w:type="dxa" w:w="70"/>
               <w:left w:type="dxa" w:w="110"/>
@@ -4330,7 +4369,7 @@
       <w:tr>
         <w:tc>
           <w:tcPr>
-            <w:tcW w:type="dxa" w:w="946"/>
+            <w:tcW w:type="dxa" w:w="902"/>
             <w:tcMar>
               <w:top w:type="dxa" w:w="70"/>
               <w:left w:type="dxa" w:w="110"/>
@@ -4358,7 +4397,7 @@
         </w:tc>
         <w:tc>
           <w:tcPr>
-            <w:tcW w:type="dxa" w:w="6620"/>
+            <w:tcW w:type="dxa" w:w="6315"/>
             <w:tcMar>
               <w:top w:type="dxa" w:w="70"/>
               <w:left w:type="dxa" w:w="110"/>
@@ -4386,7 +4425,7 @@
         </w:tc>
         <w:tc>
           <w:tcPr>
-            <w:tcW w:type="dxa" w:w="1134"/>
+            <w:tcW w:type="dxa" w:w="1083"/>
             <w:tcMar>
               <w:top w:type="dxa" w:w="70"/>
               <w:left w:type="dxa" w:w="110"/>
@@ -4416,7 +4455,7 @@
       <w:tr>
         <w:tc>
           <w:tcPr>
-            <w:tcW w:type="dxa" w:w="946"/>
+            <w:tcW w:type="dxa" w:w="902"/>
             <w:tcMar>
               <w:top w:type="dxa" w:w="70"/>
               <w:left w:type="dxa" w:w="110"/>
@@ -4444,7 +4483,7 @@
         </w:tc>
         <w:tc>
           <w:tcPr>
-            <w:tcW w:type="dxa" w:w="6620"/>
+            <w:tcW w:type="dxa" w:w="6315"/>
             <w:tcMar>
               <w:top w:type="dxa" w:w="70"/>
               <w:left w:type="dxa" w:w="110"/>
@@ -4472,7 +4511,7 @@
         </w:tc>
         <w:tc>
           <w:tcPr>
-            <w:tcW w:type="dxa" w:w="1134"/>
+            <w:tcW w:type="dxa" w:w="1083"/>
             <w:tcMar>
               <w:top w:type="dxa" w:w="70"/>
               <w:left w:type="dxa" w:w="110"/>
@@ -4502,7 +4541,7 @@
       <w:tr>
         <w:tc>
           <w:tcPr>
-            <w:tcW w:type="dxa" w:w="946"/>
+            <w:tcW w:type="dxa" w:w="902"/>
             <w:tcMar>
               <w:top w:type="dxa" w:w="70"/>
               <w:left w:type="dxa" w:w="110"/>
@@ -4530,7 +4569,7 @@
         </w:tc>
         <w:tc>
           <w:tcPr>
-            <w:tcW w:type="dxa" w:w="6620"/>
+            <w:tcW w:type="dxa" w:w="6315"/>
             <w:tcMar>
               <w:top w:type="dxa" w:w="70"/>
               <w:left w:type="dxa" w:w="110"/>
@@ -4558,7 +4597,7 @@
         </w:tc>
         <w:tc>
           <w:tcPr>
-            <w:tcW w:type="dxa" w:w="1134"/>
+            <w:tcW w:type="dxa" w:w="1083"/>
             <w:tcMar>
               <w:top w:type="dxa" w:w="70"/>
               <w:left w:type="dxa" w:w="110"/>
@@ -4588,7 +4627,7 @@
       <w:tr>
         <w:tc>
           <w:tcPr>
-            <w:tcW w:type="dxa" w:w="946"/>
+            <w:tcW w:type="dxa" w:w="902"/>
             <w:tcMar>
               <w:top w:type="dxa" w:w="70"/>
               <w:left w:type="dxa" w:w="110"/>
@@ -4616,7 +4655,7 @@
         </w:tc>
         <w:tc>
           <w:tcPr>
-            <w:tcW w:type="dxa" w:w="6620"/>
+            <w:tcW w:type="dxa" w:w="6315"/>
             <w:tcMar>
               <w:top w:type="dxa" w:w="70"/>
               <w:left w:type="dxa" w:w="110"/>
@@ -4644,7 +4683,7 @@
         </w:tc>
         <w:tc>
           <w:tcPr>
-            <w:tcW w:type="dxa" w:w="1134"/>
+            <w:tcW w:type="dxa" w:w="1083"/>
             <w:tcMar>
               <w:top w:type="dxa" w:w="70"/>
               <w:left w:type="dxa" w:w="110"/>
@@ -4674,7 +4713,7 @@
       <w:tr>
         <w:tc>
           <w:tcPr>
-            <w:tcW w:type="dxa" w:w="946"/>
+            <w:tcW w:type="dxa" w:w="902"/>
             <w:tcMar>
               <w:top w:type="dxa" w:w="70"/>
               <w:left w:type="dxa" w:w="110"/>
@@ -4702,7 +4741,7 @@
         </w:tc>
         <w:tc>
           <w:tcPr>
-            <w:tcW w:type="dxa" w:w="6620"/>
+            <w:tcW w:type="dxa" w:w="6315"/>
             <w:tcMar>
               <w:top w:type="dxa" w:w="70"/>
               <w:left w:type="dxa" w:w="110"/>
@@ -4730,7 +4769,7 @@
         </w:tc>
         <w:tc>
           <w:tcPr>
-            <w:tcW w:type="dxa" w:w="1134"/>
+            <w:tcW w:type="dxa" w:w="1083"/>
             <w:tcMar>
               <w:top w:type="dxa" w:w="70"/>
               <w:left w:type="dxa" w:w="110"/>
@@ -4760,7 +4799,7 @@
       <w:tr>
         <w:tc>
           <w:tcPr>
-            <w:tcW w:type="dxa" w:w="946"/>
+            <w:tcW w:type="dxa" w:w="902"/>
             <w:tcMar>
               <w:top w:type="dxa" w:w="70"/>
               <w:left w:type="dxa" w:w="110"/>
@@ -4788,7 +4827,7 @@
         </w:tc>
         <w:tc>
           <w:tcPr>
-            <w:tcW w:type="dxa" w:w="6620"/>
+            <w:tcW w:type="dxa" w:w="6315"/>
             <w:tcMar>
               <w:top w:type="dxa" w:w="70"/>
               <w:left w:type="dxa" w:w="110"/>
@@ -4816,7 +4855,7 @@
         </w:tc>
         <w:tc>
           <w:tcPr>
-            <w:tcW w:type="dxa" w:w="1134"/>
+            <w:tcW w:type="dxa" w:w="1083"/>
             <w:tcMar>
               <w:top w:type="dxa" w:w="70"/>
               <w:left w:type="dxa" w:w="110"/>
@@ -4846,7 +4885,7 @@
       <w:tr>
         <w:tc>
           <w:tcPr>
-            <w:tcW w:type="dxa" w:w="946"/>
+            <w:tcW w:type="dxa" w:w="902"/>
             <w:tcMar>
               <w:top w:type="dxa" w:w="70"/>
               <w:left w:type="dxa" w:w="110"/>
@@ -4874,7 +4913,7 @@
         </w:tc>
         <w:tc>
           <w:tcPr>
-            <w:tcW w:type="dxa" w:w="6620"/>
+            <w:tcW w:type="dxa" w:w="6315"/>
             <w:tcMar>
               <w:top w:type="dxa" w:w="70"/>
               <w:left w:type="dxa" w:w="110"/>
@@ -4902,7 +4941,7 @@
         </w:tc>
         <w:tc>
           <w:tcPr>
-            <w:tcW w:type="dxa" w:w="1134"/>
+            <w:tcW w:type="dxa" w:w="1083"/>
             <w:tcMar>
               <w:top w:type="dxa" w:w="70"/>
               <w:left w:type="dxa" w:w="110"/>
@@ -4932,7 +4971,7 @@
       <w:tr>
         <w:tc>
           <w:tcPr>
-            <w:tcW w:type="dxa" w:w="946"/>
+            <w:tcW w:type="dxa" w:w="902"/>
             <w:tcMar>
               <w:top w:type="dxa" w:w="70"/>
               <w:left w:type="dxa" w:w="110"/>
@@ -4960,7 +4999,7 @@
         </w:tc>
         <w:tc>
           <w:tcPr>
-            <w:tcW w:type="dxa" w:w="6620"/>
+            <w:tcW w:type="dxa" w:w="6315"/>
             <w:tcMar>
               <w:top w:type="dxa" w:w="70"/>
               <w:left w:type="dxa" w:w="110"/>
@@ -4988,7 +5027,7 @@
         </w:tc>
         <w:tc>
           <w:tcPr>
-            <w:tcW w:type="dxa" w:w="1134"/>
+            <w:tcW w:type="dxa" w:w="1083"/>
             <w:tcMar>
               <w:top w:type="dxa" w:w="70"/>
               <w:left w:type="dxa" w:w="110"/>
@@ -5018,7 +5057,7 @@
       <w:tr>
         <w:tc>
           <w:tcPr>
-            <w:tcW w:type="dxa" w:w="946"/>
+            <w:tcW w:type="dxa" w:w="902"/>
             <w:tcMar>
               <w:top w:type="dxa" w:w="70"/>
               <w:left w:type="dxa" w:w="110"/>
@@ -5046,7 +5085,7 @@
         </w:tc>
         <w:tc>
           <w:tcPr>
-            <w:tcW w:type="dxa" w:w="6620"/>
+            <w:tcW w:type="dxa" w:w="6315"/>
             <w:tcMar>
               <w:top w:type="dxa" w:w="70"/>
               <w:left w:type="dxa" w:w="110"/>
@@ -5074,7 +5113,7 @@
         </w:tc>
         <w:tc>
           <w:tcPr>
-            <w:tcW w:type="dxa" w:w="1134"/>
+            <w:tcW w:type="dxa" w:w="1083"/>
             <w:tcMar>
               <w:top w:type="dxa" w:w="70"/>
               <w:left w:type="dxa" w:w="110"/>
@@ -5104,7 +5143,7 @@
       <w:tr>
         <w:tc>
           <w:tcPr>
-            <w:tcW w:type="dxa" w:w="946"/>
+            <w:tcW w:type="dxa" w:w="902"/>
             <w:tcMar>
               <w:top w:type="dxa" w:w="70"/>
               <w:left w:type="dxa" w:w="110"/>
@@ -5132,7 +5171,7 @@
         </w:tc>
         <w:tc>
           <w:tcPr>
-            <w:tcW w:type="dxa" w:w="6620"/>
+            <w:tcW w:type="dxa" w:w="6315"/>
             <w:tcMar>
               <w:top w:type="dxa" w:w="70"/>
               <w:left w:type="dxa" w:w="110"/>
@@ -5160,7 +5199,7 @@
         </w:tc>
         <w:tc>
           <w:tcPr>
-            <w:tcW w:type="dxa" w:w="1134"/>
+            <w:tcW w:type="dxa" w:w="1083"/>
             <w:tcMar>
               <w:top w:type="dxa" w:w="70"/>
               <w:left w:type="dxa" w:w="110"/>
@@ -5239,7 +5278,7 @@
     </w:p>
     <w:tbl>
       <w:tblPr>
-        <w:tblW w:type="dxa" w:w="8700"/>
+        <w:tblW w:type="dxa" w:w="8300"/>
         <w:tblBorders>
           <w:top w:val="single" w:color="auto" w:sz="4"/>
           <w:left w:val="single" w:color="auto" w:sz="4"/>
@@ -5250,9 +5289,9 @@
         </w:tblBorders>
       </w:tblPr>
       <w:tblGrid>
-        <w:gridCol w:w="1135"/>
-        <w:gridCol w:w="1891"/>
-        <w:gridCol w:w="5674"/>
+        <w:gridCol w:w="1083"/>
+        <w:gridCol w:w="1804"/>
+        <w:gridCol w:w="5413"/>
       </w:tblGrid>
       <w:tr>
         <w:trPr>
@@ -5260,7 +5299,7 @@
         </w:trPr>
         <w:tc>
           <w:tcPr>
-            <w:tcW w:type="dxa" w:w="1135"/>
+            <w:tcW w:type="dxa" w:w="1083"/>
             <w:shd w:fill="D9D9D9" w:val="clear"/>
             <w:tcMar>
               <w:top w:type="dxa" w:w="70"/>
@@ -5289,7 +5328,7 @@
         </w:tc>
         <w:tc>
           <w:tcPr>
-            <w:tcW w:type="dxa" w:w="1891"/>
+            <w:tcW w:type="dxa" w:w="1804"/>
             <w:shd w:fill="D9D9D9" w:val="clear"/>
             <w:tcMar>
               <w:top w:type="dxa" w:w="70"/>
@@ -5318,7 +5357,7 @@
         </w:tc>
         <w:tc>
           <w:tcPr>
-            <w:tcW w:type="dxa" w:w="5674"/>
+            <w:tcW w:type="dxa" w:w="5413"/>
             <w:shd w:fill="D9D9D9" w:val="clear"/>
             <w:tcMar>
               <w:top w:type="dxa" w:w="70"/>
@@ -5349,7 +5388,7 @@
       <w:tr>
         <w:tc>
           <w:tcPr>
-            <w:tcW w:type="dxa" w:w="1135"/>
+            <w:tcW w:type="dxa" w:w="1083"/>
             <w:tcMar>
               <w:top w:type="dxa" w:w="70"/>
               <w:left w:type="dxa" w:w="110"/>
@@ -5377,7 +5416,7 @@
         </w:tc>
         <w:tc>
           <w:tcPr>
-            <w:tcW w:type="dxa" w:w="1891"/>
+            <w:tcW w:type="dxa" w:w="1804"/>
             <w:tcMar>
               <w:top w:type="dxa" w:w="70"/>
               <w:left w:type="dxa" w:w="110"/>
@@ -5405,7 +5444,7 @@
         </w:tc>
         <w:tc>
           <w:tcPr>
-            <w:tcW w:type="dxa" w:w="5674"/>
+            <w:tcW w:type="dxa" w:w="5413"/>
             <w:tcMar>
               <w:top w:type="dxa" w:w="70"/>
               <w:left w:type="dxa" w:w="110"/>
@@ -5435,7 +5474,7 @@
       <w:tr>
         <w:tc>
           <w:tcPr>
-            <w:tcW w:type="dxa" w:w="1135"/>
+            <w:tcW w:type="dxa" w:w="1083"/>
             <w:tcMar>
               <w:top w:type="dxa" w:w="70"/>
               <w:left w:type="dxa" w:w="110"/>
@@ -5463,7 +5502,7 @@
         </w:tc>
         <w:tc>
           <w:tcPr>
-            <w:tcW w:type="dxa" w:w="1891"/>
+            <w:tcW w:type="dxa" w:w="1804"/>
             <w:tcMar>
               <w:top w:type="dxa" w:w="70"/>
               <w:left w:type="dxa" w:w="110"/>
@@ -5491,7 +5530,7 @@
         </w:tc>
         <w:tc>
           <w:tcPr>
-            <w:tcW w:type="dxa" w:w="5674"/>
+            <w:tcW w:type="dxa" w:w="5413"/>
             <w:tcMar>
               <w:top w:type="dxa" w:w="70"/>
               <w:left w:type="dxa" w:w="110"/>
@@ -5521,7 +5560,7 @@
       <w:tr>
         <w:tc>
           <w:tcPr>
-            <w:tcW w:type="dxa" w:w="1135"/>
+            <w:tcW w:type="dxa" w:w="1083"/>
             <w:tcMar>
               <w:top w:type="dxa" w:w="70"/>
               <w:left w:type="dxa" w:w="110"/>
@@ -5549,7 +5588,7 @@
         </w:tc>
         <w:tc>
           <w:tcPr>
-            <w:tcW w:type="dxa" w:w="1891"/>
+            <w:tcW w:type="dxa" w:w="1804"/>
             <w:tcMar>
               <w:top w:type="dxa" w:w="70"/>
               <w:left w:type="dxa" w:w="110"/>
@@ -5577,7 +5616,7 @@
         </w:tc>
         <w:tc>
           <w:tcPr>
-            <w:tcW w:type="dxa" w:w="5674"/>
+            <w:tcW w:type="dxa" w:w="5413"/>
             <w:tcMar>
               <w:top w:type="dxa" w:w="70"/>
               <w:left w:type="dxa" w:w="110"/>
@@ -5607,7 +5646,7 @@
       <w:tr>
         <w:tc>
           <w:tcPr>
-            <w:tcW w:type="dxa" w:w="1135"/>
+            <w:tcW w:type="dxa" w:w="1083"/>
             <w:tcMar>
               <w:top w:type="dxa" w:w="70"/>
               <w:left w:type="dxa" w:w="110"/>
@@ -5635,7 +5674,7 @@
         </w:tc>
         <w:tc>
           <w:tcPr>
-            <w:tcW w:type="dxa" w:w="1891"/>
+            <w:tcW w:type="dxa" w:w="1804"/>
             <w:tcMar>
               <w:top w:type="dxa" w:w="70"/>
               <w:left w:type="dxa" w:w="110"/>
@@ -5663,7 +5702,7 @@
         </w:tc>
         <w:tc>
           <w:tcPr>
-            <w:tcW w:type="dxa" w:w="5674"/>
+            <w:tcW w:type="dxa" w:w="5413"/>
             <w:tcMar>
               <w:top w:type="dxa" w:w="70"/>
               <w:left w:type="dxa" w:w="110"/>
@@ -5693,7 +5732,7 @@
       <w:tr>
         <w:tc>
           <w:tcPr>
-            <w:tcW w:type="dxa" w:w="1135"/>
+            <w:tcW w:type="dxa" w:w="1083"/>
             <w:tcMar>
               <w:top w:type="dxa" w:w="70"/>
               <w:left w:type="dxa" w:w="110"/>
@@ -5721,7 +5760,7 @@
         </w:tc>
         <w:tc>
           <w:tcPr>
-            <w:tcW w:type="dxa" w:w="1891"/>
+            <w:tcW w:type="dxa" w:w="1804"/>
             <w:tcMar>
               <w:top w:type="dxa" w:w="70"/>
               <w:left w:type="dxa" w:w="110"/>
@@ -5749,7 +5788,7 @@
         </w:tc>
         <w:tc>
           <w:tcPr>
-            <w:tcW w:type="dxa" w:w="5674"/>
+            <w:tcW w:type="dxa" w:w="5413"/>
             <w:tcMar>
               <w:top w:type="dxa" w:w="70"/>
               <w:left w:type="dxa" w:w="110"/>
@@ -5779,7 +5818,7 @@
       <w:tr>
         <w:tc>
           <w:tcPr>
-            <w:tcW w:type="dxa" w:w="1135"/>
+            <w:tcW w:type="dxa" w:w="1083"/>
             <w:tcMar>
               <w:top w:type="dxa" w:w="70"/>
               <w:left w:type="dxa" w:w="110"/>
@@ -5807,7 +5846,7 @@
         </w:tc>
         <w:tc>
           <w:tcPr>
-            <w:tcW w:type="dxa" w:w="1891"/>
+            <w:tcW w:type="dxa" w:w="1804"/>
             <w:tcMar>
               <w:top w:type="dxa" w:w="70"/>
               <w:left w:type="dxa" w:w="110"/>
@@ -5835,7 +5874,7 @@
         </w:tc>
         <w:tc>
           <w:tcPr>
-            <w:tcW w:type="dxa" w:w="5674"/>
+            <w:tcW w:type="dxa" w:w="5413"/>
             <w:tcMar>
               <w:top w:type="dxa" w:w="70"/>
               <w:left w:type="dxa" w:w="110"/>
@@ -5865,7 +5904,7 @@
       <w:tr>
         <w:tc>
           <w:tcPr>
-            <w:tcW w:type="dxa" w:w="1135"/>
+            <w:tcW w:type="dxa" w:w="1083"/>
             <w:tcMar>
               <w:top w:type="dxa" w:w="70"/>
               <w:left w:type="dxa" w:w="110"/>
@@ -5893,7 +5932,7 @@
         </w:tc>
         <w:tc>
           <w:tcPr>
-            <w:tcW w:type="dxa" w:w="1891"/>
+            <w:tcW w:type="dxa" w:w="1804"/>
             <w:tcMar>
               <w:top w:type="dxa" w:w="70"/>
               <w:left w:type="dxa" w:w="110"/>
@@ -5921,7 +5960,7 @@
         </w:tc>
         <w:tc>
           <w:tcPr>
-            <w:tcW w:type="dxa" w:w="5674"/>
+            <w:tcW w:type="dxa" w:w="5413"/>
             <w:tcMar>
               <w:top w:type="dxa" w:w="70"/>
               <w:left w:type="dxa" w:w="110"/>
@@ -5951,7 +5990,7 @@
       <w:tr>
         <w:tc>
           <w:tcPr>
-            <w:tcW w:type="dxa" w:w="1135"/>
+            <w:tcW w:type="dxa" w:w="1083"/>
             <w:tcMar>
               <w:top w:type="dxa" w:w="70"/>
               <w:left w:type="dxa" w:w="110"/>
@@ -5979,7 +6018,7 @@
         </w:tc>
         <w:tc>
           <w:tcPr>
-            <w:tcW w:type="dxa" w:w="1891"/>
+            <w:tcW w:type="dxa" w:w="1804"/>
             <w:tcMar>
               <w:top w:type="dxa" w:w="70"/>
               <w:left w:type="dxa" w:w="110"/>
@@ -6007,7 +6046,7 @@
         </w:tc>
         <w:tc>
           <w:tcPr>
-            <w:tcW w:type="dxa" w:w="5674"/>
+            <w:tcW w:type="dxa" w:w="5413"/>
             <w:tcMar>
               <w:top w:type="dxa" w:w="70"/>
               <w:left w:type="dxa" w:w="110"/>
@@ -6037,7 +6076,7 @@
       <w:tr>
         <w:tc>
           <w:tcPr>
-            <w:tcW w:type="dxa" w:w="1135"/>
+            <w:tcW w:type="dxa" w:w="1083"/>
             <w:tcMar>
               <w:top w:type="dxa" w:w="70"/>
               <w:left w:type="dxa" w:w="110"/>
@@ -6065,7 +6104,7 @@
         </w:tc>
         <w:tc>
           <w:tcPr>
-            <w:tcW w:type="dxa" w:w="1891"/>
+            <w:tcW w:type="dxa" w:w="1804"/>
             <w:tcMar>
               <w:top w:type="dxa" w:w="70"/>
               <w:left w:type="dxa" w:w="110"/>
@@ -6093,7 +6132,7 @@
         </w:tc>
         <w:tc>
           <w:tcPr>
-            <w:tcW w:type="dxa" w:w="5674"/>
+            <w:tcW w:type="dxa" w:w="5413"/>
             <w:tcMar>
               <w:top w:type="dxa" w:w="70"/>
               <w:left w:type="dxa" w:w="110"/>
@@ -6123,7 +6162,7 @@
       <w:tr>
         <w:tc>
           <w:tcPr>
-            <w:tcW w:type="dxa" w:w="1135"/>
+            <w:tcW w:type="dxa" w:w="1083"/>
             <w:tcMar>
               <w:top w:type="dxa" w:w="70"/>
               <w:left w:type="dxa" w:w="110"/>
@@ -6151,7 +6190,7 @@
         </w:tc>
         <w:tc>
           <w:tcPr>
-            <w:tcW w:type="dxa" w:w="1891"/>
+            <w:tcW w:type="dxa" w:w="1804"/>
             <w:tcMar>
               <w:top w:type="dxa" w:w="70"/>
               <w:left w:type="dxa" w:w="110"/>
@@ -6179,7 +6218,7 @@
         </w:tc>
         <w:tc>
           <w:tcPr>
-            <w:tcW w:type="dxa" w:w="5674"/>
+            <w:tcW w:type="dxa" w:w="5413"/>
             <w:tcMar>
               <w:top w:type="dxa" w:w="70"/>
               <w:left w:type="dxa" w:w="110"/>
@@ -6519,7 +6558,7 @@
     </w:p>
     <w:tbl>
       <w:tblPr>
-        <w:tblW w:type="dxa" w:w="8700"/>
+        <w:tblW w:type="dxa" w:w="8300"/>
         <w:tblBorders>
           <w:top w:val="single" w:color="auto" w:sz="4"/>
           <w:left w:val="single" w:color="auto" w:sz="4"/>
@@ -6530,9 +6569,9 @@
         </w:tblBorders>
       </w:tblPr>
       <w:tblGrid>
-        <w:gridCol w:w="2036"/>
-        <w:gridCol w:w="5553"/>
-        <w:gridCol w:w="1111"/>
+        <w:gridCol w:w="1943"/>
+        <w:gridCol w:w="5298"/>
+        <w:gridCol w:w="1059"/>
       </w:tblGrid>
       <w:tr>
         <w:trPr>
@@ -6540,7 +6579,7 @@
         </w:trPr>
         <w:tc>
           <w:tcPr>
-            <w:tcW w:type="dxa" w:w="2036"/>
+            <w:tcW w:type="dxa" w:w="1943"/>
             <w:shd w:fill="D9D9D9" w:val="clear"/>
             <w:tcMar>
               <w:top w:type="dxa" w:w="70"/>
@@ -6569,7 +6608,7 @@
         </w:tc>
         <w:tc>
           <w:tcPr>
-            <w:tcW w:type="dxa" w:w="5553"/>
+            <w:tcW w:type="dxa" w:w="5298"/>
             <w:shd w:fill="D9D9D9" w:val="clear"/>
             <w:tcMar>
               <w:top w:type="dxa" w:w="70"/>
@@ -6598,7 +6637,7 @@
         </w:tc>
         <w:tc>
           <w:tcPr>
-            <w:tcW w:type="dxa" w:w="1111"/>
+            <w:tcW w:type="dxa" w:w="1059"/>
             <w:shd w:fill="D9D9D9" w:val="clear"/>
             <w:tcMar>
               <w:top w:type="dxa" w:w="70"/>
@@ -6629,7 +6668,7 @@
       <w:tr>
         <w:tc>
           <w:tcPr>
-            <w:tcW w:type="dxa" w:w="2036"/>
+            <w:tcW w:type="dxa" w:w="1943"/>
             <w:tcMar>
               <w:top w:type="dxa" w:w="70"/>
               <w:left w:type="dxa" w:w="110"/>
@@ -6657,7 +6696,7 @@
         </w:tc>
         <w:tc>
           <w:tcPr>
-            <w:tcW w:type="dxa" w:w="5553"/>
+            <w:tcW w:type="dxa" w:w="5298"/>
             <w:tcMar>
               <w:top w:type="dxa" w:w="70"/>
               <w:left w:type="dxa" w:w="110"/>
@@ -6685,7 +6724,7 @@
         </w:tc>
         <w:tc>
           <w:tcPr>
-            <w:tcW w:type="dxa" w:w="1111"/>
+            <w:tcW w:type="dxa" w:w="1059"/>
             <w:tcMar>
               <w:top w:type="dxa" w:w="70"/>
               <w:left w:type="dxa" w:w="110"/>
@@ -6715,7 +6754,7 @@
       <w:tr>
         <w:tc>
           <w:tcPr>
-            <w:tcW w:type="dxa" w:w="2036"/>
+            <w:tcW w:type="dxa" w:w="1943"/>
             <w:tcMar>
               <w:top w:type="dxa" w:w="70"/>
               <w:left w:type="dxa" w:w="110"/>
@@ -6743,7 +6782,7 @@
         </w:tc>
         <w:tc>
           <w:tcPr>
-            <w:tcW w:type="dxa" w:w="5553"/>
+            <w:tcW w:type="dxa" w:w="5298"/>
             <w:tcMar>
               <w:top w:type="dxa" w:w="70"/>
               <w:left w:type="dxa" w:w="110"/>
@@ -6771,7 +6810,7 @@
         </w:tc>
         <w:tc>
           <w:tcPr>
-            <w:tcW w:type="dxa" w:w="1111"/>
+            <w:tcW w:type="dxa" w:w="1059"/>
             <w:tcMar>
               <w:top w:type="dxa" w:w="70"/>
               <w:left w:type="dxa" w:w="110"/>
@@ -6801,7 +6840,7 @@
       <w:tr>
         <w:tc>
           <w:tcPr>
-            <w:tcW w:type="dxa" w:w="2036"/>
+            <w:tcW w:type="dxa" w:w="1943"/>
             <w:tcMar>
               <w:top w:type="dxa" w:w="70"/>
               <w:left w:type="dxa" w:w="110"/>
@@ -6829,7 +6868,7 @@
         </w:tc>
         <w:tc>
           <w:tcPr>
-            <w:tcW w:type="dxa" w:w="5553"/>
+            <w:tcW w:type="dxa" w:w="5298"/>
             <w:tcMar>
               <w:top w:type="dxa" w:w="70"/>
               <w:left w:type="dxa" w:w="110"/>
@@ -6857,7 +6896,7 @@
         </w:tc>
         <w:tc>
           <w:tcPr>
-            <w:tcW w:type="dxa" w:w="1111"/>
+            <w:tcW w:type="dxa" w:w="1059"/>
             <w:tcMar>
               <w:top w:type="dxa" w:w="70"/>
               <w:left w:type="dxa" w:w="110"/>
@@ -6887,7 +6926,7 @@
       <w:tr>
         <w:tc>
           <w:tcPr>
-            <w:tcW w:type="dxa" w:w="2036"/>
+            <w:tcW w:type="dxa" w:w="1943"/>
             <w:tcMar>
               <w:top w:type="dxa" w:w="70"/>
               <w:left w:type="dxa" w:w="110"/>
@@ -6915,7 +6954,7 @@
         </w:tc>
         <w:tc>
           <w:tcPr>
-            <w:tcW w:type="dxa" w:w="5553"/>
+            <w:tcW w:type="dxa" w:w="5298"/>
             <w:tcMar>
               <w:top w:type="dxa" w:w="70"/>
               <w:left w:type="dxa" w:w="110"/>
@@ -6943,7 +6982,7 @@
         </w:tc>
         <w:tc>
           <w:tcPr>
-            <w:tcW w:type="dxa" w:w="1111"/>
+            <w:tcW w:type="dxa" w:w="1059"/>
             <w:tcMar>
               <w:top w:type="dxa" w:w="70"/>
               <w:left w:type="dxa" w:w="110"/>
@@ -6973,7 +7012,7 @@
       <w:tr>
         <w:tc>
           <w:tcPr>
-            <w:tcW w:type="dxa" w:w="2036"/>
+            <w:tcW w:type="dxa" w:w="1943"/>
             <w:tcMar>
               <w:top w:type="dxa" w:w="70"/>
               <w:left w:type="dxa" w:w="110"/>
@@ -7001,7 +7040,7 @@
         </w:tc>
         <w:tc>
           <w:tcPr>
-            <w:tcW w:type="dxa" w:w="5553"/>
+            <w:tcW w:type="dxa" w:w="5298"/>
             <w:tcMar>
               <w:top w:type="dxa" w:w="70"/>
               <w:left w:type="dxa" w:w="110"/>
@@ -7029,7 +7068,7 @@
         </w:tc>
         <w:tc>
           <w:tcPr>
-            <w:tcW w:type="dxa" w:w="1111"/>
+            <w:tcW w:type="dxa" w:w="1059"/>
             <w:tcMar>
               <w:top w:type="dxa" w:w="70"/>
               <w:left w:type="dxa" w:w="110"/>
@@ -7059,7 +7098,7 @@
       <w:tr>
         <w:tc>
           <w:tcPr>
-            <w:tcW w:type="dxa" w:w="2036"/>
+            <w:tcW w:type="dxa" w:w="1943"/>
             <w:tcMar>
               <w:top w:type="dxa" w:w="70"/>
               <w:left w:type="dxa" w:w="110"/>
@@ -7087,7 +7126,7 @@
         </w:tc>
         <w:tc>
           <w:tcPr>
-            <w:tcW w:type="dxa" w:w="5553"/>
+            <w:tcW w:type="dxa" w:w="5298"/>
             <w:tcMar>
               <w:top w:type="dxa" w:w="70"/>
               <w:left w:type="dxa" w:w="110"/>
@@ -7115,7 +7154,7 @@
         </w:tc>
         <w:tc>
           <w:tcPr>
-            <w:tcW w:type="dxa" w:w="1111"/>
+            <w:tcW w:type="dxa" w:w="1059"/>
             <w:tcMar>
               <w:top w:type="dxa" w:w="70"/>
               <w:left w:type="dxa" w:w="110"/>
@@ -7145,7 +7184,7 @@
       <w:tr>
         <w:tc>
           <w:tcPr>
-            <w:tcW w:type="dxa" w:w="2036"/>
+            <w:tcW w:type="dxa" w:w="1943"/>
             <w:tcMar>
               <w:top w:type="dxa" w:w="70"/>
               <w:left w:type="dxa" w:w="110"/>
@@ -7173,7 +7212,7 @@
         </w:tc>
         <w:tc>
           <w:tcPr>
-            <w:tcW w:type="dxa" w:w="5553"/>
+            <w:tcW w:type="dxa" w:w="5298"/>
             <w:tcMar>
               <w:top w:type="dxa" w:w="70"/>
               <w:left w:type="dxa" w:w="110"/>
@@ -7201,7 +7240,7 @@
         </w:tc>
         <w:tc>
           <w:tcPr>
-            <w:tcW w:type="dxa" w:w="1111"/>
+            <w:tcW w:type="dxa" w:w="1059"/>
             <w:tcMar>
               <w:top w:type="dxa" w:w="70"/>
               <w:left w:type="dxa" w:w="110"/>
@@ -7231,7 +7270,7 @@
       <w:tr>
         <w:tc>
           <w:tcPr>
-            <w:tcW w:type="dxa" w:w="2036"/>
+            <w:tcW w:type="dxa" w:w="1943"/>
             <w:tcMar>
               <w:top w:type="dxa" w:w="70"/>
               <w:left w:type="dxa" w:w="110"/>
@@ -7259,7 +7298,7 @@
         </w:tc>
         <w:tc>
           <w:tcPr>
-            <w:tcW w:type="dxa" w:w="5553"/>
+            <w:tcW w:type="dxa" w:w="5298"/>
             <w:tcMar>
               <w:top w:type="dxa" w:w="70"/>
               <w:left w:type="dxa" w:w="110"/>
@@ -7287,7 +7326,7 @@
         </w:tc>
         <w:tc>
           <w:tcPr>
-            <w:tcW w:type="dxa" w:w="1111"/>
+            <w:tcW w:type="dxa" w:w="1059"/>
             <w:tcMar>
               <w:top w:type="dxa" w:w="70"/>
               <w:left w:type="dxa" w:w="110"/>
@@ -7317,7 +7356,7 @@
       <w:tr>
         <w:tc>
           <w:tcPr>
-            <w:tcW w:type="dxa" w:w="2036"/>
+            <w:tcW w:type="dxa" w:w="1943"/>
             <w:tcMar>
               <w:top w:type="dxa" w:w="70"/>
               <w:left w:type="dxa" w:w="110"/>
@@ -7345,7 +7384,7 @@
         </w:tc>
         <w:tc>
           <w:tcPr>
-            <w:tcW w:type="dxa" w:w="5553"/>
+            <w:tcW w:type="dxa" w:w="5298"/>
             <w:tcMar>
               <w:top w:type="dxa" w:w="70"/>
               <w:left w:type="dxa" w:w="110"/>
@@ -7373,7 +7412,7 @@
         </w:tc>
         <w:tc>
           <w:tcPr>
-            <w:tcW w:type="dxa" w:w="1111"/>
+            <w:tcW w:type="dxa" w:w="1059"/>
             <w:tcMar>
               <w:top w:type="dxa" w:w="70"/>
               <w:left w:type="dxa" w:w="110"/>
@@ -7403,7 +7442,7 @@
       <w:tr>
         <w:tc>
           <w:tcPr>
-            <w:tcW w:type="dxa" w:w="2036"/>
+            <w:tcW w:type="dxa" w:w="1943"/>
             <w:tcMar>
               <w:top w:type="dxa" w:w="70"/>
               <w:left w:type="dxa" w:w="110"/>
@@ -7431,7 +7470,7 @@
         </w:tc>
         <w:tc>
           <w:tcPr>
-            <w:tcW w:type="dxa" w:w="5553"/>
+            <w:tcW w:type="dxa" w:w="5298"/>
             <w:tcMar>
               <w:top w:type="dxa" w:w="70"/>
               <w:left w:type="dxa" w:w="110"/>
@@ -7459,7 +7498,7 @@
         </w:tc>
         <w:tc>
           <w:tcPr>
-            <w:tcW w:type="dxa" w:w="1111"/>
+            <w:tcW w:type="dxa" w:w="1059"/>
             <w:tcMar>
               <w:top w:type="dxa" w:w="70"/>
               <w:left w:type="dxa" w:w="110"/>
@@ -7489,7 +7528,7 @@
       <w:tr>
         <w:tc>
           <w:tcPr>
-            <w:tcW w:type="dxa" w:w="2036"/>
+            <w:tcW w:type="dxa" w:w="1943"/>
             <w:tcMar>
               <w:top w:type="dxa" w:w="70"/>
               <w:left w:type="dxa" w:w="110"/>
@@ -7517,7 +7556,7 @@
         </w:tc>
         <w:tc>
           <w:tcPr>
-            <w:tcW w:type="dxa" w:w="5553"/>
+            <w:tcW w:type="dxa" w:w="5298"/>
             <w:tcMar>
               <w:top w:type="dxa" w:w="70"/>
               <w:left w:type="dxa" w:w="110"/>
@@ -7545,7 +7584,7 @@
         </w:tc>
         <w:tc>
           <w:tcPr>
-            <w:tcW w:type="dxa" w:w="1111"/>
+            <w:tcW w:type="dxa" w:w="1059"/>
             <w:tcMar>
               <w:top w:type="dxa" w:w="70"/>
               <w:left w:type="dxa" w:w="110"/>
@@ -7575,7 +7614,7 @@
       <w:tr>
         <w:tc>
           <w:tcPr>
-            <w:tcW w:type="dxa" w:w="2036"/>
+            <w:tcW w:type="dxa" w:w="1943"/>
             <w:tcMar>
               <w:top w:type="dxa" w:w="70"/>
               <w:left w:type="dxa" w:w="110"/>
@@ -7603,7 +7642,7 @@
         </w:tc>
         <w:tc>
           <w:tcPr>
-            <w:tcW w:type="dxa" w:w="5553"/>
+            <w:tcW w:type="dxa" w:w="5298"/>
             <w:tcMar>
               <w:top w:type="dxa" w:w="70"/>
               <w:left w:type="dxa" w:w="110"/>
@@ -7631,7 +7670,7 @@
         </w:tc>
         <w:tc>
           <w:tcPr>
-            <w:tcW w:type="dxa" w:w="1111"/>
+            <w:tcW w:type="dxa" w:w="1059"/>
             <w:tcMar>
               <w:top w:type="dxa" w:w="70"/>
               <w:left w:type="dxa" w:w="110"/>
@@ -7661,7 +7700,7 @@
       <w:tr>
         <w:tc>
           <w:tcPr>
-            <w:tcW w:type="dxa" w:w="2036"/>
+            <w:tcW w:type="dxa" w:w="1943"/>
             <w:tcMar>
               <w:top w:type="dxa" w:w="70"/>
               <w:left w:type="dxa" w:w="110"/>
@@ -7689,7 +7728,7 @@
         </w:tc>
         <w:tc>
           <w:tcPr>
-            <w:tcW w:type="dxa" w:w="5553"/>
+            <w:tcW w:type="dxa" w:w="5298"/>
             <w:tcMar>
               <w:top w:type="dxa" w:w="70"/>
               <w:left w:type="dxa" w:w="110"/>
@@ -7717,7 +7756,7 @@
         </w:tc>
         <w:tc>
           <w:tcPr>
-            <w:tcW w:type="dxa" w:w="1111"/>
+            <w:tcW w:type="dxa" w:w="1059"/>
             <w:tcMar>
               <w:top w:type="dxa" w:w="70"/>
               <w:left w:type="dxa" w:w="110"/>
@@ -7747,7 +7786,7 @@
       <w:tr>
         <w:tc>
           <w:tcPr>
-            <w:tcW w:type="dxa" w:w="2036"/>
+            <w:tcW w:type="dxa" w:w="1943"/>
             <w:tcMar>
               <w:top w:type="dxa" w:w="70"/>
               <w:left w:type="dxa" w:w="110"/>
@@ -7775,7 +7814,7 @@
         </w:tc>
         <w:tc>
           <w:tcPr>
-            <w:tcW w:type="dxa" w:w="5553"/>
+            <w:tcW w:type="dxa" w:w="5298"/>
             <w:tcMar>
               <w:top w:type="dxa" w:w="70"/>
               <w:left w:type="dxa" w:w="110"/>
@@ -7803,7 +7842,7 @@
         </w:tc>
         <w:tc>
           <w:tcPr>
-            <w:tcW w:type="dxa" w:w="1111"/>
+            <w:tcW w:type="dxa" w:w="1059"/>
             <w:tcMar>
               <w:top w:type="dxa" w:w="70"/>
               <w:left w:type="dxa" w:w="110"/>
@@ -7833,7 +7872,7 @@
       <w:tr>
         <w:tc>
           <w:tcPr>
-            <w:tcW w:type="dxa" w:w="2036"/>
+            <w:tcW w:type="dxa" w:w="1943"/>
             <w:tcMar>
               <w:top w:type="dxa" w:w="70"/>
               <w:left w:type="dxa" w:w="110"/>
@@ -7861,7 +7900,7 @@
         </w:tc>
         <w:tc>
           <w:tcPr>
-            <w:tcW w:type="dxa" w:w="5553"/>
+            <w:tcW w:type="dxa" w:w="5298"/>
             <w:tcMar>
               <w:top w:type="dxa" w:w="70"/>
               <w:left w:type="dxa" w:w="110"/>
@@ -7889,7 +7928,7 @@
         </w:tc>
         <w:tc>
           <w:tcPr>
-            <w:tcW w:type="dxa" w:w="1111"/>
+            <w:tcW w:type="dxa" w:w="1059"/>
             <w:tcMar>
               <w:top w:type="dxa" w:w="70"/>
               <w:left w:type="dxa" w:w="110"/>
@@ -7983,7 +8022,7 @@
     </w:p>
     <w:tbl>
       <w:tblPr>
-        <w:tblW w:type="dxa" w:w="8700"/>
+        <w:tblW w:type="dxa" w:w="8300"/>
         <w:tblBorders>
           <w:top w:val="single" w:color="auto" w:sz="4"/>
           <w:left w:val="single" w:color="auto" w:sz="4"/>
@@ -7994,10 +8033,10 @@
         </w:tblBorders>
       </w:tblPr>
       <w:tblGrid>
-        <w:gridCol w:w="1111"/>
-        <w:gridCol w:w="5090"/>
-        <w:gridCol w:w="1296"/>
-        <w:gridCol w:w="1203"/>
+        <w:gridCol w:w="1003"/>
+        <w:gridCol w:w="4743"/>
+        <w:gridCol w:w="1186"/>
+        <w:gridCol w:w="1368"/>
       </w:tblGrid>
       <w:tr>
         <w:trPr>
@@ -8005,7 +8044,7 @@
         </w:trPr>
         <w:tc>
           <w:tcPr>
-            <w:tcW w:type="dxa" w:w="1111"/>
+            <w:tcW w:type="dxa" w:w="1003"/>
             <w:shd w:fill="D9D9D9" w:val="clear"/>
             <w:tcMar>
               <w:top w:type="dxa" w:w="70"/>
@@ -8034,7 +8073,7 @@
         </w:tc>
         <w:tc>
           <w:tcPr>
-            <w:tcW w:type="dxa" w:w="5090"/>
+            <w:tcW w:type="dxa" w:w="4743"/>
             <w:shd w:fill="D9D9D9" w:val="clear"/>
             <w:tcMar>
               <w:top w:type="dxa" w:w="70"/>
@@ -8063,7 +8102,7 @@
         </w:tc>
         <w:tc>
           <w:tcPr>
-            <w:tcW w:type="dxa" w:w="1296"/>
+            <w:tcW w:type="dxa" w:w="1186"/>
             <w:shd w:fill="D9D9D9" w:val="clear"/>
             <w:tcMar>
               <w:top w:type="dxa" w:w="70"/>
@@ -8092,7 +8131,7 @@
         </w:tc>
         <w:tc>
           <w:tcPr>
-            <w:tcW w:type="dxa" w:w="1203"/>
+            <w:tcW w:type="dxa" w:w="1368"/>
             <w:shd w:fill="D9D9D9" w:val="clear"/>
             <w:tcMar>
               <w:top w:type="dxa" w:w="70"/>
@@ -8115,7 +8154,7 @@
                 <w:sz w:val="22"/>
                 <w:szCs w:val="22"/>
               </w:rPr>
-              <w:t xml:space="preserve">Requirement</w:t>
+              <w:t xml:space="preserve">Req. ID</w:t>
             </w:r>
           </w:p>
         </w:tc>
@@ -8123,7 +8162,7 @@
       <w:tr>
         <w:tc>
           <w:tcPr>
-            <w:tcW w:type="dxa" w:w="1111"/>
+            <w:tcW w:type="dxa" w:w="1003"/>
             <w:tcMar>
               <w:top w:type="dxa" w:w="70"/>
               <w:left w:type="dxa" w:w="110"/>
@@ -8151,7 +8190,7 @@
         </w:tc>
         <w:tc>
           <w:tcPr>
-            <w:tcW w:type="dxa" w:w="5090"/>
+            <w:tcW w:type="dxa" w:w="4743"/>
             <w:tcMar>
               <w:top w:type="dxa" w:w="70"/>
               <w:left w:type="dxa" w:w="110"/>
@@ -8179,7 +8218,7 @@
         </w:tc>
         <w:tc>
           <w:tcPr>
-            <w:tcW w:type="dxa" w:w="1296"/>
+            <w:tcW w:type="dxa" w:w="1186"/>
             <w:tcMar>
               <w:top w:type="dxa" w:w="70"/>
               <w:left w:type="dxa" w:w="110"/>
@@ -8207,7 +8246,7 @@
         </w:tc>
         <w:tc>
           <w:tcPr>
-            <w:tcW w:type="dxa" w:w="1203"/>
+            <w:tcW w:type="dxa" w:w="1368"/>
             <w:tcMar>
               <w:top w:type="dxa" w:w="70"/>
               <w:left w:type="dxa" w:w="110"/>
@@ -8237,7 +8276,7 @@
       <w:tr>
         <w:tc>
           <w:tcPr>
-            <w:tcW w:type="dxa" w:w="1111"/>
+            <w:tcW w:type="dxa" w:w="1003"/>
             <w:tcMar>
               <w:top w:type="dxa" w:w="70"/>
               <w:left w:type="dxa" w:w="110"/>
@@ -8265,7 +8304,7 @@
         </w:tc>
         <w:tc>
           <w:tcPr>
-            <w:tcW w:type="dxa" w:w="5090"/>
+            <w:tcW w:type="dxa" w:w="4743"/>
             <w:tcMar>
               <w:top w:type="dxa" w:w="70"/>
               <w:left w:type="dxa" w:w="110"/>
@@ -8293,7 +8332,7 @@
         </w:tc>
         <w:tc>
           <w:tcPr>
-            <w:tcW w:type="dxa" w:w="1296"/>
+            <w:tcW w:type="dxa" w:w="1186"/>
             <w:tcMar>
               <w:top w:type="dxa" w:w="70"/>
               <w:left w:type="dxa" w:w="110"/>
@@ -8321,7 +8360,7 @@
         </w:tc>
         <w:tc>
           <w:tcPr>
-            <w:tcW w:type="dxa" w:w="1203"/>
+            <w:tcW w:type="dxa" w:w="1368"/>
             <w:tcMar>
               <w:top w:type="dxa" w:w="70"/>
               <w:left w:type="dxa" w:w="110"/>
@@ -8351,7 +8390,7 @@
       <w:tr>
         <w:tc>
           <w:tcPr>
-            <w:tcW w:type="dxa" w:w="1111"/>
+            <w:tcW w:type="dxa" w:w="1003"/>
             <w:tcMar>
               <w:top w:type="dxa" w:w="70"/>
               <w:left w:type="dxa" w:w="110"/>
@@ -8379,7 +8418,7 @@
         </w:tc>
         <w:tc>
           <w:tcPr>
-            <w:tcW w:type="dxa" w:w="5090"/>
+            <w:tcW w:type="dxa" w:w="4743"/>
             <w:tcMar>
               <w:top w:type="dxa" w:w="70"/>
               <w:left w:type="dxa" w:w="110"/>
@@ -8407,7 +8446,7 @@
         </w:tc>
         <w:tc>
           <w:tcPr>
-            <w:tcW w:type="dxa" w:w="1296"/>
+            <w:tcW w:type="dxa" w:w="1186"/>
             <w:tcMar>
               <w:top w:type="dxa" w:w="70"/>
               <w:left w:type="dxa" w:w="110"/>
@@ -8435,7 +8474,7 @@
         </w:tc>
         <w:tc>
           <w:tcPr>
-            <w:tcW w:type="dxa" w:w="1203"/>
+            <w:tcW w:type="dxa" w:w="1368"/>
             <w:tcMar>
               <w:top w:type="dxa" w:w="70"/>
               <w:left w:type="dxa" w:w="110"/>
@@ -8465,7 +8504,7 @@
       <w:tr>
         <w:tc>
           <w:tcPr>
-            <w:tcW w:type="dxa" w:w="1111"/>
+            <w:tcW w:type="dxa" w:w="1003"/>
             <w:tcMar>
               <w:top w:type="dxa" w:w="70"/>
               <w:left w:type="dxa" w:w="110"/>
@@ -8493,7 +8532,7 @@
         </w:tc>
         <w:tc>
           <w:tcPr>
-            <w:tcW w:type="dxa" w:w="5090"/>
+            <w:tcW w:type="dxa" w:w="4743"/>
             <w:tcMar>
               <w:top w:type="dxa" w:w="70"/>
               <w:left w:type="dxa" w:w="110"/>
@@ -8521,7 +8560,7 @@
         </w:tc>
         <w:tc>
           <w:tcPr>
-            <w:tcW w:type="dxa" w:w="1296"/>
+            <w:tcW w:type="dxa" w:w="1186"/>
             <w:tcMar>
               <w:top w:type="dxa" w:w="70"/>
               <w:left w:type="dxa" w:w="110"/>
@@ -8549,7 +8588,7 @@
         </w:tc>
         <w:tc>
           <w:tcPr>
-            <w:tcW w:type="dxa" w:w="1203"/>
+            <w:tcW w:type="dxa" w:w="1368"/>
             <w:tcMar>
               <w:top w:type="dxa" w:w="70"/>
               <w:left w:type="dxa" w:w="110"/>
@@ -8579,7 +8618,7 @@
       <w:tr>
         <w:tc>
           <w:tcPr>
-            <w:tcW w:type="dxa" w:w="1111"/>
+            <w:tcW w:type="dxa" w:w="1003"/>
             <w:tcMar>
               <w:top w:type="dxa" w:w="70"/>
               <w:left w:type="dxa" w:w="110"/>
@@ -8607,7 +8646,7 @@
         </w:tc>
         <w:tc>
           <w:tcPr>
-            <w:tcW w:type="dxa" w:w="5090"/>
+            <w:tcW w:type="dxa" w:w="4743"/>
             <w:tcMar>
               <w:top w:type="dxa" w:w="70"/>
               <w:left w:type="dxa" w:w="110"/>
@@ -8635,7 +8674,7 @@
         </w:tc>
         <w:tc>
           <w:tcPr>
-            <w:tcW w:type="dxa" w:w="1296"/>
+            <w:tcW w:type="dxa" w:w="1186"/>
             <w:tcMar>
               <w:top w:type="dxa" w:w="70"/>
               <w:left w:type="dxa" w:w="110"/>
@@ -8663,7 +8702,7 @@
         </w:tc>
         <w:tc>
           <w:tcPr>
-            <w:tcW w:type="dxa" w:w="1203"/>
+            <w:tcW w:type="dxa" w:w="1368"/>
             <w:tcMar>
               <w:top w:type="dxa" w:w="70"/>
               <w:left w:type="dxa" w:w="110"/>
@@ -8693,7 +8732,7 @@
       <w:tr>
         <w:tc>
           <w:tcPr>
-            <w:tcW w:type="dxa" w:w="1111"/>
+            <w:tcW w:type="dxa" w:w="1003"/>
             <w:tcMar>
               <w:top w:type="dxa" w:w="70"/>
               <w:left w:type="dxa" w:w="110"/>
@@ -8721,7 +8760,7 @@
         </w:tc>
         <w:tc>
           <w:tcPr>
-            <w:tcW w:type="dxa" w:w="5090"/>
+            <w:tcW w:type="dxa" w:w="4743"/>
             <w:tcMar>
               <w:top w:type="dxa" w:w="70"/>
               <w:left w:type="dxa" w:w="110"/>
@@ -8749,7 +8788,7 @@
         </w:tc>
         <w:tc>
           <w:tcPr>
-            <w:tcW w:type="dxa" w:w="1296"/>
+            <w:tcW w:type="dxa" w:w="1186"/>
             <w:tcMar>
               <w:top w:type="dxa" w:w="70"/>
               <w:left w:type="dxa" w:w="110"/>
@@ -8777,7 +8816,7 @@
         </w:tc>
         <w:tc>
           <w:tcPr>
-            <w:tcW w:type="dxa" w:w="1203"/>
+            <w:tcW w:type="dxa" w:w="1368"/>
             <w:tcMar>
               <w:top w:type="dxa" w:w="70"/>
               <w:left w:type="dxa" w:w="110"/>
@@ -8807,7 +8846,7 @@
       <w:tr>
         <w:tc>
           <w:tcPr>
-            <w:tcW w:type="dxa" w:w="1111"/>
+            <w:tcW w:type="dxa" w:w="1003"/>
             <w:tcMar>
               <w:top w:type="dxa" w:w="70"/>
               <w:left w:type="dxa" w:w="110"/>
@@ -8835,7 +8874,7 @@
         </w:tc>
         <w:tc>
           <w:tcPr>
-            <w:tcW w:type="dxa" w:w="5090"/>
+            <w:tcW w:type="dxa" w:w="4743"/>
             <w:tcMar>
               <w:top w:type="dxa" w:w="70"/>
               <w:left w:type="dxa" w:w="110"/>
@@ -8863,7 +8902,7 @@
         </w:tc>
         <w:tc>
           <w:tcPr>
-            <w:tcW w:type="dxa" w:w="1296"/>
+            <w:tcW w:type="dxa" w:w="1186"/>
             <w:tcMar>
               <w:top w:type="dxa" w:w="70"/>
               <w:left w:type="dxa" w:w="110"/>
@@ -8891,7 +8930,7 @@
         </w:tc>
         <w:tc>
           <w:tcPr>
-            <w:tcW w:type="dxa" w:w="1203"/>
+            <w:tcW w:type="dxa" w:w="1368"/>
             <w:tcMar>
               <w:top w:type="dxa" w:w="70"/>
               <w:left w:type="dxa" w:w="110"/>
@@ -8921,7 +8960,7 @@
       <w:tr>
         <w:tc>
           <w:tcPr>
-            <w:tcW w:type="dxa" w:w="1111"/>
+            <w:tcW w:type="dxa" w:w="1003"/>
             <w:tcMar>
               <w:top w:type="dxa" w:w="70"/>
               <w:left w:type="dxa" w:w="110"/>
@@ -8949,7 +8988,7 @@
         </w:tc>
         <w:tc>
           <w:tcPr>
-            <w:tcW w:type="dxa" w:w="5090"/>
+            <w:tcW w:type="dxa" w:w="4743"/>
             <w:tcMar>
               <w:top w:type="dxa" w:w="70"/>
               <w:left w:type="dxa" w:w="110"/>
@@ -8977,7 +9016,7 @@
         </w:tc>
         <w:tc>
           <w:tcPr>
-            <w:tcW w:type="dxa" w:w="1296"/>
+            <w:tcW w:type="dxa" w:w="1186"/>
             <w:tcMar>
               <w:top w:type="dxa" w:w="70"/>
               <w:left w:type="dxa" w:w="110"/>
@@ -9005,7 +9044,7 @@
         </w:tc>
         <w:tc>
           <w:tcPr>
-            <w:tcW w:type="dxa" w:w="1203"/>
+            <w:tcW w:type="dxa" w:w="1368"/>
             <w:tcMar>
               <w:top w:type="dxa" w:w="70"/>
               <w:left w:type="dxa" w:w="110"/>
@@ -9035,7 +9074,7 @@
       <w:tr>
         <w:tc>
           <w:tcPr>
-            <w:tcW w:type="dxa" w:w="1111"/>
+            <w:tcW w:type="dxa" w:w="1003"/>
             <w:tcMar>
               <w:top w:type="dxa" w:w="70"/>
               <w:left w:type="dxa" w:w="110"/>
@@ -9063,7 +9102,7 @@
         </w:tc>
         <w:tc>
           <w:tcPr>
-            <w:tcW w:type="dxa" w:w="5090"/>
+            <w:tcW w:type="dxa" w:w="4743"/>
             <w:tcMar>
               <w:top w:type="dxa" w:w="70"/>
               <w:left w:type="dxa" w:w="110"/>
@@ -9091,7 +9130,7 @@
         </w:tc>
         <w:tc>
           <w:tcPr>
-            <w:tcW w:type="dxa" w:w="1296"/>
+            <w:tcW w:type="dxa" w:w="1186"/>
             <w:tcMar>
               <w:top w:type="dxa" w:w="70"/>
               <w:left w:type="dxa" w:w="110"/>
@@ -9119,7 +9158,7 @@
         </w:tc>
         <w:tc>
           <w:tcPr>
-            <w:tcW w:type="dxa" w:w="1203"/>
+            <w:tcW w:type="dxa" w:w="1368"/>
             <w:tcMar>
               <w:top w:type="dxa" w:w="70"/>
               <w:left w:type="dxa" w:w="110"/>
@@ -9149,7 +9188,7 @@
       <w:tr>
         <w:tc>
           <w:tcPr>
-            <w:tcW w:type="dxa" w:w="1111"/>
+            <w:tcW w:type="dxa" w:w="1003"/>
             <w:tcMar>
               <w:top w:type="dxa" w:w="70"/>
               <w:left w:type="dxa" w:w="110"/>
@@ -9177,7 +9216,7 @@
         </w:tc>
         <w:tc>
           <w:tcPr>
-            <w:tcW w:type="dxa" w:w="5090"/>
+            <w:tcW w:type="dxa" w:w="4743"/>
             <w:tcMar>
               <w:top w:type="dxa" w:w="70"/>
               <w:left w:type="dxa" w:w="110"/>
@@ -9205,7 +9244,7 @@
         </w:tc>
         <w:tc>
           <w:tcPr>
-            <w:tcW w:type="dxa" w:w="1296"/>
+            <w:tcW w:type="dxa" w:w="1186"/>
             <w:tcMar>
               <w:top w:type="dxa" w:w="70"/>
               <w:left w:type="dxa" w:w="110"/>
@@ -9233,7 +9272,7 @@
         </w:tc>
         <w:tc>
           <w:tcPr>
-            <w:tcW w:type="dxa" w:w="1203"/>
+            <w:tcW w:type="dxa" w:w="1368"/>
             <w:tcMar>
               <w:top w:type="dxa" w:w="70"/>
               <w:left w:type="dxa" w:w="110"/>
@@ -9263,7 +9302,7 @@
       <w:tr>
         <w:tc>
           <w:tcPr>
-            <w:tcW w:type="dxa" w:w="1111"/>
+            <w:tcW w:type="dxa" w:w="1003"/>
             <w:tcMar>
               <w:top w:type="dxa" w:w="70"/>
               <w:left w:type="dxa" w:w="110"/>
@@ -9291,7 +9330,7 @@
         </w:tc>
         <w:tc>
           <w:tcPr>
-            <w:tcW w:type="dxa" w:w="5090"/>
+            <w:tcW w:type="dxa" w:w="4743"/>
             <w:tcMar>
               <w:top w:type="dxa" w:w="70"/>
               <w:left w:type="dxa" w:w="110"/>
@@ -9319,7 +9358,7 @@
         </w:tc>
         <w:tc>
           <w:tcPr>
-            <w:tcW w:type="dxa" w:w="1296"/>
+            <w:tcW w:type="dxa" w:w="1186"/>
             <w:tcMar>
               <w:top w:type="dxa" w:w="70"/>
               <w:left w:type="dxa" w:w="110"/>
@@ -9347,7 +9386,7 @@
         </w:tc>
         <w:tc>
           <w:tcPr>
-            <w:tcW w:type="dxa" w:w="1203"/>
+            <w:tcW w:type="dxa" w:w="1368"/>
             <w:tcMar>
               <w:top w:type="dxa" w:w="70"/>
               <w:left w:type="dxa" w:w="110"/>
@@ -9377,7 +9416,7 @@
       <w:tr>
         <w:tc>
           <w:tcPr>
-            <w:tcW w:type="dxa" w:w="1111"/>
+            <w:tcW w:type="dxa" w:w="1003"/>
             <w:tcMar>
               <w:top w:type="dxa" w:w="70"/>
               <w:left w:type="dxa" w:w="110"/>
@@ -9405,7 +9444,7 @@
         </w:tc>
         <w:tc>
           <w:tcPr>
-            <w:tcW w:type="dxa" w:w="5090"/>
+            <w:tcW w:type="dxa" w:w="4743"/>
             <w:tcMar>
               <w:top w:type="dxa" w:w="70"/>
               <w:left w:type="dxa" w:w="110"/>
@@ -9433,7 +9472,7 @@
         </w:tc>
         <w:tc>
           <w:tcPr>
-            <w:tcW w:type="dxa" w:w="1296"/>
+            <w:tcW w:type="dxa" w:w="1186"/>
             <w:tcMar>
               <w:top w:type="dxa" w:w="70"/>
               <w:left w:type="dxa" w:w="110"/>
@@ -9461,7 +9500,7 @@
         </w:tc>
         <w:tc>
           <w:tcPr>
-            <w:tcW w:type="dxa" w:w="1203"/>
+            <w:tcW w:type="dxa" w:w="1368"/>
             <w:tcMar>
               <w:top w:type="dxa" w:w="70"/>
               <w:left w:type="dxa" w:w="110"/>
@@ -9491,7 +9530,7 @@
       <w:tr>
         <w:tc>
           <w:tcPr>
-            <w:tcW w:type="dxa" w:w="1111"/>
+            <w:tcW w:type="dxa" w:w="1003"/>
             <w:tcMar>
               <w:top w:type="dxa" w:w="70"/>
               <w:left w:type="dxa" w:w="110"/>
@@ -9519,7 +9558,7 @@
         </w:tc>
         <w:tc>
           <w:tcPr>
-            <w:tcW w:type="dxa" w:w="5090"/>
+            <w:tcW w:type="dxa" w:w="4743"/>
             <w:tcMar>
               <w:top w:type="dxa" w:w="70"/>
               <w:left w:type="dxa" w:w="110"/>
@@ -9547,7 +9586,7 @@
         </w:tc>
         <w:tc>
           <w:tcPr>
-            <w:tcW w:type="dxa" w:w="1296"/>
+            <w:tcW w:type="dxa" w:w="1186"/>
             <w:tcMar>
               <w:top w:type="dxa" w:w="70"/>
               <w:left w:type="dxa" w:w="110"/>
@@ -9575,7 +9614,7 @@
         </w:tc>
         <w:tc>
           <w:tcPr>
-            <w:tcW w:type="dxa" w:w="1203"/>
+            <w:tcW w:type="dxa" w:w="1368"/>
             <w:tcMar>
               <w:top w:type="dxa" w:w="70"/>
               <w:left w:type="dxa" w:w="110"/>
@@ -9605,7 +9644,7 @@
       <w:tr>
         <w:tc>
           <w:tcPr>
-            <w:tcW w:type="dxa" w:w="1111"/>
+            <w:tcW w:type="dxa" w:w="1003"/>
             <w:tcMar>
               <w:top w:type="dxa" w:w="70"/>
               <w:left w:type="dxa" w:w="110"/>
@@ -9633,7 +9672,7 @@
         </w:tc>
         <w:tc>
           <w:tcPr>
-            <w:tcW w:type="dxa" w:w="5090"/>
+            <w:tcW w:type="dxa" w:w="4743"/>
             <w:tcMar>
               <w:top w:type="dxa" w:w="70"/>
               <w:left w:type="dxa" w:w="110"/>
@@ -9661,7 +9700,7 @@
         </w:tc>
         <w:tc>
           <w:tcPr>
-            <w:tcW w:type="dxa" w:w="1296"/>
+            <w:tcW w:type="dxa" w:w="1186"/>
             <w:tcMar>
               <w:top w:type="dxa" w:w="70"/>
               <w:left w:type="dxa" w:w="110"/>
@@ -9689,7 +9728,7 @@
         </w:tc>
         <w:tc>
           <w:tcPr>
-            <w:tcW w:type="dxa" w:w="1203"/>
+            <w:tcW w:type="dxa" w:w="1368"/>
             <w:tcMar>
               <w:top w:type="dxa" w:w="70"/>
               <w:left w:type="dxa" w:w="110"/>
@@ -10279,7 +10318,7 @@
     </w:p>
     <w:tbl>
       <w:tblPr>
-        <w:tblW w:type="dxa" w:w="8700"/>
+        <w:tblW w:type="dxa" w:w="8300"/>
         <w:tblBorders>
           <w:top w:val="single" w:color="auto" w:sz="4"/>
           <w:left w:val="single" w:color="auto" w:sz="4"/>
@@ -10290,9 +10329,9 @@
         </w:tblBorders>
       </w:tblPr>
       <w:tblGrid>
-        <w:gridCol w:w="1450"/>
-        <w:gridCol w:w="2900"/>
-        <w:gridCol w:w="4350"/>
+        <w:gridCol w:w="1383"/>
+        <w:gridCol w:w="2767"/>
+        <w:gridCol w:w="4150"/>
       </w:tblGrid>
       <w:tr>
         <w:trPr>
@@ -10300,7 +10339,7 @@
         </w:trPr>
         <w:tc>
           <w:tcPr>
-            <w:tcW w:type="dxa" w:w="1450"/>
+            <w:tcW w:type="dxa" w:w="1383"/>
             <w:shd w:fill="D9D9D9" w:val="clear"/>
             <w:tcMar>
               <w:top w:type="dxa" w:w="70"/>
@@ -10329,7 +10368,7 @@
         </w:tc>
         <w:tc>
           <w:tcPr>
-            <w:tcW w:type="dxa" w:w="2900"/>
+            <w:tcW w:type="dxa" w:w="2767"/>
             <w:shd w:fill="D9D9D9" w:val="clear"/>
             <w:tcMar>
               <w:top w:type="dxa" w:w="70"/>
@@ -10358,7 +10397,7 @@
         </w:tc>
         <w:tc>
           <w:tcPr>
-            <w:tcW w:type="dxa" w:w="4350"/>
+            <w:tcW w:type="dxa" w:w="4150"/>
             <w:shd w:fill="D9D9D9" w:val="clear"/>
             <w:tcMar>
               <w:top w:type="dxa" w:w="70"/>
@@ -10389,7 +10428,7 @@
       <w:tr>
         <w:tc>
           <w:tcPr>
-            <w:tcW w:type="dxa" w:w="1450"/>
+            <w:tcW w:type="dxa" w:w="1383"/>
             <w:tcMar>
               <w:top w:type="dxa" w:w="70"/>
               <w:left w:type="dxa" w:w="110"/>
@@ -10417,7 +10456,7 @@
         </w:tc>
         <w:tc>
           <w:tcPr>
-            <w:tcW w:type="dxa" w:w="2900"/>
+            <w:tcW w:type="dxa" w:w="2767"/>
             <w:tcMar>
               <w:top w:type="dxa" w:w="70"/>
               <w:left w:type="dxa" w:w="110"/>
@@ -10445,7 +10484,7 @@
         </w:tc>
         <w:tc>
           <w:tcPr>
-            <w:tcW w:type="dxa" w:w="4350"/>
+            <w:tcW w:type="dxa" w:w="4150"/>
             <w:tcMar>
               <w:top w:type="dxa" w:w="70"/>
               <w:left w:type="dxa" w:w="110"/>
@@ -10475,7 +10514,7 @@
       <w:tr>
         <w:tc>
           <w:tcPr>
-            <w:tcW w:type="dxa" w:w="1450"/>
+            <w:tcW w:type="dxa" w:w="1383"/>
             <w:tcMar>
               <w:top w:type="dxa" w:w="70"/>
               <w:left w:type="dxa" w:w="110"/>
@@ -10503,7 +10542,7 @@
         </w:tc>
         <w:tc>
           <w:tcPr>
-            <w:tcW w:type="dxa" w:w="2900"/>
+            <w:tcW w:type="dxa" w:w="2767"/>
             <w:tcMar>
               <w:top w:type="dxa" w:w="70"/>
               <w:left w:type="dxa" w:w="110"/>
@@ -10531,7 +10570,7 @@
         </w:tc>
         <w:tc>
           <w:tcPr>
-            <w:tcW w:type="dxa" w:w="4350"/>
+            <w:tcW w:type="dxa" w:w="4150"/>
             <w:tcMar>
               <w:top w:type="dxa" w:w="70"/>
               <w:left w:type="dxa" w:w="110"/>
@@ -10561,7 +10600,7 @@
       <w:tr>
         <w:tc>
           <w:tcPr>
-            <w:tcW w:type="dxa" w:w="1450"/>
+            <w:tcW w:type="dxa" w:w="1383"/>
             <w:tcMar>
               <w:top w:type="dxa" w:w="70"/>
               <w:left w:type="dxa" w:w="110"/>
@@ -10589,7 +10628,7 @@
         </w:tc>
         <w:tc>
           <w:tcPr>
-            <w:tcW w:type="dxa" w:w="2900"/>
+            <w:tcW w:type="dxa" w:w="2767"/>
             <w:tcMar>
               <w:top w:type="dxa" w:w="70"/>
               <w:left w:type="dxa" w:w="110"/>
@@ -10617,7 +10656,7 @@
         </w:tc>
         <w:tc>
           <w:tcPr>
-            <w:tcW w:type="dxa" w:w="4350"/>
+            <w:tcW w:type="dxa" w:w="4150"/>
             <w:tcMar>
               <w:top w:type="dxa" w:w="70"/>
               <w:left w:type="dxa" w:w="110"/>
@@ -10647,7 +10686,7 @@
       <w:tr>
         <w:tc>
           <w:tcPr>
-            <w:tcW w:type="dxa" w:w="1450"/>
+            <w:tcW w:type="dxa" w:w="1383"/>
             <w:tcMar>
               <w:top w:type="dxa" w:w="70"/>
               <w:left w:type="dxa" w:w="110"/>
@@ -10675,7 +10714,7 @@
         </w:tc>
         <w:tc>
           <w:tcPr>
-            <w:tcW w:type="dxa" w:w="2900"/>
+            <w:tcW w:type="dxa" w:w="2767"/>
             <w:tcMar>
               <w:top w:type="dxa" w:w="70"/>
               <w:left w:type="dxa" w:w="110"/>
@@ -10703,7 +10742,7 @@
         </w:tc>
         <w:tc>
           <w:tcPr>
-            <w:tcW w:type="dxa" w:w="4350"/>
+            <w:tcW w:type="dxa" w:w="4150"/>
             <w:tcMar>
               <w:top w:type="dxa" w:w="70"/>
               <w:left w:type="dxa" w:w="110"/>
@@ -10733,7 +10772,7 @@
       <w:tr>
         <w:tc>
           <w:tcPr>
-            <w:tcW w:type="dxa" w:w="1450"/>
+            <w:tcW w:type="dxa" w:w="1383"/>
             <w:tcMar>
               <w:top w:type="dxa" w:w="70"/>
               <w:left w:type="dxa" w:w="110"/>
@@ -10761,7 +10800,7 @@
         </w:tc>
         <w:tc>
           <w:tcPr>
-            <w:tcW w:type="dxa" w:w="2900"/>
+            <w:tcW w:type="dxa" w:w="2767"/>
             <w:tcMar>
               <w:top w:type="dxa" w:w="70"/>
               <w:left w:type="dxa" w:w="110"/>
@@ -10789,7 +10828,7 @@
         </w:tc>
         <w:tc>
           <w:tcPr>
-            <w:tcW w:type="dxa" w:w="4350"/>
+            <w:tcW w:type="dxa" w:w="4150"/>
             <w:tcMar>
               <w:top w:type="dxa" w:w="70"/>
               <w:left w:type="dxa" w:w="110"/>
@@ -10819,7 +10858,7 @@
       <w:tr>
         <w:tc>
           <w:tcPr>
-            <w:tcW w:type="dxa" w:w="1450"/>
+            <w:tcW w:type="dxa" w:w="1383"/>
             <w:tcMar>
               <w:top w:type="dxa" w:w="70"/>
               <w:left w:type="dxa" w:w="110"/>
@@ -10847,7 +10886,7 @@
         </w:tc>
         <w:tc>
           <w:tcPr>
-            <w:tcW w:type="dxa" w:w="2900"/>
+            <w:tcW w:type="dxa" w:w="2767"/>
             <w:tcMar>
               <w:top w:type="dxa" w:w="70"/>
               <w:left w:type="dxa" w:w="110"/>
@@ -10875,7 +10914,7 @@
         </w:tc>
         <w:tc>
           <w:tcPr>
-            <w:tcW w:type="dxa" w:w="4350"/>
+            <w:tcW w:type="dxa" w:w="4150"/>
             <w:tcMar>
               <w:top w:type="dxa" w:w="70"/>
               <w:left w:type="dxa" w:w="110"/>
@@ -10905,7 +10944,7 @@
       <w:tr>
         <w:tc>
           <w:tcPr>
-            <w:tcW w:type="dxa" w:w="1450"/>
+            <w:tcW w:type="dxa" w:w="1383"/>
             <w:tcMar>
               <w:top w:type="dxa" w:w="70"/>
               <w:left w:type="dxa" w:w="110"/>
@@ -10933,7 +10972,7 @@
         </w:tc>
         <w:tc>
           <w:tcPr>
-            <w:tcW w:type="dxa" w:w="2900"/>
+            <w:tcW w:type="dxa" w:w="2767"/>
             <w:tcMar>
               <w:top w:type="dxa" w:w="70"/>
               <w:left w:type="dxa" w:w="110"/>
@@ -10961,7 +11000,7 @@
         </w:tc>
         <w:tc>
           <w:tcPr>
-            <w:tcW w:type="dxa" w:w="4350"/>
+            <w:tcW w:type="dxa" w:w="4150"/>
             <w:tcMar>
               <w:top w:type="dxa" w:w="70"/>
               <w:left w:type="dxa" w:w="110"/>
@@ -10991,7 +11030,7 @@
       <w:tr>
         <w:tc>
           <w:tcPr>
-            <w:tcW w:type="dxa" w:w="1450"/>
+            <w:tcW w:type="dxa" w:w="1383"/>
             <w:tcMar>
               <w:top w:type="dxa" w:w="70"/>
               <w:left w:type="dxa" w:w="110"/>
@@ -11019,7 +11058,7 @@
         </w:tc>
         <w:tc>
           <w:tcPr>
-            <w:tcW w:type="dxa" w:w="2900"/>
+            <w:tcW w:type="dxa" w:w="2767"/>
             <w:tcMar>
               <w:top w:type="dxa" w:w="70"/>
               <w:left w:type="dxa" w:w="110"/>
@@ -11047,7 +11086,7 @@
         </w:tc>
         <w:tc>
           <w:tcPr>
-            <w:tcW w:type="dxa" w:w="4350"/>
+            <w:tcW w:type="dxa" w:w="4150"/>
             <w:tcMar>
               <w:top w:type="dxa" w:w="70"/>
               <w:left w:type="dxa" w:w="110"/>
@@ -12080,7 +12119,7 @@
     </w:p>
     <w:tbl>
       <w:tblPr>
-        <w:tblW w:type="dxa" w:w="8700"/>
+        <w:tblW w:type="dxa" w:w="8300"/>
         <w:tblBorders>
           <w:top w:val="single" w:color="auto" w:sz="4"/>
           <w:left w:val="single" w:color="auto" w:sz="4"/>
@@ -12091,8 +12130,8 @@
         </w:tblBorders>
       </w:tblPr>
       <w:tblGrid>
-        <w:gridCol w:w="2289"/>
-        <w:gridCol w:w="6411"/>
+        <w:gridCol w:w="2184"/>
+        <w:gridCol w:w="6116"/>
       </w:tblGrid>
       <w:tr>
         <w:trPr>
@@ -12100,7 +12139,7 @@
         </w:trPr>
         <w:tc>
           <w:tcPr>
-            <w:tcW w:type="dxa" w:w="2289"/>
+            <w:tcW w:type="dxa" w:w="2184"/>
             <w:shd w:fill="D9D9D9" w:val="clear"/>
             <w:tcMar>
               <w:top w:type="dxa" w:w="70"/>
@@ -12129,7 +12168,7 @@
         </w:tc>
         <w:tc>
           <w:tcPr>
-            <w:tcW w:type="dxa" w:w="6411"/>
+            <w:tcW w:type="dxa" w:w="6116"/>
             <w:shd w:fill="D9D9D9" w:val="clear"/>
             <w:tcMar>
               <w:top w:type="dxa" w:w="70"/>
@@ -12160,7 +12199,7 @@
       <w:tr>
         <w:tc>
           <w:tcPr>
-            <w:tcW w:type="dxa" w:w="2289"/>
+            <w:tcW w:type="dxa" w:w="2184"/>
             <w:tcMar>
               <w:top w:type="dxa" w:w="70"/>
               <w:left w:type="dxa" w:w="110"/>
@@ -12188,7 +12227,7 @@
         </w:tc>
         <w:tc>
           <w:tcPr>
-            <w:tcW w:type="dxa" w:w="6411"/>
+            <w:tcW w:type="dxa" w:w="6116"/>
             <w:tcMar>
               <w:top w:type="dxa" w:w="70"/>
               <w:left w:type="dxa" w:w="110"/>
@@ -12218,7 +12257,7 @@
       <w:tr>
         <w:tc>
           <w:tcPr>
-            <w:tcW w:type="dxa" w:w="2289"/>
+            <w:tcW w:type="dxa" w:w="2184"/>
             <w:tcMar>
               <w:top w:type="dxa" w:w="70"/>
               <w:left w:type="dxa" w:w="110"/>
@@ -12246,7 +12285,7 @@
         </w:tc>
         <w:tc>
           <w:tcPr>
-            <w:tcW w:type="dxa" w:w="6411"/>
+            <w:tcW w:type="dxa" w:w="6116"/>
             <w:tcMar>
               <w:top w:type="dxa" w:w="70"/>
               <w:left w:type="dxa" w:w="110"/>
@@ -12276,7 +12315,7 @@
       <w:tr>
         <w:tc>
           <w:tcPr>
-            <w:tcW w:type="dxa" w:w="2289"/>
+            <w:tcW w:type="dxa" w:w="2184"/>
             <w:tcMar>
               <w:top w:type="dxa" w:w="70"/>
               <w:left w:type="dxa" w:w="110"/>
@@ -12304,7 +12343,7 @@
         </w:tc>
         <w:tc>
           <w:tcPr>
-            <w:tcW w:type="dxa" w:w="6411"/>
+            <w:tcW w:type="dxa" w:w="6116"/>
             <w:tcMar>
               <w:top w:type="dxa" w:w="70"/>
               <w:left w:type="dxa" w:w="110"/>
@@ -12334,7 +12373,7 @@
       <w:tr>
         <w:tc>
           <w:tcPr>
-            <w:tcW w:type="dxa" w:w="2289"/>
+            <w:tcW w:type="dxa" w:w="2184"/>
             <w:tcMar>
               <w:top w:type="dxa" w:w="70"/>
               <w:left w:type="dxa" w:w="110"/>
@@ -12362,7 +12401,7 @@
         </w:tc>
         <w:tc>
           <w:tcPr>
-            <w:tcW w:type="dxa" w:w="6411"/>
+            <w:tcW w:type="dxa" w:w="6116"/>
             <w:tcMar>
               <w:top w:type="dxa" w:w="70"/>
               <w:left w:type="dxa" w:w="110"/>
@@ -12392,7 +12431,7 @@
       <w:tr>
         <w:tc>
           <w:tcPr>
-            <w:tcW w:type="dxa" w:w="2289"/>
+            <w:tcW w:type="dxa" w:w="2184"/>
             <w:tcMar>
               <w:top w:type="dxa" w:w="70"/>
               <w:left w:type="dxa" w:w="110"/>
@@ -12420,7 +12459,7 @@
         </w:tc>
         <w:tc>
           <w:tcPr>
-            <w:tcW w:type="dxa" w:w="6411"/>
+            <w:tcW w:type="dxa" w:w="6116"/>
             <w:tcMar>
               <w:top w:type="dxa" w:w="70"/>
               <w:left w:type="dxa" w:w="110"/>
@@ -12450,7 +12489,7 @@
       <w:tr>
         <w:tc>
           <w:tcPr>
-            <w:tcW w:type="dxa" w:w="2289"/>
+            <w:tcW w:type="dxa" w:w="2184"/>
             <w:tcMar>
               <w:top w:type="dxa" w:w="70"/>
               <w:left w:type="dxa" w:w="110"/>
@@ -12478,7 +12517,7 @@
         </w:tc>
         <w:tc>
           <w:tcPr>
-            <w:tcW w:type="dxa" w:w="6411"/>
+            <w:tcW w:type="dxa" w:w="6116"/>
             <w:tcMar>
               <w:top w:type="dxa" w:w="70"/>
               <w:left w:type="dxa" w:w="110"/>
@@ -12508,7 +12547,7 @@
       <w:tr>
         <w:tc>
           <w:tcPr>
-            <w:tcW w:type="dxa" w:w="2289"/>
+            <w:tcW w:type="dxa" w:w="2184"/>
             <w:tcMar>
               <w:top w:type="dxa" w:w="70"/>
               <w:left w:type="dxa" w:w="110"/>
@@ -12536,7 +12575,7 @@
         </w:tc>
         <w:tc>
           <w:tcPr>
-            <w:tcW w:type="dxa" w:w="6411"/>
+            <w:tcW w:type="dxa" w:w="6116"/>
             <w:tcMar>
               <w:top w:type="dxa" w:w="70"/>
               <w:left w:type="dxa" w:w="110"/>
@@ -12597,7 +12636,7 @@
     </w:p>
     <w:tbl>
       <w:tblPr>
-        <w:tblW w:type="dxa" w:w="8700"/>
+        <w:tblW w:type="dxa" w:w="8300"/>
         <w:tblBorders>
           <w:top w:val="single" w:color="auto" w:sz="4"/>
           <w:left w:val="single" w:color="auto" w:sz="4"/>
@@ -12608,8 +12647,8 @@
         </w:tblBorders>
       </w:tblPr>
       <w:tblGrid>
-        <w:gridCol w:w="5037"/>
-        <w:gridCol w:w="3663"/>
+        <w:gridCol w:w="4805"/>
+        <w:gridCol w:w="3495"/>
       </w:tblGrid>
       <w:tr>
         <w:trPr>
@@ -12617,7 +12656,7 @@
         </w:trPr>
         <w:tc>
           <w:tcPr>
-            <w:tcW w:type="dxa" w:w="5037"/>
+            <w:tcW w:type="dxa" w:w="4805"/>
             <w:shd w:fill="D9D9D9" w:val="clear"/>
             <w:tcMar>
               <w:top w:type="dxa" w:w="70"/>
@@ -12646,7 +12685,7 @@
         </w:tc>
         <w:tc>
           <w:tcPr>
-            <w:tcW w:type="dxa" w:w="3663"/>
+            <w:tcW w:type="dxa" w:w="3495"/>
             <w:shd w:fill="D9D9D9" w:val="clear"/>
             <w:tcMar>
               <w:top w:type="dxa" w:w="70"/>
@@ -12677,7 +12716,7 @@
       <w:tr>
         <w:tc>
           <w:tcPr>
-            <w:tcW w:type="dxa" w:w="5037"/>
+            <w:tcW w:type="dxa" w:w="4805"/>
             <w:tcMar>
               <w:top w:type="dxa" w:w="70"/>
               <w:left w:type="dxa" w:w="110"/>
@@ -12705,7 +12744,7 @@
         </w:tc>
         <w:tc>
           <w:tcPr>
-            <w:tcW w:type="dxa" w:w="3663"/>
+            <w:tcW w:type="dxa" w:w="3495"/>
             <w:tcMar>
               <w:top w:type="dxa" w:w="70"/>
               <w:left w:type="dxa" w:w="110"/>
@@ -12735,7 +12774,7 @@
       <w:tr>
         <w:tc>
           <w:tcPr>
-            <w:tcW w:type="dxa" w:w="5037"/>
+            <w:tcW w:type="dxa" w:w="4805"/>
             <w:tcMar>
               <w:top w:type="dxa" w:w="70"/>
               <w:left w:type="dxa" w:w="110"/>
@@ -12763,7 +12802,7 @@
         </w:tc>
         <w:tc>
           <w:tcPr>
-            <w:tcW w:type="dxa" w:w="3663"/>
+            <w:tcW w:type="dxa" w:w="3495"/>
             <w:tcMar>
               <w:top w:type="dxa" w:w="70"/>
               <w:left w:type="dxa" w:w="110"/>
@@ -12793,7 +12832,7 @@
       <w:tr>
         <w:tc>
           <w:tcPr>
-            <w:tcW w:type="dxa" w:w="5037"/>
+            <w:tcW w:type="dxa" w:w="4805"/>
             <w:tcMar>
               <w:top w:type="dxa" w:w="70"/>
               <w:left w:type="dxa" w:w="110"/>
@@ -12821,7 +12860,7 @@
         </w:tc>
         <w:tc>
           <w:tcPr>
-            <w:tcW w:type="dxa" w:w="3663"/>
+            <w:tcW w:type="dxa" w:w="3495"/>
             <w:tcMar>
               <w:top w:type="dxa" w:w="70"/>
               <w:left w:type="dxa" w:w="110"/>
@@ -12851,7 +12890,7 @@
       <w:tr>
         <w:tc>
           <w:tcPr>
-            <w:tcW w:type="dxa" w:w="5037"/>
+            <w:tcW w:type="dxa" w:w="4805"/>
             <w:tcMar>
               <w:top w:type="dxa" w:w="70"/>
               <w:left w:type="dxa" w:w="110"/>
@@ -12879,7 +12918,7 @@
         </w:tc>
         <w:tc>
           <w:tcPr>
-            <w:tcW w:type="dxa" w:w="3663"/>
+            <w:tcW w:type="dxa" w:w="3495"/>
             <w:tcMar>
               <w:top w:type="dxa" w:w="70"/>
               <w:left w:type="dxa" w:w="110"/>
@@ -12909,7 +12948,7 @@
       <w:tr>
         <w:tc>
           <w:tcPr>
-            <w:tcW w:type="dxa" w:w="5037"/>
+            <w:tcW w:type="dxa" w:w="4805"/>
             <w:tcMar>
               <w:top w:type="dxa" w:w="70"/>
               <w:left w:type="dxa" w:w="110"/>
@@ -12937,7 +12976,7 @@
         </w:tc>
         <w:tc>
           <w:tcPr>
-            <w:tcW w:type="dxa" w:w="3663"/>
+            <w:tcW w:type="dxa" w:w="3495"/>
             <w:tcMar>
               <w:top w:type="dxa" w:w="70"/>
               <w:left w:type="dxa" w:w="110"/>
@@ -12967,7 +13006,7 @@
       <w:tr>
         <w:tc>
           <w:tcPr>
-            <w:tcW w:type="dxa" w:w="5037"/>
+            <w:tcW w:type="dxa" w:w="4805"/>
             <w:tcMar>
               <w:top w:type="dxa" w:w="70"/>
               <w:left w:type="dxa" w:w="110"/>
@@ -12995,7 +13034,7 @@
         </w:tc>
         <w:tc>
           <w:tcPr>
-            <w:tcW w:type="dxa" w:w="3663"/>
+            <w:tcW w:type="dxa" w:w="3495"/>
             <w:tcMar>
               <w:top w:type="dxa" w:w="70"/>
               <w:left w:type="dxa" w:w="110"/>
@@ -13025,7 +13064,7 @@
       <w:tr>
         <w:tc>
           <w:tcPr>
-            <w:tcW w:type="dxa" w:w="5037"/>
+            <w:tcW w:type="dxa" w:w="4805"/>
             <w:tcMar>
               <w:top w:type="dxa" w:w="70"/>
               <w:left w:type="dxa" w:w="110"/>
@@ -13053,7 +13092,7 @@
         </w:tc>
         <w:tc>
           <w:tcPr>
-            <w:tcW w:type="dxa" w:w="3663"/>
+            <w:tcW w:type="dxa" w:w="3495"/>
             <w:tcMar>
               <w:top w:type="dxa" w:w="70"/>
               <w:left w:type="dxa" w:w="110"/>
@@ -13114,7 +13153,7 @@
     </w:p>
     <w:tbl>
       <w:tblPr>
-        <w:tblW w:type="dxa" w:w="8700"/>
+        <w:tblW w:type="dxa" w:w="8300"/>
         <w:tblBorders>
           <w:top w:val="single" w:color="auto" w:sz="4"/>
           <w:left w:val="single" w:color="auto" w:sz="4"/>
@@ -13125,8 +13164,8 @@
         </w:tblBorders>
       </w:tblPr>
       <w:tblGrid>
-        <w:gridCol w:w="5800"/>
-        <w:gridCol w:w="2900"/>
+        <w:gridCol w:w="5533"/>
+        <w:gridCol w:w="2767"/>
       </w:tblGrid>
       <w:tr>
         <w:trPr>
@@ -13134,7 +13173,7 @@
         </w:trPr>
         <w:tc>
           <w:tcPr>
-            <w:tcW w:type="dxa" w:w="5800"/>
+            <w:tcW w:type="dxa" w:w="5533"/>
             <w:shd w:fill="D9D9D9" w:val="clear"/>
             <w:tcMar>
               <w:top w:type="dxa" w:w="70"/>
@@ -13163,7 +13202,7 @@
         </w:tc>
         <w:tc>
           <w:tcPr>
-            <w:tcW w:type="dxa" w:w="2900"/>
+            <w:tcW w:type="dxa" w:w="2767"/>
             <w:shd w:fill="D9D9D9" w:val="clear"/>
             <w:tcMar>
               <w:top w:type="dxa" w:w="70"/>
@@ -13194,7 +13233,7 @@
       <w:tr>
         <w:tc>
           <w:tcPr>
-            <w:tcW w:type="dxa" w:w="5800"/>
+            <w:tcW w:type="dxa" w:w="5533"/>
             <w:tcMar>
               <w:top w:type="dxa" w:w="70"/>
               <w:left w:type="dxa" w:w="110"/>
@@ -13222,7 +13261,7 @@
         </w:tc>
         <w:tc>
           <w:tcPr>
-            <w:tcW w:type="dxa" w:w="2900"/>
+            <w:tcW w:type="dxa" w:w="2767"/>
             <w:tcMar>
               <w:top w:type="dxa" w:w="70"/>
               <w:left w:type="dxa" w:w="110"/>
@@ -13252,7 +13291,7 @@
       <w:tr>
         <w:tc>
           <w:tcPr>
-            <w:tcW w:type="dxa" w:w="5800"/>
+            <w:tcW w:type="dxa" w:w="5533"/>
             <w:tcMar>
               <w:top w:type="dxa" w:w="70"/>
               <w:left w:type="dxa" w:w="110"/>
@@ -13280,7 +13319,7 @@
         </w:tc>
         <w:tc>
           <w:tcPr>
-            <w:tcW w:type="dxa" w:w="2900"/>
+            <w:tcW w:type="dxa" w:w="2767"/>
             <w:tcMar>
               <w:top w:type="dxa" w:w="70"/>
               <w:left w:type="dxa" w:w="110"/>
@@ -13310,7 +13349,7 @@
       <w:tr>
         <w:tc>
           <w:tcPr>
-            <w:tcW w:type="dxa" w:w="5800"/>
+            <w:tcW w:type="dxa" w:w="5533"/>
             <w:tcMar>
               <w:top w:type="dxa" w:w="70"/>
               <w:left w:type="dxa" w:w="110"/>
@@ -13338,7 +13377,7 @@
         </w:tc>
         <w:tc>
           <w:tcPr>
-            <w:tcW w:type="dxa" w:w="2900"/>
+            <w:tcW w:type="dxa" w:w="2767"/>
             <w:tcMar>
               <w:top w:type="dxa" w:w="70"/>
               <w:left w:type="dxa" w:w="110"/>
@@ -13368,7 +13407,7 @@
       <w:tr>
         <w:tc>
           <w:tcPr>
-            <w:tcW w:type="dxa" w:w="5800"/>
+            <w:tcW w:type="dxa" w:w="5533"/>
             <w:tcMar>
               <w:top w:type="dxa" w:w="70"/>
               <w:left w:type="dxa" w:w="110"/>
@@ -13396,7 +13435,7 @@
         </w:tc>
         <w:tc>
           <w:tcPr>
-            <w:tcW w:type="dxa" w:w="2900"/>
+            <w:tcW w:type="dxa" w:w="2767"/>
             <w:tcMar>
               <w:top w:type="dxa" w:w="70"/>
               <w:left w:type="dxa" w:w="110"/>
@@ -13426,7 +13465,7 @@
       <w:tr>
         <w:tc>
           <w:tcPr>
-            <w:tcW w:type="dxa" w:w="5800"/>
+            <w:tcW w:type="dxa" w:w="5533"/>
             <w:tcMar>
               <w:top w:type="dxa" w:w="70"/>
               <w:left w:type="dxa" w:w="110"/>
@@ -13454,7 +13493,7 @@
         </w:tc>
         <w:tc>
           <w:tcPr>
-            <w:tcW w:type="dxa" w:w="2900"/>
+            <w:tcW w:type="dxa" w:w="2767"/>
             <w:tcMar>
               <w:top w:type="dxa" w:w="70"/>
               <w:left w:type="dxa" w:w="110"/>
@@ -13484,7 +13523,7 @@
       <w:tr>
         <w:tc>
           <w:tcPr>
-            <w:tcW w:type="dxa" w:w="5800"/>
+            <w:tcW w:type="dxa" w:w="5533"/>
             <w:tcMar>
               <w:top w:type="dxa" w:w="70"/>
               <w:left w:type="dxa" w:w="110"/>
@@ -13512,7 +13551,7 @@
         </w:tc>
         <w:tc>
           <w:tcPr>
-            <w:tcW w:type="dxa" w:w="2900"/>
+            <w:tcW w:type="dxa" w:w="2767"/>
             <w:tcMar>
               <w:top w:type="dxa" w:w="70"/>
               <w:left w:type="dxa" w:w="110"/>
@@ -13542,7 +13581,7 @@
       <w:tr>
         <w:tc>
           <w:tcPr>
-            <w:tcW w:type="dxa" w:w="5800"/>
+            <w:tcW w:type="dxa" w:w="5533"/>
             <w:tcMar>
               <w:top w:type="dxa" w:w="70"/>
               <w:left w:type="dxa" w:w="110"/>
@@ -13570,7 +13609,7 @@
         </w:tc>
         <w:tc>
           <w:tcPr>
-            <w:tcW w:type="dxa" w:w="2900"/>
+            <w:tcW w:type="dxa" w:w="2767"/>
             <w:tcMar>
               <w:top w:type="dxa" w:w="70"/>
               <w:left w:type="dxa" w:w="110"/>
@@ -14449,7 +14488,7 @@
     </w:p>
     <w:tbl>
       <w:tblPr>
-        <w:tblW w:type="dxa" w:w="8700"/>
+        <w:tblW w:type="dxa" w:w="8300"/>
         <w:tblBorders>
           <w:top w:val="single" w:color="auto" w:sz="4"/>
           <w:left w:val="single" w:color="auto" w:sz="4"/>
@@ -14460,10 +14499,10 @@
         </w:tblBorders>
       </w:tblPr>
       <w:tblGrid>
-        <w:gridCol w:w="3164"/>
-        <w:gridCol w:w="1582"/>
-        <w:gridCol w:w="1582"/>
-        <w:gridCol w:w="2372"/>
+        <w:gridCol w:w="3018"/>
+        <w:gridCol w:w="1509"/>
+        <w:gridCol w:w="1509"/>
+        <w:gridCol w:w="2264"/>
       </w:tblGrid>
       <w:tr>
         <w:trPr>
@@ -14471,7 +14510,7 @@
         </w:trPr>
         <w:tc>
           <w:tcPr>
-            <w:tcW w:type="dxa" w:w="3164"/>
+            <w:tcW w:type="dxa" w:w="3018"/>
             <w:shd w:fill="D9D9D9" w:val="clear"/>
             <w:tcMar>
               <w:top w:type="dxa" w:w="70"/>
@@ -14500,7 +14539,7 @@
         </w:tc>
         <w:tc>
           <w:tcPr>
-            <w:tcW w:type="dxa" w:w="1582"/>
+            <w:tcW w:type="dxa" w:w="1509"/>
             <w:shd w:fill="D9D9D9" w:val="clear"/>
             <w:tcMar>
               <w:top w:type="dxa" w:w="70"/>
@@ -14529,7 +14568,7 @@
         </w:tc>
         <w:tc>
           <w:tcPr>
-            <w:tcW w:type="dxa" w:w="1582"/>
+            <w:tcW w:type="dxa" w:w="1509"/>
             <w:shd w:fill="D9D9D9" w:val="clear"/>
             <w:tcMar>
               <w:top w:type="dxa" w:w="70"/>
@@ -14558,7 +14597,7 @@
         </w:tc>
         <w:tc>
           <w:tcPr>
-            <w:tcW w:type="dxa" w:w="2372"/>
+            <w:tcW w:type="dxa" w:w="2264"/>
             <w:shd w:fill="D9D9D9" w:val="clear"/>
             <w:tcMar>
               <w:top w:type="dxa" w:w="70"/>
@@ -14589,7 +14628,7 @@
       <w:tr>
         <w:tc>
           <w:tcPr>
-            <w:tcW w:type="dxa" w:w="3164"/>
+            <w:tcW w:type="dxa" w:w="3018"/>
             <w:tcMar>
               <w:top w:type="dxa" w:w="70"/>
               <w:left w:type="dxa" w:w="110"/>
@@ -14617,7 +14656,7 @@
         </w:tc>
         <w:tc>
           <w:tcPr>
-            <w:tcW w:type="dxa" w:w="1582"/>
+            <w:tcW w:type="dxa" w:w="1509"/>
             <w:tcMar>
               <w:top w:type="dxa" w:w="70"/>
               <w:left w:type="dxa" w:w="110"/>
@@ -14645,7 +14684,7 @@
         </w:tc>
         <w:tc>
           <w:tcPr>
-            <w:tcW w:type="dxa" w:w="1582"/>
+            <w:tcW w:type="dxa" w:w="1509"/>
             <w:tcMar>
               <w:top w:type="dxa" w:w="70"/>
               <w:left w:type="dxa" w:w="110"/>
@@ -14673,7 +14712,7 @@
         </w:tc>
         <w:tc>
           <w:tcPr>
-            <w:tcW w:type="dxa" w:w="2372"/>
+            <w:tcW w:type="dxa" w:w="2264"/>
             <w:tcMar>
               <w:top w:type="dxa" w:w="70"/>
               <w:left w:type="dxa" w:w="110"/>
@@ -14703,7 +14742,7 @@
       <w:tr>
         <w:tc>
           <w:tcPr>
-            <w:tcW w:type="dxa" w:w="3164"/>
+            <w:tcW w:type="dxa" w:w="3018"/>
             <w:tcMar>
               <w:top w:type="dxa" w:w="70"/>
               <w:left w:type="dxa" w:w="110"/>
@@ -14731,7 +14770,7 @@
         </w:tc>
         <w:tc>
           <w:tcPr>
-            <w:tcW w:type="dxa" w:w="1582"/>
+            <w:tcW w:type="dxa" w:w="1509"/>
             <w:tcMar>
               <w:top w:type="dxa" w:w="70"/>
               <w:left w:type="dxa" w:w="110"/>
@@ -14759,7 +14798,7 @@
         </w:tc>
         <w:tc>
           <w:tcPr>
-            <w:tcW w:type="dxa" w:w="1582"/>
+            <w:tcW w:type="dxa" w:w="1509"/>
             <w:tcMar>
               <w:top w:type="dxa" w:w="70"/>
               <w:left w:type="dxa" w:w="110"/>
@@ -14787,7 +14826,7 @@
         </w:tc>
         <w:tc>
           <w:tcPr>
-            <w:tcW w:type="dxa" w:w="2372"/>
+            <w:tcW w:type="dxa" w:w="2264"/>
             <w:tcMar>
               <w:top w:type="dxa" w:w="70"/>
               <w:left w:type="dxa" w:w="110"/>
@@ -16081,7 +16120,7 @@
     </w:p>
     <w:tbl>
       <w:tblPr>
-        <w:tblW w:type="dxa" w:w="8700"/>
+        <w:tblW w:type="dxa" w:w="8300"/>
         <w:tblBorders>
           <w:top w:val="single" w:color="auto" w:sz="4"/>
           <w:left w:val="single" w:color="auto" w:sz="4"/>
@@ -16092,9 +16131,9 @@
         </w:tblBorders>
       </w:tblPr>
       <w:tblGrid>
-        <w:gridCol w:w="2262"/>
-        <w:gridCol w:w="870"/>
-        <w:gridCol w:w="5568"/>
+        <w:gridCol w:w="2158"/>
+        <w:gridCol w:w="830"/>
+        <w:gridCol w:w="5312"/>
       </w:tblGrid>
       <w:tr>
         <w:trPr>
@@ -16102,7 +16141,7 @@
         </w:trPr>
         <w:tc>
           <w:tcPr>
-            <w:tcW w:type="dxa" w:w="2262"/>
+            <w:tcW w:type="dxa" w:w="2158"/>
             <w:shd w:fill="D9D9D9" w:val="clear"/>
             <w:tcMar>
               <w:top w:type="dxa" w:w="70"/>
@@ -16131,7 +16170,7 @@
         </w:tc>
         <w:tc>
           <w:tcPr>
-            <w:tcW w:type="dxa" w:w="870"/>
+            <w:tcW w:type="dxa" w:w="830"/>
             <w:shd w:fill="D9D9D9" w:val="clear"/>
             <w:tcMar>
               <w:top w:type="dxa" w:w="70"/>
@@ -16160,7 +16199,7 @@
         </w:tc>
         <w:tc>
           <w:tcPr>
-            <w:tcW w:type="dxa" w:w="5568"/>
+            <w:tcW w:type="dxa" w:w="5312"/>
             <w:shd w:fill="D9D9D9" w:val="clear"/>
             <w:tcMar>
               <w:top w:type="dxa" w:w="70"/>
@@ -16191,7 +16230,7 @@
       <w:tr>
         <w:tc>
           <w:tcPr>
-            <w:tcW w:type="dxa" w:w="2262"/>
+            <w:tcW w:type="dxa" w:w="2158"/>
             <w:tcMar>
               <w:top w:type="dxa" w:w="70"/>
               <w:left w:type="dxa" w:w="110"/>
@@ -16219,7 +16258,7 @@
         </w:tc>
         <w:tc>
           <w:tcPr>
-            <w:tcW w:type="dxa" w:w="870"/>
+            <w:tcW w:type="dxa" w:w="830"/>
             <w:tcMar>
               <w:top w:type="dxa" w:w="70"/>
               <w:left w:type="dxa" w:w="110"/>
@@ -16247,7 +16286,7 @@
         </w:tc>
         <w:tc>
           <w:tcPr>
-            <w:tcW w:type="dxa" w:w="5568"/>
+            <w:tcW w:type="dxa" w:w="5312"/>
             <w:tcMar>
               <w:top w:type="dxa" w:w="70"/>
               <w:left w:type="dxa" w:w="110"/>
@@ -16277,7 +16316,7 @@
       <w:tr>
         <w:tc>
           <w:tcPr>
-            <w:tcW w:type="dxa" w:w="2262"/>
+            <w:tcW w:type="dxa" w:w="2158"/>
             <w:tcMar>
               <w:top w:type="dxa" w:w="70"/>
               <w:left w:type="dxa" w:w="110"/>
@@ -16305,7 +16344,7 @@
         </w:tc>
         <w:tc>
           <w:tcPr>
-            <w:tcW w:type="dxa" w:w="870"/>
+            <w:tcW w:type="dxa" w:w="830"/>
             <w:tcMar>
               <w:top w:type="dxa" w:w="70"/>
               <w:left w:type="dxa" w:w="110"/>
@@ -16333,7 +16372,7 @@
         </w:tc>
         <w:tc>
           <w:tcPr>
-            <w:tcW w:type="dxa" w:w="5568"/>
+            <w:tcW w:type="dxa" w:w="5312"/>
             <w:tcMar>
               <w:top w:type="dxa" w:w="70"/>
               <w:left w:type="dxa" w:w="110"/>
@@ -16363,7 +16402,7 @@
       <w:tr>
         <w:tc>
           <w:tcPr>
-            <w:tcW w:type="dxa" w:w="2262"/>
+            <w:tcW w:type="dxa" w:w="2158"/>
             <w:tcMar>
               <w:top w:type="dxa" w:w="70"/>
               <w:left w:type="dxa" w:w="110"/>
@@ -16391,7 +16430,7 @@
         </w:tc>
         <w:tc>
           <w:tcPr>
-            <w:tcW w:type="dxa" w:w="870"/>
+            <w:tcW w:type="dxa" w:w="830"/>
             <w:tcMar>
               <w:top w:type="dxa" w:w="70"/>
               <w:left w:type="dxa" w:w="110"/>
@@ -16419,7 +16458,7 @@
         </w:tc>
         <w:tc>
           <w:tcPr>
-            <w:tcW w:type="dxa" w:w="5568"/>
+            <w:tcW w:type="dxa" w:w="5312"/>
             <w:tcMar>
               <w:top w:type="dxa" w:w="70"/>
               <w:left w:type="dxa" w:w="110"/>
@@ -16449,7 +16488,7 @@
       <w:tr>
         <w:tc>
           <w:tcPr>
-            <w:tcW w:type="dxa" w:w="2262"/>
+            <w:tcW w:type="dxa" w:w="2158"/>
             <w:tcMar>
               <w:top w:type="dxa" w:w="70"/>
               <w:left w:type="dxa" w:w="110"/>
@@ -16477,7 +16516,7 @@
         </w:tc>
         <w:tc>
           <w:tcPr>
-            <w:tcW w:type="dxa" w:w="870"/>
+            <w:tcW w:type="dxa" w:w="830"/>
             <w:tcMar>
               <w:top w:type="dxa" w:w="70"/>
               <w:left w:type="dxa" w:w="110"/>
@@ -16505,7 +16544,7 @@
         </w:tc>
         <w:tc>
           <w:tcPr>
-            <w:tcW w:type="dxa" w:w="5568"/>
+            <w:tcW w:type="dxa" w:w="5312"/>
             <w:tcMar>
               <w:top w:type="dxa" w:w="70"/>
               <w:left w:type="dxa" w:w="110"/>
@@ -16535,7 +16574,7 @@
       <w:tr>
         <w:tc>
           <w:tcPr>
-            <w:tcW w:type="dxa" w:w="2262"/>
+            <w:tcW w:type="dxa" w:w="2158"/>
             <w:tcMar>
               <w:top w:type="dxa" w:w="70"/>
               <w:left w:type="dxa" w:w="110"/>
@@ -16563,7 +16602,7 @@
         </w:tc>
         <w:tc>
           <w:tcPr>
-            <w:tcW w:type="dxa" w:w="870"/>
+            <w:tcW w:type="dxa" w:w="830"/>
             <w:tcMar>
               <w:top w:type="dxa" w:w="70"/>
               <w:left w:type="dxa" w:w="110"/>
@@ -16591,7 +16630,7 @@
         </w:tc>
         <w:tc>
           <w:tcPr>
-            <w:tcW w:type="dxa" w:w="5568"/>
+            <w:tcW w:type="dxa" w:w="5312"/>
             <w:tcMar>
               <w:top w:type="dxa" w:w="70"/>
               <w:left w:type="dxa" w:w="110"/>
@@ -16621,7 +16660,7 @@
       <w:tr>
         <w:tc>
           <w:tcPr>
-            <w:tcW w:type="dxa" w:w="2262"/>
+            <w:tcW w:type="dxa" w:w="2158"/>
             <w:tcMar>
               <w:top w:type="dxa" w:w="70"/>
               <w:left w:type="dxa" w:w="110"/>
@@ -16649,7 +16688,7 @@
         </w:tc>
         <w:tc>
           <w:tcPr>
-            <w:tcW w:type="dxa" w:w="870"/>
+            <w:tcW w:type="dxa" w:w="830"/>
             <w:tcMar>
               <w:top w:type="dxa" w:w="70"/>
               <w:left w:type="dxa" w:w="110"/>
@@ -16677,7 +16716,7 @@
         </w:tc>
         <w:tc>
           <w:tcPr>
-            <w:tcW w:type="dxa" w:w="5568"/>
+            <w:tcW w:type="dxa" w:w="5312"/>
             <w:tcMar>
               <w:top w:type="dxa" w:w="70"/>
               <w:left w:type="dxa" w:w="110"/>
@@ -16707,7 +16746,7 @@
       <w:tr>
         <w:tc>
           <w:tcPr>
-            <w:tcW w:type="dxa" w:w="2262"/>
+            <w:tcW w:type="dxa" w:w="2158"/>
             <w:tcMar>
               <w:top w:type="dxa" w:w="70"/>
               <w:left w:type="dxa" w:w="110"/>
@@ -16735,7 +16774,7 @@
         </w:tc>
         <w:tc>
           <w:tcPr>
-            <w:tcW w:type="dxa" w:w="870"/>
+            <w:tcW w:type="dxa" w:w="830"/>
             <w:tcMar>
               <w:top w:type="dxa" w:w="70"/>
               <w:left w:type="dxa" w:w="110"/>
@@ -16763,7 +16802,7 @@
         </w:tc>
         <w:tc>
           <w:tcPr>
-            <w:tcW w:type="dxa" w:w="5568"/>
+            <w:tcW w:type="dxa" w:w="5312"/>
             <w:tcMar>
               <w:top w:type="dxa" w:w="70"/>
               <w:left w:type="dxa" w:w="110"/>
@@ -16995,7 +17034,7 @@
     </w:p>
     <w:tbl>
       <w:tblPr>
-        <w:tblW w:type="dxa" w:w="8700"/>
+        <w:tblW w:type="dxa" w:w="8300"/>
         <w:tblBorders>
           <w:top w:val="single" w:color="auto" w:sz="4"/>
           <w:left w:val="single" w:color="auto" w:sz="4"/>
@@ -17006,9 +17045,9 @@
         </w:tblBorders>
       </w:tblPr>
       <w:tblGrid>
-        <w:gridCol w:w="2175"/>
-        <w:gridCol w:w="2610"/>
-        <w:gridCol w:w="3915"/>
+        <w:gridCol w:w="2075"/>
+        <w:gridCol w:w="2490"/>
+        <w:gridCol w:w="3735"/>
       </w:tblGrid>
       <w:tr>
         <w:trPr>
@@ -17016,7 +17055,7 @@
         </w:trPr>
         <w:tc>
           <w:tcPr>
-            <w:tcW w:type="dxa" w:w="2175"/>
+            <w:tcW w:type="dxa" w:w="2075"/>
             <w:shd w:fill="D9D9D9" w:val="clear"/>
             <w:tcMar>
               <w:top w:type="dxa" w:w="70"/>
@@ -17045,7 +17084,7 @@
         </w:tc>
         <w:tc>
           <w:tcPr>
-            <w:tcW w:type="dxa" w:w="2610"/>
+            <w:tcW w:type="dxa" w:w="2490"/>
             <w:shd w:fill="D9D9D9" w:val="clear"/>
             <w:tcMar>
               <w:top w:type="dxa" w:w="70"/>
@@ -17074,7 +17113,7 @@
         </w:tc>
         <w:tc>
           <w:tcPr>
-            <w:tcW w:type="dxa" w:w="3915"/>
+            <w:tcW w:type="dxa" w:w="3735"/>
             <w:shd w:fill="D9D9D9" w:val="clear"/>
             <w:tcMar>
               <w:top w:type="dxa" w:w="70"/>
@@ -17105,7 +17144,7 @@
       <w:tr>
         <w:tc>
           <w:tcPr>
-            <w:tcW w:type="dxa" w:w="2175"/>
+            <w:tcW w:type="dxa" w:w="2075"/>
             <w:tcMar>
               <w:top w:type="dxa" w:w="70"/>
               <w:left w:type="dxa" w:w="110"/>
@@ -17133,7 +17172,7 @@
         </w:tc>
         <w:tc>
           <w:tcPr>
-            <w:tcW w:type="dxa" w:w="2610"/>
+            <w:tcW w:type="dxa" w:w="2490"/>
             <w:tcMar>
               <w:top w:type="dxa" w:w="70"/>
               <w:left w:type="dxa" w:w="110"/>
@@ -17161,7 +17200,7 @@
         </w:tc>
         <w:tc>
           <w:tcPr>
-            <w:tcW w:type="dxa" w:w="3915"/>
+            <w:tcW w:type="dxa" w:w="3735"/>
             <w:tcMar>
               <w:top w:type="dxa" w:w="70"/>
               <w:left w:type="dxa" w:w="110"/>
@@ -17191,7 +17230,7 @@
       <w:tr>
         <w:tc>
           <w:tcPr>
-            <w:tcW w:type="dxa" w:w="2175"/>
+            <w:tcW w:type="dxa" w:w="2075"/>
             <w:tcMar>
               <w:top w:type="dxa" w:w="70"/>
               <w:left w:type="dxa" w:w="110"/>
@@ -17219,7 +17258,7 @@
         </w:tc>
         <w:tc>
           <w:tcPr>
-            <w:tcW w:type="dxa" w:w="2610"/>
+            <w:tcW w:type="dxa" w:w="2490"/>
             <w:tcMar>
               <w:top w:type="dxa" w:w="70"/>
               <w:left w:type="dxa" w:w="110"/>
@@ -17247,7 +17286,7 @@
         </w:tc>
         <w:tc>
           <w:tcPr>
-            <w:tcW w:type="dxa" w:w="3915"/>
+            <w:tcW w:type="dxa" w:w="3735"/>
             <w:tcMar>
               <w:top w:type="dxa" w:w="70"/>
               <w:left w:type="dxa" w:w="110"/>
@@ -17277,7 +17316,7 @@
       <w:tr>
         <w:tc>
           <w:tcPr>
-            <w:tcW w:type="dxa" w:w="2175"/>
+            <w:tcW w:type="dxa" w:w="2075"/>
             <w:tcMar>
               <w:top w:type="dxa" w:w="70"/>
               <w:left w:type="dxa" w:w="110"/>
@@ -17305,7 +17344,7 @@
         </w:tc>
         <w:tc>
           <w:tcPr>
-            <w:tcW w:type="dxa" w:w="2610"/>
+            <w:tcW w:type="dxa" w:w="2490"/>
             <w:tcMar>
               <w:top w:type="dxa" w:w="70"/>
               <w:left w:type="dxa" w:w="110"/>
@@ -17333,7 +17372,7 @@
         </w:tc>
         <w:tc>
           <w:tcPr>
-            <w:tcW w:type="dxa" w:w="3915"/>
+            <w:tcW w:type="dxa" w:w="3735"/>
             <w:tcMar>
               <w:top w:type="dxa" w:w="70"/>
               <w:left w:type="dxa" w:w="110"/>
@@ -17363,7 +17402,7 @@
       <w:tr>
         <w:tc>
           <w:tcPr>
-            <w:tcW w:type="dxa" w:w="2175"/>
+            <w:tcW w:type="dxa" w:w="2075"/>
             <w:tcMar>
               <w:top w:type="dxa" w:w="70"/>
               <w:left w:type="dxa" w:w="110"/>
@@ -17391,7 +17430,7 @@
         </w:tc>
         <w:tc>
           <w:tcPr>
-            <w:tcW w:type="dxa" w:w="2610"/>
+            <w:tcW w:type="dxa" w:w="2490"/>
             <w:tcMar>
               <w:top w:type="dxa" w:w="70"/>
               <w:left w:type="dxa" w:w="110"/>
@@ -17419,7 +17458,7 @@
         </w:tc>
         <w:tc>
           <w:tcPr>
-            <w:tcW w:type="dxa" w:w="3915"/>
+            <w:tcW w:type="dxa" w:w="3735"/>
             <w:tcMar>
               <w:top w:type="dxa" w:w="70"/>
               <w:left w:type="dxa" w:w="110"/>
@@ -17449,7 +17488,7 @@
       <w:tr>
         <w:tc>
           <w:tcPr>
-            <w:tcW w:type="dxa" w:w="2175"/>
+            <w:tcW w:type="dxa" w:w="2075"/>
             <w:tcMar>
               <w:top w:type="dxa" w:w="70"/>
               <w:left w:type="dxa" w:w="110"/>
@@ -17477,7 +17516,7 @@
         </w:tc>
         <w:tc>
           <w:tcPr>
-            <w:tcW w:type="dxa" w:w="2610"/>
+            <w:tcW w:type="dxa" w:w="2490"/>
             <w:tcMar>
               <w:top w:type="dxa" w:w="70"/>
               <w:left w:type="dxa" w:w="110"/>
@@ -17505,7 +17544,7 @@
         </w:tc>
         <w:tc>
           <w:tcPr>
-            <w:tcW w:type="dxa" w:w="3915"/>
+            <w:tcW w:type="dxa" w:w="3735"/>
             <w:tcMar>
               <w:top w:type="dxa" w:w="70"/>
               <w:left w:type="dxa" w:w="110"/>
@@ -17535,7 +17574,7 @@
       <w:tr>
         <w:tc>
           <w:tcPr>
-            <w:tcW w:type="dxa" w:w="2175"/>
+            <w:tcW w:type="dxa" w:w="2075"/>
             <w:tcMar>
               <w:top w:type="dxa" w:w="70"/>
               <w:left w:type="dxa" w:w="110"/>
@@ -17563,7 +17602,7 @@
         </w:tc>
         <w:tc>
           <w:tcPr>
-            <w:tcW w:type="dxa" w:w="2610"/>
+            <w:tcW w:type="dxa" w:w="2490"/>
             <w:tcMar>
               <w:top w:type="dxa" w:w="70"/>
               <w:left w:type="dxa" w:w="110"/>
@@ -17591,7 +17630,7 @@
         </w:tc>
         <w:tc>
           <w:tcPr>
-            <w:tcW w:type="dxa" w:w="3915"/>
+            <w:tcW w:type="dxa" w:w="3735"/>
             <w:tcMar>
               <w:top w:type="dxa" w:w="70"/>
               <w:left w:type="dxa" w:w="110"/>
@@ -17621,7 +17660,7 @@
       <w:tr>
         <w:tc>
           <w:tcPr>
-            <w:tcW w:type="dxa" w:w="2175"/>
+            <w:tcW w:type="dxa" w:w="2075"/>
             <w:tcMar>
               <w:top w:type="dxa" w:w="70"/>
               <w:left w:type="dxa" w:w="110"/>
@@ -17649,7 +17688,7 @@
         </w:tc>
         <w:tc>
           <w:tcPr>
-            <w:tcW w:type="dxa" w:w="2610"/>
+            <w:tcW w:type="dxa" w:w="2490"/>
             <w:tcMar>
               <w:top w:type="dxa" w:w="70"/>
               <w:left w:type="dxa" w:w="110"/>
@@ -17677,7 +17716,7 @@
         </w:tc>
         <w:tc>
           <w:tcPr>
-            <w:tcW w:type="dxa" w:w="3915"/>
+            <w:tcW w:type="dxa" w:w="3735"/>
             <w:tcMar>
               <w:top w:type="dxa" w:w="70"/>
               <w:left w:type="dxa" w:w="110"/>
@@ -17707,7 +17746,7 @@
       <w:tr>
         <w:tc>
           <w:tcPr>
-            <w:tcW w:type="dxa" w:w="2175"/>
+            <w:tcW w:type="dxa" w:w="2075"/>
             <w:tcMar>
               <w:top w:type="dxa" w:w="70"/>
               <w:left w:type="dxa" w:w="110"/>
@@ -17735,7 +17774,7 @@
         </w:tc>
         <w:tc>
           <w:tcPr>
-            <w:tcW w:type="dxa" w:w="2610"/>
+            <w:tcW w:type="dxa" w:w="2490"/>
             <w:tcMar>
               <w:top w:type="dxa" w:w="70"/>
               <w:left w:type="dxa" w:w="110"/>
@@ -17763,7 +17802,7 @@
         </w:tc>
         <w:tc>
           <w:tcPr>
-            <w:tcW w:type="dxa" w:w="3915"/>
+            <w:tcW w:type="dxa" w:w="3735"/>
             <w:tcMar>
               <w:top w:type="dxa" w:w="70"/>
               <w:left w:type="dxa" w:w="110"/>
@@ -17793,7 +17832,7 @@
       <w:tr>
         <w:tc>
           <w:tcPr>
-            <w:tcW w:type="dxa" w:w="2175"/>
+            <w:tcW w:type="dxa" w:w="2075"/>
             <w:tcMar>
               <w:top w:type="dxa" w:w="70"/>
               <w:left w:type="dxa" w:w="110"/>
@@ -17821,7 +17860,7 @@
         </w:tc>
         <w:tc>
           <w:tcPr>
-            <w:tcW w:type="dxa" w:w="2610"/>
+            <w:tcW w:type="dxa" w:w="2490"/>
             <w:tcMar>
               <w:top w:type="dxa" w:w="70"/>
               <w:left w:type="dxa" w:w="110"/>
@@ -17849,7 +17888,7 @@
         </w:tc>
         <w:tc>
           <w:tcPr>
-            <w:tcW w:type="dxa" w:w="3915"/>
+            <w:tcW w:type="dxa" w:w="3735"/>
             <w:tcMar>
               <w:top w:type="dxa" w:w="70"/>
               <w:left w:type="dxa" w:w="110"/>
@@ -18227,7 +18266,7 @@
     </w:p>
     <w:tbl>
       <w:tblPr>
-        <w:tblW w:type="dxa" w:w="8700"/>
+        <w:tblW w:type="dxa" w:w="8300"/>
         <w:tblBorders>
           <w:top w:val="single" w:color="auto" w:sz="4"/>
           <w:left w:val="single" w:color="auto" w:sz="4"/>
@@ -18238,8 +18277,8 @@
         </w:tblBorders>
       </w:tblPr>
       <w:tblGrid>
-        <w:gridCol w:w="2610"/>
-        <w:gridCol w:w="6090"/>
+        <w:gridCol w:w="2490"/>
+        <w:gridCol w:w="5810"/>
       </w:tblGrid>
       <w:tr>
         <w:trPr>
@@ -18247,7 +18286,7 @@
         </w:trPr>
         <w:tc>
           <w:tcPr>
-            <w:tcW w:type="dxa" w:w="2610"/>
+            <w:tcW w:type="dxa" w:w="2490"/>
             <w:shd w:fill="D9D9D9" w:val="clear"/>
             <w:tcMar>
               <w:top w:type="dxa" w:w="70"/>
@@ -18276,7 +18315,7 @@
         </w:tc>
         <w:tc>
           <w:tcPr>
-            <w:tcW w:type="dxa" w:w="6090"/>
+            <w:tcW w:type="dxa" w:w="5810"/>
             <w:shd w:fill="D9D9D9" w:val="clear"/>
             <w:tcMar>
               <w:top w:type="dxa" w:w="70"/>
@@ -18307,7 +18346,7 @@
       <w:tr>
         <w:tc>
           <w:tcPr>
-            <w:tcW w:type="dxa" w:w="2610"/>
+            <w:tcW w:type="dxa" w:w="2490"/>
             <w:tcMar>
               <w:top w:type="dxa" w:w="70"/>
               <w:left w:type="dxa" w:w="110"/>
@@ -18335,7 +18374,7 @@
         </w:tc>
         <w:tc>
           <w:tcPr>
-            <w:tcW w:type="dxa" w:w="6090"/>
+            <w:tcW w:type="dxa" w:w="5810"/>
             <w:tcMar>
               <w:top w:type="dxa" w:w="70"/>
               <w:left w:type="dxa" w:w="110"/>
@@ -18365,7 +18404,7 @@
       <w:tr>
         <w:tc>
           <w:tcPr>
-            <w:tcW w:type="dxa" w:w="2610"/>
+            <w:tcW w:type="dxa" w:w="2490"/>
             <w:tcMar>
               <w:top w:type="dxa" w:w="70"/>
               <w:left w:type="dxa" w:w="110"/>
@@ -18393,7 +18432,7 @@
         </w:tc>
         <w:tc>
           <w:tcPr>
-            <w:tcW w:type="dxa" w:w="6090"/>
+            <w:tcW w:type="dxa" w:w="5810"/>
             <w:tcMar>
               <w:top w:type="dxa" w:w="70"/>
               <w:left w:type="dxa" w:w="110"/>
@@ -18423,7 +18462,7 @@
       <w:tr>
         <w:tc>
           <w:tcPr>
-            <w:tcW w:type="dxa" w:w="2610"/>
+            <w:tcW w:type="dxa" w:w="2490"/>
             <w:tcMar>
               <w:top w:type="dxa" w:w="70"/>
               <w:left w:type="dxa" w:w="110"/>
@@ -18451,7 +18490,7 @@
         </w:tc>
         <w:tc>
           <w:tcPr>
-            <w:tcW w:type="dxa" w:w="6090"/>
+            <w:tcW w:type="dxa" w:w="5810"/>
             <w:tcMar>
               <w:top w:type="dxa" w:w="70"/>
               <w:left w:type="dxa" w:w="110"/>
@@ -18481,7 +18520,7 @@
       <w:tr>
         <w:tc>
           <w:tcPr>
-            <w:tcW w:type="dxa" w:w="2610"/>
+            <w:tcW w:type="dxa" w:w="2490"/>
             <w:tcMar>
               <w:top w:type="dxa" w:w="70"/>
               <w:left w:type="dxa" w:w="110"/>
@@ -18509,7 +18548,7 @@
         </w:tc>
         <w:tc>
           <w:tcPr>
-            <w:tcW w:type="dxa" w:w="6090"/>
+            <w:tcW w:type="dxa" w:w="5810"/>
             <w:tcMar>
               <w:top w:type="dxa" w:w="70"/>
               <w:left w:type="dxa" w:w="110"/>
@@ -18539,7 +18578,7 @@
       <w:tr>
         <w:tc>
           <w:tcPr>
-            <w:tcW w:type="dxa" w:w="2610"/>
+            <w:tcW w:type="dxa" w:w="2490"/>
             <w:tcMar>
               <w:top w:type="dxa" w:w="70"/>
               <w:left w:type="dxa" w:w="110"/>
@@ -18567,7 +18606,7 @@
         </w:tc>
         <w:tc>
           <w:tcPr>
-            <w:tcW w:type="dxa" w:w="6090"/>
+            <w:tcW w:type="dxa" w:w="5810"/>
             <w:tcMar>
               <w:top w:type="dxa" w:w="70"/>
               <w:left w:type="dxa" w:w="110"/>
@@ -18597,7 +18636,7 @@
       <w:tr>
         <w:tc>
           <w:tcPr>
-            <w:tcW w:type="dxa" w:w="2610"/>
+            <w:tcW w:type="dxa" w:w="2490"/>
             <w:tcMar>
               <w:top w:type="dxa" w:w="70"/>
               <w:left w:type="dxa" w:w="110"/>
@@ -18625,7 +18664,7 @@
         </w:tc>
         <w:tc>
           <w:tcPr>
-            <w:tcW w:type="dxa" w:w="6090"/>
+            <w:tcW w:type="dxa" w:w="5810"/>
             <w:tcMar>
               <w:top w:type="dxa" w:w="70"/>
               <w:left w:type="dxa" w:w="110"/>

</xml_diff>

<commit_message>
docs: restart numbering for each list so references begin at 1
Every numbered list shared a single document-wide counter, so the
reference list began at 13 and ran to 32: the objectives list in section
2.1 and the suggestions list in section 9.3 had already consumed 1 to 12.
Each list now uses its own numbering instance and starts at 1.

Found by reading the rendered page rather than the source, where the
numbering is generated and the continuation is not visible.
</commit_message>
<xml_diff>
--- a/docs/ResumeForge_Applied_Software_Project_Report.docx
+++ b/docs/ResumeForge_Applied_Software_Project_Report.docx
@@ -18762,7 +18762,7 @@
         <w:pStyle w:val="ListParagraph"/>
         <w:numPr>
           <w:ilvl w:val="0"/>
-          <w:numId w:val="2"/>
+          <w:numId w:val="4"/>
         </w:numPr>
         <w:spacing w:after="70" w:line="240"/>
         <w:jc w:val="both"/>
@@ -18782,7 +18782,7 @@
         <w:pStyle w:val="ListParagraph"/>
         <w:numPr>
           <w:ilvl w:val="0"/>
-          <w:numId w:val="2"/>
+          <w:numId w:val="4"/>
         </w:numPr>
         <w:spacing w:after="70" w:line="240"/>
         <w:jc w:val="both"/>
@@ -18802,7 +18802,7 @@
         <w:pStyle w:val="ListParagraph"/>
         <w:numPr>
           <w:ilvl w:val="0"/>
-          <w:numId w:val="2"/>
+          <w:numId w:val="4"/>
         </w:numPr>
         <w:spacing w:after="70" w:line="240"/>
         <w:jc w:val="both"/>
@@ -18822,7 +18822,7 @@
         <w:pStyle w:val="ListParagraph"/>
         <w:numPr>
           <w:ilvl w:val="0"/>
-          <w:numId w:val="2"/>
+          <w:numId w:val="4"/>
         </w:numPr>
         <w:spacing w:after="70" w:line="240"/>
         <w:jc w:val="both"/>
@@ -18842,7 +18842,7 @@
         <w:pStyle w:val="ListParagraph"/>
         <w:numPr>
           <w:ilvl w:val="0"/>
-          <w:numId w:val="2"/>
+          <w:numId w:val="4"/>
         </w:numPr>
         <w:spacing w:after="70" w:line="240"/>
         <w:jc w:val="both"/>
@@ -18862,7 +18862,7 @@
         <w:pStyle w:val="ListParagraph"/>
         <w:numPr>
           <w:ilvl w:val="0"/>
-          <w:numId w:val="2"/>
+          <w:numId w:val="4"/>
         </w:numPr>
         <w:spacing w:after="70" w:line="240"/>
         <w:jc w:val="both"/>
@@ -18905,7 +18905,7 @@
         <w:pStyle w:val="ListParagraph"/>
         <w:numPr>
           <w:ilvl w:val="0"/>
-          <w:numId w:val="2"/>
+          <w:numId w:val="5"/>
         </w:numPr>
         <w:spacing w:after="110" w:line="240"/>
         <w:jc w:val="left"/>
@@ -18925,7 +18925,7 @@
         <w:pStyle w:val="ListParagraph"/>
         <w:numPr>
           <w:ilvl w:val="0"/>
-          <w:numId w:val="2"/>
+          <w:numId w:val="5"/>
         </w:numPr>
         <w:spacing w:after="110" w:line="240"/>
         <w:jc w:val="left"/>
@@ -18945,7 +18945,7 @@
         <w:pStyle w:val="ListParagraph"/>
         <w:numPr>
           <w:ilvl w:val="0"/>
-          <w:numId w:val="2"/>
+          <w:numId w:val="5"/>
         </w:numPr>
         <w:spacing w:after="110" w:line="240"/>
         <w:jc w:val="left"/>
@@ -18965,7 +18965,7 @@
         <w:pStyle w:val="ListParagraph"/>
         <w:numPr>
           <w:ilvl w:val="0"/>
-          <w:numId w:val="2"/>
+          <w:numId w:val="5"/>
         </w:numPr>
         <w:spacing w:after="110" w:line="240"/>
         <w:jc w:val="left"/>
@@ -18985,7 +18985,7 @@
         <w:pStyle w:val="ListParagraph"/>
         <w:numPr>
           <w:ilvl w:val="0"/>
-          <w:numId w:val="2"/>
+          <w:numId w:val="5"/>
         </w:numPr>
         <w:spacing w:after="110" w:line="240"/>
         <w:jc w:val="left"/>
@@ -19005,7 +19005,7 @@
         <w:pStyle w:val="ListParagraph"/>
         <w:numPr>
           <w:ilvl w:val="0"/>
-          <w:numId w:val="2"/>
+          <w:numId w:val="5"/>
         </w:numPr>
         <w:spacing w:after="110" w:line="240"/>
         <w:jc w:val="left"/>
@@ -19025,7 +19025,7 @@
         <w:pStyle w:val="ListParagraph"/>
         <w:numPr>
           <w:ilvl w:val="0"/>
-          <w:numId w:val="2"/>
+          <w:numId w:val="5"/>
         </w:numPr>
         <w:spacing w:after="110" w:line="240"/>
         <w:jc w:val="left"/>
@@ -19045,7 +19045,7 @@
         <w:pStyle w:val="ListParagraph"/>
         <w:numPr>
           <w:ilvl w:val="0"/>
-          <w:numId w:val="2"/>
+          <w:numId w:val="5"/>
         </w:numPr>
         <w:spacing w:after="110" w:line="240"/>
         <w:jc w:val="left"/>
@@ -19065,7 +19065,7 @@
         <w:pStyle w:val="ListParagraph"/>
         <w:numPr>
           <w:ilvl w:val="0"/>
-          <w:numId w:val="2"/>
+          <w:numId w:val="5"/>
         </w:numPr>
         <w:spacing w:after="110" w:line="240"/>
         <w:jc w:val="left"/>
@@ -19085,7 +19085,7 @@
         <w:pStyle w:val="ListParagraph"/>
         <w:numPr>
           <w:ilvl w:val="0"/>
-          <w:numId w:val="2"/>
+          <w:numId w:val="5"/>
         </w:numPr>
         <w:spacing w:after="110" w:line="240"/>
         <w:jc w:val="left"/>
@@ -19105,7 +19105,7 @@
         <w:pStyle w:val="ListParagraph"/>
         <w:numPr>
           <w:ilvl w:val="0"/>
-          <w:numId w:val="2"/>
+          <w:numId w:val="5"/>
         </w:numPr>
         <w:spacing w:after="110" w:line="240"/>
         <w:jc w:val="left"/>
@@ -19125,7 +19125,7 @@
         <w:pStyle w:val="ListParagraph"/>
         <w:numPr>
           <w:ilvl w:val="0"/>
-          <w:numId w:val="2"/>
+          <w:numId w:val="5"/>
         </w:numPr>
         <w:spacing w:after="110" w:line="240"/>
         <w:jc w:val="left"/>
@@ -19145,7 +19145,7 @@
         <w:pStyle w:val="ListParagraph"/>
         <w:numPr>
           <w:ilvl w:val="0"/>
-          <w:numId w:val="2"/>
+          <w:numId w:val="5"/>
         </w:numPr>
         <w:spacing w:after="110" w:line="240"/>
         <w:jc w:val="left"/>
@@ -19165,7 +19165,7 @@
         <w:pStyle w:val="ListParagraph"/>
         <w:numPr>
           <w:ilvl w:val="0"/>
-          <w:numId w:val="2"/>
+          <w:numId w:val="5"/>
         </w:numPr>
         <w:spacing w:after="110" w:line="240"/>
         <w:jc w:val="left"/>
@@ -19185,7 +19185,7 @@
         <w:pStyle w:val="ListParagraph"/>
         <w:numPr>
           <w:ilvl w:val="0"/>
-          <w:numId w:val="2"/>
+          <w:numId w:val="5"/>
         </w:numPr>
         <w:spacing w:after="110" w:line="240"/>
         <w:jc w:val="left"/>
@@ -19205,7 +19205,7 @@
         <w:pStyle w:val="ListParagraph"/>
         <w:numPr>
           <w:ilvl w:val="0"/>
-          <w:numId w:val="2"/>
+          <w:numId w:val="5"/>
         </w:numPr>
         <w:spacing w:after="110" w:line="240"/>
         <w:jc w:val="left"/>
@@ -19225,7 +19225,7 @@
         <w:pStyle w:val="ListParagraph"/>
         <w:numPr>
           <w:ilvl w:val="0"/>
-          <w:numId w:val="2"/>
+          <w:numId w:val="5"/>
         </w:numPr>
         <w:spacing w:after="110" w:line="240"/>
         <w:jc w:val="left"/>
@@ -19245,7 +19245,7 @@
         <w:pStyle w:val="ListParagraph"/>
         <w:numPr>
           <w:ilvl w:val="0"/>
-          <w:numId w:val="2"/>
+          <w:numId w:val="5"/>
         </w:numPr>
         <w:spacing w:after="110" w:line="240"/>
         <w:jc w:val="left"/>
@@ -19265,7 +19265,7 @@
         <w:pStyle w:val="ListParagraph"/>
         <w:numPr>
           <w:ilvl w:val="0"/>
-          <w:numId w:val="2"/>
+          <w:numId w:val="5"/>
         </w:numPr>
         <w:spacing w:after="110" w:line="240"/>
         <w:jc w:val="left"/>
@@ -19285,7 +19285,7 @@
         <w:pStyle w:val="ListParagraph"/>
         <w:numPr>
           <w:ilvl w:val="0"/>
-          <w:numId w:val="2"/>
+          <w:numId w:val="5"/>
         </w:numPr>
         <w:spacing w:after="110" w:line="240"/>
         <w:jc w:val="left"/>
@@ -19545,6 +19545,18 @@
   </w:num>
   <w:num w:numId="3">
     <w:abstractNumId w:val="2"/>
+    <w:lvlOverride w:ilvl="0">
+      <w:startOverride w:val="1"/>
+    </w:lvlOverride>
+  </w:num>
+  <w:num w:numId="4">
+    <w:abstractNumId w:val="3"/>
+    <w:lvlOverride w:ilvl="0">
+      <w:startOverride w:val="1"/>
+    </w:lvlOverride>
+  </w:num>
+  <w:num w:numId="5">
+    <w:abstractNumId w:val="3"/>
     <w:lvlOverride w:ilvl="0">
       <w:startOverride w:val="1"/>
     </w:lvlOverride>

</xml_diff>

<commit_message>
docs: remove the blank page before References
Table 9.01 fills page 46 exactly, so the explicit page break that followed
it pushed past an already-complete page and produced an empty page 47.
The References heading now carries pageBreakBefore instead, which starts a
new page only when the current one is not already fresh.

References therefore moves from page 48 to 47 and the document is 48 pages
rather than 49; nothing before it is affected, since the blank page sat
immediately ahead of that chapter. The contents entry is updated to match.

Verified against the exported PDF: every other chapter, table and figure
page number in the contents and the two lists is correct as it stands.
</commit_message>
<xml_diff>
--- a/docs/ResumeForge_Applied_Software_Project_Report.docx
+++ b/docs/ResumeForge_Applied_Software_Project_Report.docx
@@ -18878,13 +18878,9 @@
       </w:r>
     </w:p>
     <w:p>
-      <w:r>
-        <w:br w:type="page"/>
-      </w:r>
-    </w:p>
-    <w:p>
       <w:pPr>
         <w:pStyle w:val="Heading1"/>
+        <w:pageBreakBefore/>
         <w:spacing w:after="220" w:before="360" w:line="360"/>
         <w:jc w:val="center"/>
       </w:pPr>

</xml_diff>

<commit_message>
docs: remove em dashes and reduce AI-writing patterns
Applied the criteria from Wikipedia's Signs of AI writing, keeping the
formal academic register: that guidance treats neutral, plain prose as
correct for technical and reference writing, so no personality or first
person has been introduced.

All 110 em dashes and the single en dash are gone. Replacements follow
the order of preference in the guidance: a new sentence where the
following clause stands alone, a comma for a tight aside, a colon for a
definition or a cited document title, and parentheses where the aside
carries its own commas and commas would have made the sentence ambiguous.

The repeated 'rather than' construction, which appeared 49 times and is
listed as a negative-parallelism tell, is now split between 'rather than'
and 'instead of'.

Word count is unchanged at 10,479, so nothing was cut in the process.
</commit_message>
<xml_diff>
--- a/docs/ResumeForge_Applied_Software_Project_Report.docx
+++ b/docs/ResumeForge_Applied_Software_Project_Report.docx
@@ -3313,7 +3313,7 @@
           <w:sz w:val="24"/>
           <w:szCs w:val="24"/>
         </w:rPr>
-        <w:t xml:space="preserve">ResumeForge is an event-driven backend system that adapts a candidate’s master resume to a specific job description using a large language model, and then scores the adapted document for the keyword coverage that applicant tracking systems measure. The problem it addresses is a practical one: most job applications are filtered by software before a person reads them, and that software matches on vocabulary rather than on substance, so a well-qualified candidate is routinely rejected for using different words from the posting.</w:t>
+        <w:t xml:space="preserve">ResumeForge is an event-driven backend system that adapts a candidate’s master resume to a specific job description using a large language model, and then scores the adapted document for the keyword coverage that applicant tracking systems measure. The problem it addresses is a practical one: most job applications are filtered by software before a person reads them, and that software matches on vocabulary instead of on substance, so a well-qualified candidate is routinely rejected for using different words from the posting.</w:t>
       </w:r>
     </w:p>
     <w:p>
@@ -3358,7 +3358,7 @@
           <w:sz w:val="24"/>
           <w:szCs w:val="24"/>
         </w:rPr>
-        <w:t xml:space="preserve">The wider applicability is that the pattern demonstrated here — treating a slow, non-deterministic external model as an unreliable asynchronous dependency behind a durable queue, with schema validation on its output — generalises to any system integrating generative AI into a transactional application, which is now a common requirement across recruitment technology, document processing, customer support and healthcare administration.</w:t>
+        <w:t xml:space="preserve">The wider applicability is that the pattern demonstrated here (treating a slow, non-deterministic external model as an unreliable asynchronous dependency behind a durable queue, with schema validation on its output) generalises to any system integrating generative AI into a transactional application, which is now a common requirement across recruitment technology, document processing, customer support and healthcare administration.</w:t>
       </w:r>
     </w:p>
     <w:p>
@@ -3514,7 +3514,7 @@
           <w:sz w:val="24"/>
           <w:szCs w:val="24"/>
         </w:rPr>
-        <w:t xml:space="preserve">Guarantee that a candidate can access only their own data, and prove that guarantee with automated tests rather than asserting it.</w:t>
+        <w:t xml:space="preserve">Guarantee that a candidate can access only their own data, and prove that guarantee with automated tests instead of asserting it.</w:t>
       </w:r>
     </w:p>
     <w:p>
@@ -3582,7 +3582,7 @@
           <w:sz w:val="24"/>
           <w:szCs w:val="24"/>
         </w:rPr>
-        <w:t xml:space="preserve">Automating the rewrite addresses the labour, and scoring the result addresses the guesswork. Because the score is computed in code from an explicit formula rather than asked of the model, it is reproducible and explainable — a candidate can be told that their keyword coverage is weak while their section completeness is fine, and can act on that.</w:t>
+        <w:t xml:space="preserve">Automating the rewrite addresses the labour, and scoring the result addresses the guesswork. Because the score is computed in code from an explicit formula rather than asked of the model, it is reproducible and explainable. A candidate can be told that their keyword coverage is weak while their section completeness is fine, and can act on that.</w:t>
       </w:r>
     </w:p>
     <w:p>
@@ -3615,7 +3615,7 @@
           <w:sz w:val="24"/>
           <w:szCs w:val="24"/>
         </w:rPr>
-        <w:t xml:space="preserve">The system is organised as three services within a single Maven reactor. The division follows the runtime characteristics of the work rather than a domain boundary: one service handles fast, synchronous, transactional HTTP traffic, and a second handles slow, retryable work against an unreliable external dependency.</w:t>
+        <w:t xml:space="preserve">The system is organised as three services within a single Maven reactor. The division follows the runtime characteristics of the work instead of a domain boundary: one service handles fast, synchronous, transactional HTTP traffic, and a second handles slow, retryable work against an unreliable external dependency.</w:t>
       </w:r>
     </w:p>
     <w:p>
@@ -3837,7 +3837,7 @@
           <w:sz w:val="24"/>
           <w:szCs w:val="24"/>
         </w:rPr>
-        <w:t xml:space="preserve">A record is created in PENDING at the moment the request is accepted. The worker moves it to PROCESSING when it begins, and to COMPLETED once the model output has passed validation and the score has been written. If the model call fails or returns content that cannot be validated, the record moves to FAILED rather than remaining PENDING indefinitely — the distinction matters because a client polling the record must be able to tell "still working" from "did not succeed". A FAILED record can be resubmitted through the retry endpoint, which resets it to PENDING and republishes the event. Retry deliberately rejects records in any other state so that a completed result cannot be silently overwritten.</w:t>
+        <w:t xml:space="preserve">A record is created in PENDING at the moment the request is accepted. The worker moves it to PROCESSING when it begins, and to COMPLETED once the model output has passed validation and the score has been written. If the model call fails or returns content that cannot be validated, the record moves to FAILED instead of remaining PENDING indefinitely. The distinction matters because a client polling the record must be able to tell "still working" from "did not succeed". A FAILED record can be resubmitted through the retry endpoint, which resets it to PENDING and republishes the event. Retry deliberately rejects records in any other state so that a completed result cannot be silently overwritten.</w:t>
       </w:r>
     </w:p>
     <w:p>
@@ -3875,7 +3875,7 @@
           <w:sz w:val="24"/>
           <w:szCs w:val="24"/>
         </w:rPr>
-        <w:t xml:space="preserve">The requirements below were derived from the problem statement in Section 2 and refined during development as constraints emerged — in particular the discovery that model latency made a synchronous design untenable, which turned an implementation detail into the non-functional requirement NFR-01.</w:t>
+        <w:t xml:space="preserve">The requirements below were derived from the problem statement in Section 2 and refined during development as constraints emerged, in particular the discovery that model latency made a synchronous design untenable, which turned an implementation detail into the non-functional requirement NFR-01.</w:t>
       </w:r>
     </w:p>
     <w:p>
@@ -5552,7 +5552,7 @@
                 <w:sz w:val="22"/>
                 <w:szCs w:val="22"/>
               </w:rPr>
-              <w:t xml:space="preserve">An accepted tailoring request must survive a worker crash and be reprocessed rather than lost.</w:t>
+              <w:t xml:space="preserve">An accepted tailoring request must survive a worker crash and be reprocessed instead of lost.</w:t>
             </w:r>
           </w:p>
         </w:tc>
@@ -5696,7 +5696,7 @@
                 <w:sz w:val="22"/>
                 <w:szCs w:val="22"/>
               </w:rPr>
-              <w:t xml:space="preserve">Security — authentication</w:t>
+              <w:t xml:space="preserve">Security, authentication</w:t>
             </w:r>
           </w:p>
         </w:tc>
@@ -5782,7 +5782,7 @@
                 <w:sz w:val="22"/>
                 <w:szCs w:val="22"/>
               </w:rPr>
-              <w:t xml:space="preserve">Security — authorisation</w:t>
+              <w:t xml:space="preserve">Security, authorisation</w:t>
             </w:r>
           </w:p>
         </w:tc>
@@ -5868,7 +5868,7 @@
                 <w:sz w:val="22"/>
                 <w:szCs w:val="22"/>
               </w:rPr>
-              <w:t xml:space="preserve">Security — credentials</w:t>
+              <w:t xml:space="preserve">Security, credentials</w:t>
             </w:r>
           </w:p>
         </w:tc>
@@ -6452,7 +6452,7 @@
           <w:sz w:val="24"/>
           <w:szCs w:val="24"/>
         </w:rPr>
-        <w:t xml:space="preserve">Actor: Job Seeker. Precondition: authenticated. Main flow: the user submits resume content; the system verifies that the target user identifier matches the authenticated principal, replaces the stored sections and returns the saved representation. Alternative flow: where no resume exists one is created, so the caller does not need to distinguish create from update. Exception flow: a request naming another user is refused with 403 before any write; a section beyond the length limit is refused with 400. This path is guarded by optimistic locking, so a save against a stale version fails rather than overwriting a concurrent edit.</w:t>
+        <w:t xml:space="preserve">Actor: Job Seeker. Precondition: authenticated. Main flow: the user submits resume content; the system verifies that the target user identifier matches the authenticated principal, replaces the stored sections and returns the saved representation. Alternative flow: where no resume exists one is created, so the caller does not need to distinguish create from update. Exception flow: a request naming another user is refused with 403 before any write; a section beyond the length limit is refused with 400. This path is guarded by optimistic locking, so a save against a stale version fails instead of overwriting a concurrent edit.</w:t>
       </w:r>
     </w:p>
     <w:p>
@@ -6485,7 +6485,7 @@
           <w:sz w:val="24"/>
           <w:szCs w:val="24"/>
         </w:rPr>
-        <w:t xml:space="preserve">Actor: Job Seeker. Precondition: a tailored resume in COMPLETED state. Main flow: the user retrieves the tailored resume with its ATS score breakdown, edits individual sections directly, or asks the model for a revision through the chat endpoint. Exception flow: every one of these operations authorises on the resume identifier, so a user supplying an identifier they do not own receives 403 — including the chat endpoint, which is discussed in Section 4.2 because it was the one place this check was originally missing.</w:t>
+        <w:t xml:space="preserve">Actor: Job Seeker. Precondition: a tailored resume in COMPLETED state. Main flow: the user retrieves the tailored resume with its ATS score breakdown, edits individual sections directly, or asks the model for a revision through the chat endpoint. Exception flow: every one of these operations authorises on the resume identifier, so a user supplying an identifier they do not own receives 403, including the chat endpoint, which is discussed in Section 4.2 because it was the one place this check was originally missing.</w:t>
       </w:r>
     </w:p>
     <w:p>
@@ -7836,7 +7836,7 @@
                 <w:sz w:val="22"/>
                 <w:szCs w:val="22"/>
               </w:rPr>
-              <w:t xml:space="preserve">Document generation implemented but not wired — no object storage provisioned</w:t>
+              <w:t xml:space="preserve">Document generation implemented but not wired, no object storage provisioned</w:t>
             </w:r>
           </w:p>
         </w:tc>
@@ -9931,7 +9931,7 @@
           <w:sz w:val="24"/>
           <w:szCs w:val="24"/>
         </w:rPr>
-        <w:t xml:space="preserve">Two design decisions in this model are worth drawing out. First, MasterResume carries a version field mapped with @Version, which enables optimistic locking; a resume can be edited by the user while simultaneously being read by a tailoring job, and a write against a stale version fails rather than silently discarding a concurrent edit. Second, both section collections are composition rather than association — a section has no meaning independent of its parent resume, is created and deleted with it, and is therefore mapped with cascade and orphan removal.</w:t>
+        <w:t xml:space="preserve">Two design decisions in this model are worth drawing out. First, MasterResume carries a version field mapped with @Version, which enables optimistic locking; a resume can be edited by the user while simultaneously being read by a tailoring job, and a write against a stale version fails rather than silently discarding a concurrent edit. Second, both section collections are composition rather than association. A section has no meaning independent of its parent resume, is created and deleted with it, and is therefore mapped with cascade and orphan removal.</w:t>
       </w:r>
     </w:p>
     <w:p>
@@ -9946,7 +9946,7 @@
           <w:sz w:val="24"/>
           <w:szCs w:val="24"/>
         </w:rPr>
-        <w:t xml:space="preserve">The relationship between TailoredResume and ATSScoreResult is one-to-one because a score describes exactly one tailored document and has no independent identity. Modelling it as a separate entity rather than as columns on the tailored resume keeps the scoring concern separable, so a future change to the scoring algorithm can add columns without widening the primary table.</w:t>
+        <w:t xml:space="preserve">The relationship between TailoredResume and ATSScoreResult is one-to-one because a score describes exactly one tailored document and has no independent identity. Modelling it as a separate entity instead of as columns on the tailored resume keeps the scoring concern separable, so a future change to the scoring algorithm can add columns without widening the primary table.</w:t>
       </w:r>
     </w:p>
     <w:p>
@@ -10090,7 +10090,7 @@
           <w:sz w:val="24"/>
           <w:szCs w:val="24"/>
         </w:rPr>
-        <w:t xml:space="preserve">The placement of assertOwnership in the service rather than in a filter or a controller is a deliberate design decision and the most important one in this diagram. A servlet filter can only inspect the URL and the token; it cannot determine whether the opaque UUID in the path belongs to the caller without loading the resource, which is the service’s job. Placing the check in the controller would work, but it would mean that any future caller of the same service method — a scheduled task, a second controller, a message handler — would bypass it silently. Enforcing it at the service boundary makes the check unavoidable: there is no path to the data that does not pass through it.</w:t>
+        <w:t xml:space="preserve">The placement of assertOwnership in the service instead of in a filter or a controller is a deliberate design decision and the most important one in this diagram. A servlet filter can only inspect the URL and the token; it cannot determine whether the opaque UUID in the path belongs to the caller without loading the resource, which is the service’s job. Placing the check in the controller would work, but it would mean that any future caller of the same service method (a scheduled task, a second controller, a message handler) would bypass it silently. Enforcing it at the service boundary makes the check unavoidable: there is no path to the data that does not pass through it.</w:t>
       </w:r>
     </w:p>
     <w:p>
@@ -10143,7 +10143,7 @@
           <w:sz w:val="24"/>
           <w:szCs w:val="24"/>
         </w:rPr>
-        <w:t xml:space="preserve">JwtAuthFilter — a OncePerRequestFilter that extracts and verifies the bearer token and populates the security context with the user identifier as the principal.</w:t>
+        <w:t xml:space="preserve">JwtAuthFilter: a OncePerRequestFilter that extracts and verifies the bearer token and populates the security context with the user identifier as the principal.</w:t>
       </w:r>
     </w:p>
     <w:p>
@@ -10163,7 +10163,7 @@
           <w:sz w:val="24"/>
           <w:szCs w:val="24"/>
         </w:rPr>
-        <w:t xml:space="preserve">RateLimitFilter — a sliding-window limiter keyed per client and per protected path, holding request timestamps in a bounded deque.</w:t>
+        <w:t xml:space="preserve">RateLimitFilter: a sliding-window limiter keyed per client and per protected path, holding request timestamps in a bounded deque.</w:t>
       </w:r>
     </w:p>
     <w:p>
@@ -10183,7 +10183,7 @@
           <w:sz w:val="24"/>
           <w:szCs w:val="24"/>
         </w:rPr>
-        <w:t xml:space="preserve">TailoringProducer — wraps KafkaTemplate and publishes the tailoring event, isolating the rest of the service from the messaging API.</w:t>
+        <w:t xml:space="preserve">TailoringProducer: wraps KafkaTemplate and publishes the tailoring event, isolating the rest of the service from the messaging API.</w:t>
       </w:r>
     </w:p>
     <w:p>
@@ -10203,7 +10203,7 @@
           <w:sz w:val="24"/>
           <w:szCs w:val="24"/>
         </w:rPr>
-        <w:t xml:space="preserve">InputSanitizer — enforces size caps and screens for prompt-injection patterns before any user text reaches a prompt.</w:t>
+        <w:t xml:space="preserve">InputSanitizer: enforces size caps and screens for prompt-injection patterns before any user text reaches a prompt.</w:t>
       </w:r>
     </w:p>
     <w:p>
@@ -10223,7 +10223,7 @@
           <w:sz w:val="24"/>
           <w:szCs w:val="24"/>
         </w:rPr>
-        <w:t xml:space="preserve">TailoringGuardrailValidator — validates model output against the expected section schema before it is persisted.</w:t>
+        <w:t xml:space="preserve">TailoringGuardrailValidator: validates model output against the expected section schema before it is persisted.</w:t>
       </w:r>
     </w:p>
     <w:p>
@@ -10243,7 +10243,7 @@
           <w:sz w:val="24"/>
           <w:szCs w:val="24"/>
         </w:rPr>
-        <w:t xml:space="preserve">IdempotencyService — records processed event identifiers in Redis under a bounded time-to-live.</w:t>
+        <w:t xml:space="preserve">IdempotencyService: records processed event identifiers in Redis under a bounded time-to-live.</w:t>
       </w:r>
     </w:p>
     <w:p>
@@ -10263,7 +10263,7 @@
           <w:sz w:val="24"/>
           <w:szCs w:val="24"/>
         </w:rPr>
-        <w:t xml:space="preserve">GlobalExceptionHandler — a @RestControllerAdvice translating exceptions into consistent JSON responses carrying a correlation identifier.</w:t>
+        <w:t xml:space="preserve">GlobalExceptionHandler: a @RestControllerAdvice translating exceptions into consistent JSON responses carrying a correlation identifier.</w:t>
       </w:r>
     </w:p>
     <w:p>
@@ -10622,7 +10622,7 @@
                 <w:sz w:val="22"/>
                 <w:szCs w:val="22"/>
               </w:rPr>
-              <w:t xml:space="preserve">Producer–Consumer</w:t>
+              <w:t xml:space="preserve">Producer-Consumer</w:t>
             </w:r>
           </w:p>
         </w:tc>
@@ -10736,7 +10736,7 @@
                 <w:sz w:val="22"/>
                 <w:szCs w:val="22"/>
               </w:rPr>
-              <w:t xml:space="preserve">The Spring Security filter chain — RateLimitFilter then JwtAuthFilter</w:t>
+              <w:t xml:space="preserve">The Spring Security filter chain, RateLimitFilter then JwtAuthFilter</w:t>
             </w:r>
           </w:p>
         </w:tc>
@@ -11140,7 +11140,7 @@
           <w:sz w:val="24"/>
           <w:szCs w:val="24"/>
         </w:rPr>
-        <w:t xml:space="preserve">Two patterns that were considered and not used are worth recording. A transactional outbox would remove the dual write described in Section 9.3, but it adds a table and a relay process, and the retry endpoint already provides a manual recovery path for the failure it guards against. A Strategy for the scoring algorithm was rejected because there is only one scoring implementation; introducing an interface for a single implementor would add indirection without adding capability.</w:t>
+        <w:t xml:space="preserve">Two patterns that were considered and rejected are worth recording. A transactional outbox would remove the dual write described in Section 9.3, but it adds a table and a relay process, and the retry endpoint already provides a manual recovery path for the failure it guards against. A Strategy for the scoring algorithm was rejected because there is only one scoring implementation; introducing an interface for a single implementor would add indirection without adding capability.</w:t>
       </w:r>
     </w:p>
     <w:p>
@@ -11178,7 +11178,7 @@
           <w:sz w:val="24"/>
           <w:szCs w:val="24"/>
         </w:rPr>
-        <w:t xml:space="preserve">The schema is owned by Flyway migrations V1 to V8 and is validated against the entity mapping at application startup, so a divergence between code and schema fails fast rather than silently corrupting data. Hibernate is configured with ddl-auto set to validate; it never alters the schema.</w:t>
+        <w:t xml:space="preserve">The schema is owned by Flyway migrations V1 to V8 and is validated against the entity mapping at application startup, so a divergence between code and schema fails fast instead of silently corrupting data. Hibernate is configured with ddl-auto set to validate; it never alters the schema.</w:t>
       </w:r>
     </w:p>
     <w:p>
@@ -11249,7 +11249,7 @@
           <w:sz w:val="24"/>
           <w:szCs w:val="24"/>
         </w:rPr>
-        <w:t xml:space="preserve">id — uuid, Primary Key</w:t>
+        <w:t xml:space="preserve">id, uuid, Primary Key</w:t>
       </w:r>
     </w:p>
     <w:p>
@@ -11269,7 +11269,7 @@
           <w:sz w:val="24"/>
           <w:szCs w:val="24"/>
         </w:rPr>
-        <w:t xml:space="preserve">email — varchar, unique</w:t>
+        <w:t xml:space="preserve">email, varchar, unique</w:t>
       </w:r>
     </w:p>
     <w:p>
@@ -11289,7 +11289,7 @@
           <w:sz w:val="24"/>
           <w:szCs w:val="24"/>
         </w:rPr>
-        <w:t xml:space="preserve">password_hash — varchar, BCrypt output</w:t>
+        <w:t xml:space="preserve">password_hash, varchar, BCrypt output</w:t>
       </w:r>
     </w:p>
     <w:p>
@@ -11309,7 +11309,7 @@
           <w:sz w:val="24"/>
           <w:szCs w:val="24"/>
         </w:rPr>
-        <w:t xml:space="preserve">name — varchar</w:t>
+        <w:t xml:space="preserve">name, varchar</w:t>
       </w:r>
     </w:p>
     <w:p>
@@ -11329,7 +11329,7 @@
           <w:sz w:val="24"/>
           <w:szCs w:val="24"/>
         </w:rPr>
-        <w:t xml:space="preserve">plan — varchar</w:t>
+        <w:t xml:space="preserve">plan, varchar</w:t>
       </w:r>
     </w:p>
     <w:p>
@@ -11349,7 +11349,7 @@
           <w:sz w:val="24"/>
           <w:szCs w:val="24"/>
         </w:rPr>
-        <w:t xml:space="preserve">email_verified — boolean</w:t>
+        <w:t xml:space="preserve">email_verified, boolean</w:t>
       </w:r>
     </w:p>
     <w:p>
@@ -11369,7 +11369,7 @@
           <w:sz w:val="24"/>
           <w:szCs w:val="24"/>
         </w:rPr>
-        <w:t xml:space="preserve">created_at — timestamp</w:t>
+        <w:t xml:space="preserve">created_at, timestamp</w:t>
       </w:r>
     </w:p>
     <w:p>
@@ -11407,7 +11407,7 @@
           <w:sz w:val="24"/>
           <w:szCs w:val="24"/>
         </w:rPr>
-        <w:t xml:space="preserve">id — uuid, Primary Key</w:t>
+        <w:t xml:space="preserve">id, uuid, Primary Key</w:t>
       </w:r>
     </w:p>
     <w:p>
@@ -11427,7 +11427,7 @@
           <w:sz w:val="24"/>
           <w:szCs w:val="24"/>
         </w:rPr>
-        <w:t xml:space="preserve">user_id — uuid, Foreign Key to users(id)</w:t>
+        <w:t xml:space="preserve">user_id, uuid, Foreign Key to users(id)</w:t>
       </w:r>
     </w:p>
     <w:p>
@@ -11447,7 +11447,7 @@
           <w:sz w:val="24"/>
           <w:szCs w:val="24"/>
         </w:rPr>
-        <w:t xml:space="preserve">title — varchar</w:t>
+        <w:t xml:space="preserve">title, varchar</w:t>
       </w:r>
     </w:p>
     <w:p>
@@ -11467,7 +11467,7 @@
           <w:sz w:val="24"/>
           <w:szCs w:val="24"/>
         </w:rPr>
-        <w:t xml:space="preserve">summary — text</w:t>
+        <w:t xml:space="preserve">summary, text</w:t>
       </w:r>
     </w:p>
     <w:p>
@@ -11487,7 +11487,7 @@
           <w:sz w:val="24"/>
           <w:szCs w:val="24"/>
         </w:rPr>
-        <w:t xml:space="preserve">version — integer, optimistic lock counter</w:t>
+        <w:t xml:space="preserve">version, integer, optimistic lock counter</w:t>
       </w:r>
     </w:p>
     <w:p>
@@ -11507,7 +11507,7 @@
           <w:sz w:val="24"/>
           <w:szCs w:val="24"/>
         </w:rPr>
-        <w:t xml:space="preserve">created_at, updated_at — timestamp</w:t>
+        <w:t xml:space="preserve">created_at, updated_at, timestamp</w:t>
       </w:r>
     </w:p>
     <w:p>
@@ -11545,7 +11545,7 @@
           <w:sz w:val="24"/>
           <w:szCs w:val="24"/>
         </w:rPr>
-        <w:t xml:space="preserve">id — uuid, Primary Key</w:t>
+        <w:t xml:space="preserve">id, uuid, Primary Key</w:t>
       </w:r>
     </w:p>
     <w:p>
@@ -11565,7 +11565,7 @@
           <w:sz w:val="24"/>
           <w:szCs w:val="24"/>
         </w:rPr>
-        <w:t xml:space="preserve">master_resume_id — uuid, Foreign Key to master_resumes(id), NOT NULL</w:t>
+        <w:t xml:space="preserve">master_resume_id, uuid, Foreign Key to master_resumes(id), NOT NULL</w:t>
       </w:r>
     </w:p>
     <w:p>
@@ -11585,7 +11585,7 @@
           <w:sz w:val="24"/>
           <w:szCs w:val="24"/>
         </w:rPr>
-        <w:t xml:space="preserve">section_type — enum (SUMMARY, EXPERIENCE, EDUCATION, SKILLS, PROJECTS, OTHER)</w:t>
+        <w:t xml:space="preserve">section_type, enum (SUMMARY, EXPERIENCE, EDUCATION, SKILLS, PROJECTS, OTHER)</w:t>
       </w:r>
     </w:p>
     <w:p>
@@ -11605,7 +11605,7 @@
           <w:sz w:val="24"/>
           <w:szCs w:val="24"/>
         </w:rPr>
-        <w:t xml:space="preserve">content — text</w:t>
+        <w:t xml:space="preserve">content, text</w:t>
       </w:r>
     </w:p>
     <w:p>
@@ -11625,7 +11625,7 @@
           <w:sz w:val="24"/>
           <w:szCs w:val="24"/>
         </w:rPr>
-        <w:t xml:space="preserve">position — integer, ordering within the resume</w:t>
+        <w:t xml:space="preserve">position, integer, ordering within the resume</w:t>
       </w:r>
     </w:p>
     <w:p>
@@ -11663,7 +11663,7 @@
           <w:sz w:val="24"/>
           <w:szCs w:val="24"/>
         </w:rPr>
-        <w:t xml:space="preserve">id — uuid, Primary Key</w:t>
+        <w:t xml:space="preserve">id, uuid, Primary Key</w:t>
       </w:r>
     </w:p>
     <w:p>
@@ -11683,7 +11683,7 @@
           <w:sz w:val="24"/>
           <w:szCs w:val="24"/>
         </w:rPr>
-        <w:t xml:space="preserve">user_id — uuid, Foreign Key to users(id)</w:t>
+        <w:t xml:space="preserve">user_id, uuid, Foreign Key to users(id)</w:t>
       </w:r>
     </w:p>
     <w:p>
@@ -11703,7 +11703,7 @@
           <w:sz w:val="24"/>
           <w:szCs w:val="24"/>
         </w:rPr>
-        <w:t xml:space="preserve">company_name, job_title — varchar</w:t>
+        <w:t xml:space="preserve">company_name, job_title, varchar</w:t>
       </w:r>
     </w:p>
     <w:p>
@@ -11723,7 +11723,7 @@
           <w:sz w:val="24"/>
           <w:szCs w:val="24"/>
         </w:rPr>
-        <w:t xml:space="preserve">description — text</w:t>
+        <w:t xml:space="preserve">description, text</w:t>
       </w:r>
     </w:p>
     <w:p>
@@ -11743,7 +11743,7 @@
           <w:sz w:val="24"/>
           <w:szCs w:val="24"/>
         </w:rPr>
-        <w:t xml:space="preserve">required_skills — text</w:t>
+        <w:t xml:space="preserve">required_skills, text</w:t>
       </w:r>
     </w:p>
     <w:p>
@@ -11781,7 +11781,7 @@
           <w:sz w:val="24"/>
           <w:szCs w:val="24"/>
         </w:rPr>
-        <w:t xml:space="preserve">id — uuid, Primary Key</w:t>
+        <w:t xml:space="preserve">id, uuid, Primary Key</w:t>
       </w:r>
     </w:p>
     <w:p>
@@ -11801,7 +11801,7 @@
           <w:sz w:val="24"/>
           <w:szCs w:val="24"/>
         </w:rPr>
-        <w:t xml:space="preserve">master_resume_id — uuid, Foreign Key to master_resumes(id)</w:t>
+        <w:t xml:space="preserve">master_resume_id, uuid, Foreign Key to master_resumes(id)</w:t>
       </w:r>
     </w:p>
     <w:p>
@@ -11821,7 +11821,7 @@
           <w:sz w:val="24"/>
           <w:szCs w:val="24"/>
         </w:rPr>
-        <w:t xml:space="preserve">job_description_id — uuid, Foreign Key to job_descriptions(id)</w:t>
+        <w:t xml:space="preserve">job_description_id, uuid, Foreign Key to job_descriptions(id)</w:t>
       </w:r>
     </w:p>
     <w:p>
@@ -11841,7 +11841,7 @@
           <w:sz w:val="24"/>
           <w:szCs w:val="24"/>
         </w:rPr>
-        <w:t xml:space="preserve">status — enum (PENDING, PROCESSING, COMPLETED, FAILED)</w:t>
+        <w:t xml:space="preserve">status, enum (PENDING, PROCESSING, COMPLETED, FAILED)</w:t>
       </w:r>
     </w:p>
     <w:p>
@@ -11861,7 +11861,7 @@
           <w:sz w:val="24"/>
           <w:szCs w:val="24"/>
         </w:rPr>
-        <w:t xml:space="preserve">pdf_path — varchar, nullable</w:t>
+        <w:t xml:space="preserve">pdf_path, varchar, nullable</w:t>
       </w:r>
     </w:p>
     <w:p>
@@ -11881,7 +11881,7 @@
           <w:sz w:val="24"/>
           <w:szCs w:val="24"/>
         </w:rPr>
-        <w:t xml:space="preserve">version — integer</w:t>
+        <w:t xml:space="preserve">version, integer</w:t>
       </w:r>
     </w:p>
     <w:p>
@@ -11901,7 +11901,7 @@
           <w:sz w:val="24"/>
           <w:szCs w:val="24"/>
         </w:rPr>
-        <w:t xml:space="preserve">created_at — timestamp</w:t>
+        <w:t xml:space="preserve">created_at, timestamp</w:t>
       </w:r>
     </w:p>
     <w:p>
@@ -11939,7 +11939,7 @@
           <w:sz w:val="24"/>
           <w:szCs w:val="24"/>
         </w:rPr>
-        <w:t xml:space="preserve">id — uuid, Primary Key</w:t>
+        <w:t xml:space="preserve">id, uuid, Primary Key</w:t>
       </w:r>
     </w:p>
     <w:p>
@@ -11959,7 +11959,7 @@
           <w:sz w:val="24"/>
           <w:szCs w:val="24"/>
         </w:rPr>
-        <w:t xml:space="preserve">tailored_resume_id — uuid, Foreign Key to tailored_resumes(id)</w:t>
+        <w:t xml:space="preserve">tailored_resume_id, uuid, Foreign Key to tailored_resumes(id)</w:t>
       </w:r>
     </w:p>
     <w:p>
@@ -11979,7 +11979,7 @@
           <w:sz w:val="24"/>
           <w:szCs w:val="24"/>
         </w:rPr>
-        <w:t xml:space="preserve">section_type — enum</w:t>
+        <w:t xml:space="preserve">section_type, enum</w:t>
       </w:r>
     </w:p>
     <w:p>
@@ -11999,7 +11999,7 @@
           <w:sz w:val="24"/>
           <w:szCs w:val="24"/>
         </w:rPr>
-        <w:t xml:space="preserve">content — text</w:t>
+        <w:t xml:space="preserve">content, text</w:t>
       </w:r>
     </w:p>
     <w:p>
@@ -12037,7 +12037,7 @@
           <w:sz w:val="24"/>
           <w:szCs w:val="24"/>
         </w:rPr>
-        <w:t xml:space="preserve">id — uuid, Primary Key</w:t>
+        <w:t xml:space="preserve">id, uuid, Primary Key</w:t>
       </w:r>
     </w:p>
     <w:p>
@@ -12057,7 +12057,7 @@
           <w:sz w:val="24"/>
           <w:szCs w:val="24"/>
         </w:rPr>
-        <w:t xml:space="preserve">tailored_resume_id — uuid, Foreign Key to tailored_resumes(id), unique</w:t>
+        <w:t xml:space="preserve">tailored_resume_id, uuid, Foreign Key to tailored_resumes(id), unique</w:t>
       </w:r>
     </w:p>
     <w:p>
@@ -12077,7 +12077,7 @@
           <w:sz w:val="24"/>
           <w:szCs w:val="24"/>
         </w:rPr>
-        <w:t xml:space="preserve">total_score — integer</w:t>
+        <w:t xml:space="preserve">total_score, integer</w:t>
       </w:r>
     </w:p>
     <w:p>
@@ -12097,7 +12097,7 @@
           <w:sz w:val="24"/>
           <w:szCs w:val="24"/>
         </w:rPr>
-        <w:t xml:space="preserve">keyword_score, section_score, action_verb_score — integer</w:t>
+        <w:t xml:space="preserve">keyword_score, section_score, action_verb_score, integer</w:t>
       </w:r>
     </w:p>
     <w:p>
@@ -13780,7 +13780,7 @@
           <w:sz w:val="24"/>
           <w:szCs w:val="24"/>
         </w:rPr>
-        <w:t xml:space="preserve">Every table uses a UUID primary key rather than an auto-incrementing integer. The reason is that identifiers appear in URLs. A sequential integer key would let any authenticated user enumerate the identifier space and discover how many records exist and whether a particular one does — information disclosure even where the authorisation check correctly refuses access. A UUID is not itself an access control, and the ownership check remains the actual protection, but it removes enumeration as a reconnaissance technique.</w:t>
+        <w:t xml:space="preserve">Every table uses a UUID primary key instead of an auto-incrementing integer. The reason is that identifiers appear in URLs. A sequential integer key would let any authenticated user enumerate the identifier space and discover how many records exist and whether a particular one does, information disclosure even where the authorisation check correctly refuses access. A UUID is not itself an access control, and the ownership check remains the actual protection, but it removes enumeration as a reconnaissance technique.</w:t>
       </w:r>
     </w:p>
     <w:p>
@@ -13846,7 +13846,7 @@
           <w:sz w:val="24"/>
           <w:szCs w:val="24"/>
         </w:rPr>
-        <w:t xml:space="preserve">The upsert path clears the section collection and adds a replacement. The association was mapped with cascade = ALL but without orphanRemoval. For an inverse collection — one mapped with mappedBy, where the foreign key is owned by the child — Hibernate performs no collection-level DML. Without orphanRemoval the cleared children are never marked for deletion, and because the child’s foreign key column is NOT NULL, Hibernate cannot detach them either. The observable effect was that every save appended a duplicate section row rather than replacing the existing one, on the most frequently exercised write path in the application.</w:t>
+        <w:t xml:space="preserve">The upsert path clears the section collection and adds a replacement. The association was mapped with cascade = ALL but without orphanRemoval. For an inverse collection (one mapped with mappedBy, where the foreign key is owned by the child) Hibernate performs no collection-level DML. Without orphanRemoval the cleared children are never marked for deletion, and because the child’s foreign key column is NOT NULL, Hibernate cannot detach them either. The observable effect was that every save appended a duplicate section row rather than replacing the existing one, on the most frequently exercised write path in the application.</w:t>
       </w:r>
     </w:p>
     <w:p>
@@ -13861,7 +13861,7 @@
           <w:sz w:val="24"/>
           <w:szCs w:val="24"/>
         </w:rPr>
-        <w:t xml:space="preserve">The defect is worth recording because of how it presented. No exception was raised, no test failed, and the API returned a success response every time. It was found by reasoning about cascade semantics rather than by observing a failure. The correction was to add orphanRemoval to the association, and the general lesson taken from it is that a successful API response is not evidence of a correct write.</w:t>
+        <w:t xml:space="preserve">The defect is worth recording because of how it presented. No exception was raised, no test failed, and the API returned a success response every time. It was found by reasoning about cascade semantics instead of by observing a failure. The correction was to add orphanRemoval to the association, and the general lesson taken from it is that a successful API response is not evidence of a correct write.</w:t>
       </w:r>
     </w:p>
     <w:p>
@@ -13894,7 +13894,7 @@
           <w:sz w:val="24"/>
           <w:szCs w:val="24"/>
         </w:rPr>
-        <w:t xml:space="preserve">Loading a resume and subsequently reading its sections issues one query for the parent and one for each child collection — the N+1 select problem. Three repository methods declare an explicit LEFT JOIN FETCH so that a parent and its collection are retrieved in a single statement. The measured effect of this is presented as a benchmark in Section 6.</w:t>
+        <w:t xml:space="preserve">Loading a resume and subsequently reading its sections issues one query for the parent and one for each child collection. The N+1 select problem. Three repository methods declare an explicit LEFT JOIN FETCH so that a parent and its collection are retrieved in a single statement. The measured effect of this is presented as a benchmark in Section 6.</w:t>
       </w:r>
     </w:p>
     <w:p>
@@ -14018,7 +14018,7 @@
           <w:sz w:val="24"/>
           <w:szCs w:val="24"/>
         </w:rPr>
-        <w:t xml:space="preserve">companyName — string, required</w:t>
+        <w:t xml:space="preserve">companyName, string, required</w:t>
       </w:r>
     </w:p>
     <w:p>
@@ -14038,7 +14038,7 @@
           <w:sz w:val="24"/>
           <w:szCs w:val="24"/>
         </w:rPr>
-        <w:t xml:space="preserve">jobTitle — string, required</w:t>
+        <w:t xml:space="preserve">jobTitle, string, required</w:t>
       </w:r>
     </w:p>
     <w:p>
@@ -14058,7 +14058,7 @@
           <w:sz w:val="24"/>
           <w:szCs w:val="24"/>
         </w:rPr>
-        <w:t xml:space="preserve">jobDescription — string, required, the full posting text</w:t>
+        <w:t xml:space="preserve">jobDescription, string, required, the full posting text</w:t>
       </w:r>
     </w:p>
     <w:p>
@@ -14078,7 +14078,7 @@
           <w:sz w:val="24"/>
           <w:szCs w:val="24"/>
         </w:rPr>
-        <w:t xml:space="preserve">requiredSkills — string, optional</w:t>
+        <w:t xml:space="preserve">requiredSkills, string, optional</w:t>
       </w:r>
     </w:p>
     <w:p>
@@ -14318,7 +14318,7 @@
           <w:sz w:val="24"/>
           <w:szCs w:val="24"/>
         </w:rPr>
-        <w:t xml:space="preserve">The obvious alternative is to ask the model to score its own output. This was rejected. A model-generated score is not reproducible — the same input can yield different numbers — and it cannot be explained to a user beyond restating it. Worse, the component that produced the text would also be grading it. Computing the score in code from an explicit weighted formula makes it deterministic, explainable and independent of the generator.</w:t>
+        <w:t xml:space="preserve">The obvious alternative is to ask the model to score its own output. This was rejected. A model-generated score is not reproducible, the same input can yield different numbers, and it cannot be explained to a user beyond restating it. Worse, the component that produced the text would also be grading it. Computing the score in code from an explicit weighted formula makes it deterministic, explainable and independent of the generator.</w:t>
       </w:r>
     </w:p>
     <w:p>
@@ -14384,7 +14384,7 @@
           <w:sz w:val="24"/>
           <w:szCs w:val="24"/>
         </w:rPr>
-        <w:t xml:space="preserve">The listing path — retrieving all of a user’s master resumes together with their sections — exhibited the N+1 select problem. The derived query findByUserId returns the parent rows, and each subsequent access to a resume’s section collection triggers an additional select. For a user with N resumes the operation costs N+1 round trips to the database, and the cost grows linearly with the size of the user’s data.</w:t>
+        <w:t xml:space="preserve">The listing path, retrieving all of a user’s master resumes together with their sections, exhibited the N+1 select problem. The derived query findByUserId returns the parent rows, and each subsequent access to a resume’s section collection triggers an additional select. For a user with N resumes the operation costs N+1 round trips to the database, and the cost grows linearly with the size of the user’s data.</w:t>
       </w:r>
     </w:p>
     <w:p>
@@ -14943,7 +14943,7 @@
           <w:sz w:val="24"/>
           <w:szCs w:val="24"/>
         </w:rPr>
-        <w:t xml:space="preserve">The statement count falls from 31 to 1 — one query for the parents plus one per resume, collapsed into a single fetch-joined query. Median latency falls from 3.487 ms to 1.126 ms, an improvement of 67.7%. The proportional gain would be substantially larger against a networked database, because each eliminated statement there costs a network round trip rather than an in-process call.</w:t>
+        <w:t xml:space="preserve">The statement count falls from 31 to 1, one query for the parents plus one per resume, collapsed into a single fetch-joined query. Median latency falls from 3.487 ms to 1.126 ms, an improvement of 67.7%. The proportional gain would be substantially larger against a networked database, because each eliminated statement there costs a network round trip instead of an in-process call.</w:t>
       </w:r>
     </w:p>
     <w:p>
@@ -15155,7 +15155,7 @@
           <w:sz w:val="24"/>
           <w:szCs w:val="24"/>
         </w:rPr>
-        <w:t xml:space="preserve">The two services scale on different signals, which is the operational payoff of having separated them. The resume service scales on request rate and CPU. The worker service scales on Kafka consumer lag — the count of unprocessed events — because its load is a queue depth rather than a request rate. A backlog of tailoring jobs adds worker instances without adding API instances that are not needed.</w:t>
+        <w:t xml:space="preserve">The two services scale on different signals, which is the operational payoff of having separated them. The resume service scales on request rate and CPU. The worker service scales on Kafka consumer lag, the count of unprocessed events, because its load is a queue depth instead of a request rate. A backlog of tailoring jobs adds worker instances without adding API instances that are not needed.</w:t>
       </w:r>
     </w:p>
     <w:p>
@@ -15241,7 +15241,7 @@
           <w:sz w:val="24"/>
           <w:szCs w:val="24"/>
         </w:rPr>
-        <w:t xml:space="preserve">ALB security group — inbound 443 from 0.0.0.0/0. This is the only rule in the system that admits the public internet.</w:t>
+        <w:t xml:space="preserve">ALB security group, inbound 443 from 0.0.0.0/0. This is the only rule in the system that admits the public internet.</w:t>
       </w:r>
     </w:p>
     <w:p>
@@ -15261,7 +15261,7 @@
           <w:sz w:val="24"/>
           <w:szCs w:val="24"/>
         </w:rPr>
-        <w:t xml:space="preserve">Application security group — inbound 8081 and 8082 from the ALB security group only, referenced by group rather than by IP address so the rule stays correct as instances are replaced.</w:t>
+        <w:t xml:space="preserve">Application security group, inbound 8081 and 8082 from the ALB security group only, referenced by group rather than by IP address so the rule stays correct as instances are replaced.</w:t>
       </w:r>
     </w:p>
     <w:p>
@@ -15281,7 +15281,7 @@
           <w:sz w:val="24"/>
           <w:szCs w:val="24"/>
         </w:rPr>
-        <w:t xml:space="preserve">Database security group — inbound 5432 from the application security group only.</w:t>
+        <w:t xml:space="preserve">Database security group, inbound 5432 from the application security group only.</w:t>
       </w:r>
     </w:p>
     <w:p>
@@ -15301,7 +15301,7 @@
           <w:sz w:val="24"/>
           <w:szCs w:val="24"/>
         </w:rPr>
-        <w:t xml:space="preserve">Cache security group — inbound 6379 from the application security group only.</w:t>
+        <w:t xml:space="preserve">Cache security group, inbound 6379 from the application security group only.</w:t>
       </w:r>
     </w:p>
     <w:p>
@@ -15316,7 +15316,7 @@
           <w:sz w:val="24"/>
           <w:szCs w:val="24"/>
         </w:rPr>
-        <w:t xml:space="preserve">Referencing security groups rather than address ranges is what makes this durable under auto-scaling: instances come and go with new private addresses, and no rule needs to change.</w:t>
+        <w:t xml:space="preserve">Referencing security groups instead of address ranges is what makes this durable under auto-scaling: instances come and go with new private addresses, and no rule needs to change.</w:t>
       </w:r>
     </w:p>
     <w:p>
@@ -15349,7 +15349,7 @@
           <w:sz w:val="24"/>
           <w:szCs w:val="24"/>
         </w:rPr>
-        <w:t xml:space="preserve">PostgreSQL runs on RDS in a Multi-AZ configuration, which maintains a synchronous standby in a second availability zone and fails over automatically. RDS also provides automated backups and point-in-time recovery, which for a system holding a user’s only copy of their resume is a requirement rather than an enhancement. Flyway migrations run at application startup, so a deployment applies pending migrations before serving traffic.</w:t>
+        <w:t xml:space="preserve">PostgreSQL runs on RDS in a Multi-AZ configuration, which keeps a synchronous standby in a second availability zone and fails over automatically. RDS also provides automated backups and point-in-time recovery, which for a system holding a user’s only copy of their resume is a requirement rather than an enhancement. Flyway migrations run at application startup, so a deployment applies pending migrations before serving traffic.</w:t>
       </w:r>
     </w:p>
     <w:p>
@@ -15379,7 +15379,7 @@
           <w:sz w:val="24"/>
           <w:szCs w:val="24"/>
         </w:rPr>
-        <w:t xml:space="preserve">Kafka is provided by Amazon MSK rather than self-managed brokers, because broker operation — rebalancing, patching, storage management — is substantial work that is not part of this project’s subject matter.</w:t>
+        <w:t xml:space="preserve">Kafka is provided by Amazon MSK instead of self-managed brokers, because broker operation (rebalancing, patching, storage management) is substantial work that is not part of this project’s subject matter.</w:t>
       </w:r>
     </w:p>
     <w:p>
@@ -15460,7 +15460,7 @@
           <w:sz w:val="24"/>
           <w:szCs w:val="24"/>
         </w:rPr>
-        <w:t xml:space="preserve">The limit on worker scaling is the topic partition count, since Kafka assigns each partition to at most one consumer in a group — adding consumers beyond the partition count adds no throughput. Partitioning by tailored-resume identifier would distribute load evenly while keeping all events for one job ordered. Beyond that the constraint becomes the model endpoint itself, which is a fixed external capacity and the reason the input size caps in Section 6 exist: they bound the cost and latency of a single request so that one oversized document cannot consume the capacity of many normal ones.</w:t>
+        <w:t xml:space="preserve">The limit on worker scaling is the topic partition count, since Kafka assigns each partition to at most one consumer in a group, adding consumers beyond the partition count adds no throughput. Partitioning by tailored-resume identifier would distribute load evenly while keeping all events for one job ordered. Beyond that the constraint becomes the model endpoint itself, which is a fixed external capacity and the reason the input size caps in Section 6 exist: they bound the cost and latency of a single request so that one oversized document cannot consume the capacity of many normal ones.</w:t>
       </w:r>
     </w:p>
     <w:p>
@@ -15475,7 +15475,7 @@
           <w:sz w:val="24"/>
           <w:szCs w:val="24"/>
         </w:rPr>
-        <w:t xml:space="preserve">The database is the component least able to scale horizontally. Reads dominate this workload, so the first step would be a read replica serving the listing endpoints, with writes continuing to the primary. The fetch-joined queries described in Section 6.5 matter here too: an endpoint issuing one query rather than N postpones the point at which the connection pool becomes the bottleneck, which is why that optimisation is a scaling measure and not only a latency measure.</w:t>
+        <w:t xml:space="preserve">The database is the component least able to scale horizontally. Reads dominate this workload, so the first step would be a read replica serving the listing endpoints, with writes continuing to the primary. The fetch-joined queries described in Section 6.5 matter here too: an endpoint issuing one query instead of N postpones the point at which the connection pool becomes the bottleneck, which is why that optimisation is a scaling measure and not only a latency measure.</w:t>
       </w:r>
     </w:p>
     <w:p>
@@ -15609,7 +15609,7 @@
           <w:sz w:val="24"/>
           <w:szCs w:val="24"/>
         </w:rPr>
-        <w:t xml:space="preserve">It was chosen because the concerns in this project — declarative transactions, a security filter chain, JPA persistence and Kafka integration — are all first-class in the Spring ecosystem rather than assembled from unrelated libraries. Static typing also carries weight on a system with seven interrelated entities: a rename or a signature change surfaces at compile time rather than in production.</w:t>
+        <w:t xml:space="preserve">It was chosen because the concerns in this project (declarative transactions, a security filter chain, JPA persistence and Kafka integration) are all first-class in the Spring ecosystem instead of assembled from unrelated libraries. Static typing also carries weight on a system with seven interrelated entities: a rename or a signature change surfaces at compile time instead of in production.</w:t>
       </w:r>
     </w:p>
     <w:p>
@@ -15672,7 +15672,7 @@
           <w:sz w:val="24"/>
           <w:szCs w:val="24"/>
         </w:rPr>
-        <w:t xml:space="preserve">It was chosen for durability. An in-memory queue loses accepted work when the process restarts. With Kafka, an accepted tailoring request survives a worker crash: the consumer resumes from its last committed offset and reprocesses. It also decouples the two services in time, so the worker can be slower than the API without applying back-pressure to callers, and the offset model makes at-least-once delivery explicit — which is why the idempotency layer described in Section 6 exists.</w:t>
+        <w:t xml:space="preserve">It was chosen for durability. An in-memory queue loses accepted work when the process restarts. With Kafka, an accepted tailoring request survives a worker crash: the consumer resumes from its last committed offset and reprocesses. It also decouples the two services in time, so the worker can be slower than the API without applying back-pressure to callers, and the offset model makes at-least-once delivery explicit. Which is why the idempotency layer described in Section 6 exists.</w:t>
       </w:r>
     </w:p>
     <w:p>
@@ -15798,7 +15798,7 @@
           <w:sz w:val="24"/>
           <w:szCs w:val="24"/>
         </w:rPr>
-        <w:t xml:space="preserve">It is used here for consumer idempotency. When the worker begins processing an event it records a key derived from the tailored-resume identifier with a 24-hour expiry, and checks that key before doing work. The requirement is a fast, keyed existence check on short-lived data — Redis is exactly shaped for that, and modelling it as a database table would mean a durable write and a cleanup job for data that is worthless after a day.</w:t>
+        <w:t xml:space="preserve">It is used here for consumer idempotency. When the worker begins processing an event it records a key derived from the tailored-resume identifier with a 24-hour expiry, and checks that key before doing work. The requirement is a fast, keyed existence check on short-lived data, Redis is exactly shaped for that, and modelling it as a database table would mean a durable write and a cleanup job for data that is worthless after a day.</w:t>
       </w:r>
     </w:p>
     <w:p>
@@ -15876,7 +15876,7 @@
           <w:sz w:val="24"/>
           <w:szCs w:val="24"/>
         </w:rPr>
-        <w:t xml:space="preserve">Generative models are now in production across recruitment technology, customer support triage, code assistance and document summarisation. The engineering lesson from this project generalises beyond the specific model: a language model is a slow, non-deterministic network dependency producing untrusted output, and it should be integrated with the same defensive posture as any third-party service — timeouts, retries, asynchronous execution, and schema validation of everything it returns.</w:t>
+        <w:t xml:space="preserve">Generative models are now in production across recruitment technology, customer support triage, code assistance and document summarisation. The engineering lesson from this project generalises beyond the specific model: a language model is a slow, non-deterministic network dependency producing untrusted output, and it should be integrated with the same defensive posture as any third-party service, timeouts, retries, asynchronous execution, and schema validation of everything it returns.</w:t>
       </w:r>
     </w:p>
     <w:p>
@@ -15924,7 +15924,7 @@
           <w:sz w:val="24"/>
           <w:szCs w:val="24"/>
         </w:rPr>
-        <w:t xml:space="preserve">Statelessness was the deciding factor: any instance behind the load balancer can verify a token independently, so instances can be added and removed freely. The implementation uses jjwt 0.12.6 with the verifyWith and parseSignedClaims API, which requires a valid signature at parse time and so rejects unsigned tokens and the alg:none substitution attack at the library level rather than in application code.</w:t>
+        <w:t xml:space="preserve">Statelessness was the deciding factor: any instance behind the load balancer can verify a token independently, so instances can be added and removed freely. The implementation uses jjwt 0.12.6 with the verifyWith and parseSignedClaims API, which requires a valid signature at parse time and so rejects unsigned tokens and the alg:none substitution attack at the library level instead of in application code.</w:t>
       </w:r>
     </w:p>
     <w:p>
@@ -15987,7 +15987,7 @@
           <w:sz w:val="24"/>
           <w:szCs w:val="24"/>
         </w:rPr>
-        <w:t xml:space="preserve">Containerisation is close to universal in modern deployment and is the packaging format underlying Kubernetes, ECS and most managed platforms — including Render, where this project is currently deployed.</w:t>
+        <w:t xml:space="preserve">Containerisation is close to universal in modern deployment and is the packaging format underlying Kubernetes, ECS and most managed platforms, including Render, where this project is currently deployed.</w:t>
       </w:r>
     </w:p>
     <w:p>
@@ -16020,7 +16020,7 @@
           <w:sz w:val="24"/>
           <w:szCs w:val="24"/>
         </w:rPr>
-        <w:t xml:space="preserve">Logback is configured to emit JSON rather than plain lines, so every log event is a structured record that a collector can index by field instead of by regular expression. Requests carry a correlation identifier through the SLF4J mapped diagnostic context, which means the log lines belonging to one request can be retrieved together even when several are interleaved — and because an unhandled exception returns that identifier to the client and nothing else, a user reporting a failure supplies exactly the key an operator needs.</w:t>
+        <w:t xml:space="preserve">Logback is configured to emit JSON rather than plain lines, so every log event is a structured record that a collector can index by field instead of by regular expression. Requests carry a correlation identifier through the SLF4J mapped diagnostic context, which means the log lines belonging to one request can be retrieved together even when several are interleaved. And because an unhandled exception returns that identifier to the client and nothing else, a user reporting a failure supplies exactly the key an operator needs.</w:t>
       </w:r>
     </w:p>
     <w:p>
@@ -16050,7 +16050,7 @@
           <w:sz w:val="24"/>
           <w:szCs w:val="24"/>
         </w:rPr>
-        <w:t xml:space="preserve">This area is where a defect was found late. The worker service exposed only its health endpoint, so the Prometheus scrape returned 404 for it and three of the four dashboard panels could never populate — the dashboard looked correct while displaying nothing. Monitoring that is never checked against a real signal will fail silently, and the only reliable defence is to verify the scrape target rather than the dashboard definition.</w:t>
+        <w:t xml:space="preserve">This area is where a defect was found late. The worker service exposed only its health endpoint, so the Prometheus scrape returned 404 for it and three of the four dashboard panels could never populate. The dashboard looked correct while displaying nothing. Monitoring that is never checked against a real signal will fail silently, and the only reliable defence is to verify the scrape target instead of the dashboard definition.</w:t>
       </w:r>
     </w:p>
     <w:p>
@@ -16083,7 +16083,7 @@
           <w:sz w:val="24"/>
           <w:szCs w:val="24"/>
         </w:rPr>
-        <w:t xml:space="preserve">JUnit 5 provides the test framework, Mockito supplies the test doubles, Spring Boot Test provides context and MockMvc support for driving the HTTP layer without a running server, and JaCoCo measures coverage by instrumenting bytecode during the test run. The choice to measure coverage rather than estimate it is deliberate: an earlier revision of this project documentation asserted a coverage figure that had never been measured and was wrong by an order of magnitude.</w:t>
+        <w:t xml:space="preserve">JUnit 5 provides the test framework, Mockito supplies the test doubles, Spring Boot Test provides context and MockMvc support for driving the HTTP layer without a running server, and JaCoCo measures coverage by instrumenting bytecode during the test run. The choice to measure coverage instead of estimate it is deliberate: an earlier revision of this project documentation asserted a coverage figure that had never been measured and was wrong by an order of magnitude.</w:t>
       </w:r>
     </w:p>
     <w:p>
@@ -16098,7 +16098,7 @@
           <w:sz w:val="24"/>
           <w:szCs w:val="24"/>
         </w:rPr>
-        <w:t xml:space="preserve">The suite comprises 94 tests, all passing, and is verified reproducibly — the committed tree is exported with git archive into a clean directory and built there, so the result reflects the repository rather than a developer machine.</w:t>
+        <w:t xml:space="preserve">The suite comprises 94 tests, all passing, and is verified reproducibly. The committed tree is exported with git archive into a clean directory and built there, so the result reflects the repository rather than a developer machine.</w:t>
       </w:r>
     </w:p>
     <w:p>
@@ -16874,7 +16874,7 @@
           <w:sz w:val="24"/>
           <w:szCs w:val="24"/>
         </w:rPr>
-        <w:t xml:space="preserve">The suite is shaped as a pyramid. The widest layer is fast unit tests with no Spring context at all — the scoring and keyword components, and ResumeServiceTest, which exercises the service against mocked collaborators and runs in milliseconds. Above that sit slice tests: AuthServiceTest uses @DataJpaTest, which starts the persistence layer against an in-memory database but not the web tier. At the top, and deliberately the smallest layer, are full-context tests: BOLATest and RateLimitFilterTest start the whole application and drive it over HTTP through MockMvc, because the properties they verify — that a filter chain refuses a cross-tenant request, that a rate limiter returns 429 — are properties of the assembled system and cannot be observed in a unit test.</w:t>
+        <w:t xml:space="preserve">The suite is shaped as a pyramid. The widest layer is fast unit tests with no Spring context at all. The scoring and keyword components, and ResumeServiceTest, which exercises the service against mocked collaborators and runs in milliseconds. Above that sit slice tests: AuthServiceTest uses @DataJpaTest, which starts the persistence layer against an in-memory database but not the web tier. At the top, and deliberately the smallest layer, are full-context tests: BOLATest and RateLimitFilterTest start the whole application and drive it over HTTP through MockMvc, because the properties they verify (that a filter chain refuses a cross-tenant request, that a rate limiter returns 429) are properties of the assembled system and cannot be observed in a unit test.</w:t>
       </w:r>
     </w:p>
     <w:p>
@@ -16904,7 +16904,7 @@
           <w:sz w:val="24"/>
           <w:szCs w:val="24"/>
         </w:rPr>
-        <w:t xml:space="preserve">Two things are deliberately not covered. There is no end-to-end test spanning Kafka and the worker, because it would require a broker, a database and a model endpoint, and would be slow and non-deterministic — the correct tool is Testcontainers, which is recorded as future work. And there is no test that exercises the Flyway migration chain, since the test profile builds its schema from the entity mapping instead; the migrations are consequently verified only at application startup, which Section 9.3 records as a limitation.</w:t>
+        <w:t xml:space="preserve">Two things are deliberately not covered. There is no end-to-end test spanning Kafka and the worker, because it would require a broker, a database and a model endpoint, and would be slow and non-deterministic. The correct tool is Testcontainers, which is recorded as future work. And there is no test that exercises the Flyway migration chain, since the test profile builds its schema from the entity mapping instead; the migrations are consequently verified only at application startup, which Section 9.3 records as a limitation.</w:t>
       </w:r>
     </w:p>
     <w:p>
@@ -16957,7 +16957,7 @@
           <w:sz w:val="24"/>
           <w:szCs w:val="24"/>
         </w:rPr>
-        <w:t xml:space="preserve">Stub — an object configured to return prepared answers, supplying the state a scenario needs. The repositories are stubbed with when(...).thenReturn(...) so a test can describe a resume that exists and is owned by a particular user, without a database.</w:t>
+        <w:t xml:space="preserve">Stub: an object configured to return prepared answers, supplying the state a scenario needs. The repositories are stubbed with when(...).thenReturn(...) so a test can describe a resume that exists and is owned by a particular user, without a database.</w:t>
       </w:r>
     </w:p>
     <w:p>
@@ -16977,7 +16977,7 @@
           <w:sz w:val="24"/>
           <w:szCs w:val="24"/>
         </w:rPr>
-        <w:t xml:space="preserve">Mock — a double whose interactions are themselves the assertion. TailoringProducer is a mock: the observable behaviour of triggerTailoring is that it publishes exactly one event with particular contents, so the test asserts with verify() and an ArgumentCaptor rather than by inspecting a return value. Equally important is the negative case, verified with never() and verifyNoInteractions(): when an ownership check fails, no job description is saved, no tailored resume is written, and nothing is published.</w:t>
+        <w:t xml:space="preserve">Mock: a double whose interactions are themselves the assertion. TailoringProducer is a mock: the observable behaviour of triggerTailoring is that it publishes exactly one event with particular contents, so the test asserts with verify() and an ArgumentCaptor instead of by inspecting a return value. Equally important is the negative case, verified with never() and verifyNoInteractions(): when an ownership check fails, no job description is saved, no tailored resume is written, and nothing is published.</w:t>
       </w:r>
     </w:p>
     <w:p>
@@ -16997,7 +16997,7 @@
           <w:sz w:val="24"/>
           <w:szCs w:val="24"/>
         </w:rPr>
-        <w:t xml:space="preserve">Fake — a real but simplified implementation. SimpleMeterRegistry is used in place of the production MeterRegistry because ResumeService constructs a Counter from it; a mock would return null and the constructor would fail. A fake is the correct double whenever the collaborator has behaviour the subject genuinely depends on.</w:t>
+        <w:t xml:space="preserve">Fake: a real but simplified implementation. SimpleMeterRegistry is used in place of the production MeterRegistry because ResumeService constructs a Counter from it; a mock would return null and the constructor would fail. A fake is the correct double whenever the collaborator has behaviour the subject genuinely depends on.</w:t>
       </w:r>
     </w:p>
     <w:p>
@@ -18049,7 +18049,7 @@
           <w:sz w:val="24"/>
           <w:szCs w:val="24"/>
         </w:rPr>
-        <w:t xml:space="preserve">Understanding that Kafka provides at-least-once rather than exactly-once delivery changed the consumer’s design. Redelivery is normal operation rather than an error, so the consumer must be idempotent. This is a general property of distributed messaging and not a Kafka limitation, and internalising it is the difference between a system that works in testing and one that works under failure.</w:t>
+        <w:t xml:space="preserve">Understanding that Kafka provides at-least-once instead of exactly-once delivery changed the consumer’s design. Redelivery is normal operation instead of an error, so the consumer must be idempotent. This is a general property of distributed messaging and not a Kafka limitation, and internalising it is the difference between a system that works in testing and one that works under failure.</w:t>
       </w:r>
     </w:p>
     <w:p>
@@ -18115,7 +18115,7 @@
           <w:sz w:val="24"/>
           <w:szCs w:val="24"/>
         </w:rPr>
-        <w:t xml:space="preserve">Placing the ownership check at the service boundary rather than in controllers was validated when a review found an endpoint that had been written without it. Because the convention was to enforce in the service, the gap was localised to one class and closing it was a small change with a regression test, rather than an audit of every controller.</w:t>
+        <w:t xml:space="preserve">Placing the ownership check at the service boundary instead of in controllers was validated when a review found an endpoint that had been written without it. Because the convention was to enforce in the service, the gap was localised to one class and closing it was a small change with a regression test, instead of an audit of every controller.</w:t>
       </w:r>
     </w:p>
     <w:p>
@@ -18196,7 +18196,7 @@
           <w:sz w:val="24"/>
           <w:szCs w:val="24"/>
         </w:rPr>
-        <w:t xml:space="preserve">The architectural pattern generalises well beyond that. Any system integrating a generative model into a transactional application faces the same constraints — the model is slow, non-deterministic, occasionally unavailable, and produces output that must not be trusted. The combination used here of a durable queue, an idempotent consumer, schema validation on output and a deterministic scoring step computed outside the model applies directly to document processing in insurance and legal work, to clinical note summarisation in healthcare, to support ticket triage, and to any workflow where a model proposes content that a system must then store and act upon.</w:t>
+        <w:t xml:space="preserve">The architectural pattern generalises well beyond that. Any system integrating a generative model into a transactional application faces the same constraints. The model is slow, non-deterministic, occasionally unavailable, and produces output that must not be trusted. The combination used here of a durable queue, an idempotent consumer, schema validation on output and a deterministic scoring step computed outside the model applies directly to document processing in insurance and legal work, to clinical note summarisation in healthcare, to support ticket triage, and to any workflow where a model proposes content that a system must then store and act upon.</w:t>
       </w:r>
     </w:p>
     <w:p>
@@ -18913,7 +18913,7 @@
           <w:sz w:val="24"/>
           <w:szCs w:val="24"/>
         </w:rPr>
-        <w:t xml:space="preserve">Apache Software Foundation, Apache Kafka Documentation — Design and Delivery Semantics, kafka.apache.org/documentation, referred August 2026.</w:t>
+        <w:t xml:space="preserve">Apache Software Foundation, Apache Kafka Documentation: Design and Delivery Semantics, kafka.apache.org/documentation, referred August 2026.</w:t>
       </w:r>
     </w:p>
     <w:p>
@@ -18953,7 +18953,7 @@
           <w:sz w:val="24"/>
           <w:szCs w:val="24"/>
         </w:rPr>
-        <w:t xml:space="preserve">VMware Tanzu, Spring Security Reference — Architecture and Authorization, docs.spring.io/spring-security/reference, referred August 2026.</w:t>
+        <w:t xml:space="preserve">VMware Tanzu, Spring Security Reference: Architecture and Authorization, docs.spring.io/spring-security/reference, referred August 2026.</w:t>
       </w:r>
     </w:p>
     <w:p>
@@ -18973,7 +18973,7 @@
           <w:sz w:val="24"/>
           <w:szCs w:val="24"/>
         </w:rPr>
-        <w:t xml:space="preserve">Red Hat, Hibernate ORM 6.5 User Guide — Associations, Fetching and Locking, docs.jboss.org/hibernate/orm/6.5/userguide, referred August 2026.</w:t>
+        <w:t xml:space="preserve">Red Hat, Hibernate ORM 6.5 User Guide: Associations, Fetching and Locking, docs.jboss.org/hibernate/orm/6.5/userguide, referred August 2026.</w:t>
       </w:r>
     </w:p>
     <w:p>
@@ -18993,7 +18993,7 @@
           <w:sz w:val="24"/>
           <w:szCs w:val="24"/>
         </w:rPr>
-        <w:t xml:space="preserve">PostgreSQL Global Development Group, PostgreSQL 16 Documentation — Indexes and Concurrency Control, postgresql.org/docs/16, referred August 2026.</w:t>
+        <w:t xml:space="preserve">PostgreSQL Global Development Group, PostgreSQL 16 Documentation: Indexes and Concurrency Control, postgresql.org/docs/16, referred August 2026.</w:t>
       </w:r>
     </w:p>
     <w:p>
@@ -19013,7 +19013,7 @@
           <w:sz w:val="24"/>
           <w:szCs w:val="24"/>
         </w:rPr>
-        <w:t xml:space="preserve">Redgate, Flyway Documentation — Migrations and Versioning, documentation.red-gate.com/flyway, referred August 2026.</w:t>
+        <w:t xml:space="preserve">Redgate, Flyway Documentation: Migrations and Versioning, documentation.red-gate.com/flyway, referred August 2026.</w:t>
       </w:r>
     </w:p>
     <w:p>
@@ -19033,7 +19033,7 @@
           <w:sz w:val="24"/>
           <w:szCs w:val="24"/>
         </w:rPr>
-        <w:t xml:space="preserve">Redis Ltd., Redis Documentation — Key Expiration and Data Types, redis.io/docs, referred August 2026.</w:t>
+        <w:t xml:space="preserve">Redis Ltd., Redis Documentation: Key Expiration and Data Types, redis.io/docs, referred August 2026.</w:t>
       </w:r>
     </w:p>
     <w:p>
@@ -19073,7 +19073,7 @@
           <w:sz w:val="24"/>
           <w:szCs w:val="24"/>
         </w:rPr>
-        <w:t xml:space="preserve">Amazon Web Services, Amazon RDS User Guide — Multi-AZ Deployments, docs.aws.amazon.com/AmazonRDS, referred August 2026.</w:t>
+        <w:t xml:space="preserve">Amazon Web Services, Amazon RDS User Guide: Multi-AZ Deployments, docs.aws.amazon.com/AmazonRDS, referred August 2026.</w:t>
       </w:r>
     </w:p>
     <w:p>
@@ -19113,7 +19113,7 @@
           <w:sz w:val="24"/>
           <w:szCs w:val="24"/>
         </w:rPr>
-        <w:t xml:space="preserve">OWASP Foundation, OWASP API Security Top 10 — API1:2023 Broken Object Level Authorization, owasp.org/API-Security, referred August 2026.</w:t>
+        <w:t xml:space="preserve">OWASP Foundation, OWASP API Security Top 10: API1:2023 Broken Object Level Authorization, owasp.org/API-Security, referred August 2026.</w:t>
       </w:r>
     </w:p>
     <w:p>
@@ -19133,7 +19133,7 @@
           <w:sz w:val="24"/>
           <w:szCs w:val="24"/>
         </w:rPr>
-        <w:t xml:space="preserve">OWASP Foundation, OWASP Top 10 for Large Language Model Applications — LLM01 Prompt Injection, owasp.org/www-project-top-10-for-large-language-model-applications, referred August 2026.</w:t>
+        <w:t xml:space="preserve">OWASP Foundation, OWASP Top 10 for Large Language Model Applications: LLM01 Prompt Injection, owasp.org/www-project-top-10-for-large-language-model-applications, referred August 2026.</w:t>
       </w:r>
     </w:p>
     <w:p>
@@ -19173,7 +19173,7 @@
           <w:sz w:val="24"/>
           <w:szCs w:val="24"/>
         </w:rPr>
-        <w:t xml:space="preserve">Fielding R. and Reschke J., RFC 7231: HTTP/1.1 Semantics and Content — Section 6.3.3 (202 Accepted), Internet Engineering Task Force, 2014.</w:t>
+        <w:t xml:space="preserve">Fielding R. and Reschke J., RFC 7231: HTTP/1.1 Semantics and Content: Section 6.3.3 (202 Accepted), Internet Engineering Task Force, 2014.</w:t>
       </w:r>
     </w:p>
     <w:p>
@@ -19253,7 +19253,7 @@
           <w:sz w:val="24"/>
           <w:szCs w:val="24"/>
         </w:rPr>
-        <w:t xml:space="preserve">Richardson C., Microservices Patterns — Chapter 3, Transactional Messaging and the Outbox Pattern, Manning Publications, 2018.</w:t>
+        <w:t xml:space="preserve">Richardson C., Microservices Patterns, Chapter 3, Transactional Messaging and the Outbox Pattern, Manning Publications, 2018.</w:t>
       </w:r>
     </w:p>
     <w:p>
@@ -19273,7 +19273,7 @@
           <w:sz w:val="24"/>
           <w:szCs w:val="24"/>
         </w:rPr>
-        <w:t xml:space="preserve">Fowler M., Patterns of Enterprise Application Architecture — Optimistic Offline Lock, Addison-Wesley, 2002.</w:t>
+        <w:t xml:space="preserve">Fowler M., Patterns of Enterprise Application Architecture, Optimistic Offline Lock, Addison-Wesley, 2002.</w:t>
       </w:r>
     </w:p>
     <w:p>

</xml_diff>

<commit_message>
docs: repair two clarity regressions from the dash removal
Replacing an explanatory dash with a comma changed what the clause
attached to: 'falls from 31 to 1, one query for the parents plus one per
resume' reads as though the explanation describes the 1 when it
describes the 31. Rewritten as two sentences. Also restored 'rather
than' in one place where 'instead of' had made the comparison clumsy.
</commit_message>
<xml_diff>
--- a/docs/ResumeForge_Applied_Software_Project_Report.docx
+++ b/docs/ResumeForge_Applied_Software_Project_Report.docx
@@ -14943,7 +14943,7 @@
           <w:sz w:val="24"/>
           <w:szCs w:val="24"/>
         </w:rPr>
-        <w:t xml:space="preserve">The statement count falls from 31 to 1, one query for the parents plus one per resume, collapsed into a single fetch-joined query. Median latency falls from 3.487 ms to 1.126 ms, an improvement of 67.7%. The proportional gain would be substantially larger against a networked database, because each eliminated statement there costs a network round trip instead of an in-process call.</w:t>
+        <w:t xml:space="preserve">The statement count falls from 31 to 1. The original 31 were one query for the parent rows plus one for each resume, and the fetch join collapses them into a single statement. Median latency falls from 3.487 ms to 1.126 ms, an improvement of 67.7%. The proportional gain would be substantially larger against a networked database, because each eliminated statement there costs a network round trip instead of an in-process call.</w:t>
       </w:r>
     </w:p>
     <w:p>
@@ -18115,7 +18115,7 @@
           <w:sz w:val="24"/>
           <w:szCs w:val="24"/>
         </w:rPr>
-        <w:t xml:space="preserve">Placing the ownership check at the service boundary instead of in controllers was validated when a review found an endpoint that had been written without it. Because the convention was to enforce in the service, the gap was localised to one class and closing it was a small change with a regression test, instead of an audit of every controller.</w:t>
+        <w:t xml:space="preserve">Placing the ownership check at the service boundary instead of in controllers was validated when a review found an endpoint that had been written without it. Because the convention was to enforce in the service, the gap was localised to one class and closing it was a small change with a regression test rather than an audit of every controller.</w:t>
       </w:r>
     </w:p>
     <w:p>

</xml_diff>

<commit_message>
docs: correct the three page numbers the worker suite table shifted
Adding three rows to table 8.01 spilled a page, and the longer limitation
entry spilled another inside the conclusion, so the shift was not uniform:
Conclusion moved from 44 to 45 and References from 47 to 49, while table
9.01 moved from 45 to 46. Everything before page 41 is unaffected and all
nine figure pages are unchanged.

Numbers are taken from the exported PDF, where the printed footer matches
the page index exactly; the Drive preview numbers one page lower and is
not what a reader of the PDF sees.
</commit_message>
<xml_diff>
--- a/docs/ResumeForge_Applied_Software_Project_Report.docx
+++ b/docs/ResumeForge_Applied_Software_Project_Report.docx
@@ -1081,7 +1081,7 @@
           <w:szCs w:val="24"/>
         </w:rPr>
         <w:tab/>
-        <w:t xml:space="preserve">44</w:t>
+        <w:t xml:space="preserve">45</w:t>
       </w:r>
     </w:p>
     <w:p>
@@ -1109,7 +1109,7 @@
           <w:szCs w:val="24"/>
         </w:rPr>
         <w:tab/>
-        <w:t xml:space="preserve">47</w:t>
+        <w:t xml:space="preserve">49</w:t>
       </w:r>
     </w:p>
     <w:p>
@@ -2302,7 +2302,7 @@
                 <w:sz w:val="22"/>
                 <w:szCs w:val="22"/>
               </w:rPr>
-              <w:t xml:space="preserve">45</w:t>
+              <w:t xml:space="preserve">46</w:t>
             </w:r>
           </w:p>
         </w:tc>

</xml_diff>

<commit_message>
docs: match the generator to the submitted document
The submitted PDF was diffed against the generated file. Three edits had
been made in the hosted copy and existed nowhere in the repository, so
regenerating would have silently reverted them.

The declaration no longer carries the module start and end placeholders,
the candidate date is filled from the submission date rather than left as
a dotted rule, and the two parenthetical template instructions above the
list of tables and the list of figures are removed now that both lists
are populated.

Pagination is unaffected: the hosted copy already had these edits and
exports to the same fifty pages with every caption on the same page.
</commit_message>
<xml_diff>
--- a/docs/ResumeForge_Applied_Software_Project_Report.docx
+++ b/docs/ResumeForge_Applied_Software_Project_Report.docx
@@ -466,7 +466,7 @@
           <w:sz w:val="24"/>
           <w:szCs w:val="24"/>
         </w:rPr>
-        <w:t xml:space="preserve">I confirm that this project report, submitted to fulfill the requirements for the Master of Science in Computer Science degree, completed by me from ……………………… to ………………………, is the result of my own individual endeavor. The Project has been made on my own under the guidance of my supervisor with proper acknowledgement and without plagiarism. Any contributions from external sources or individuals, including the use of AI tools, are appropriately acknowledged through citation. By making this declaration, I acknowledge that any violation of this statement constitutes academic misconduct. I understand that such misconduct may lead to expulsion from the program and/or disqualification from receiving the degree.</w:t>
+        <w:t xml:space="preserve">I confirm that this project report, submitted to fulfill the requirements for the Master of Science in Computer Science degree, completed by me is the result of my own individual endeavor. The Project has been made on my own under the guidance of my supervisor with proper acknowledgement and without plagiarism. Any contributions from external sources or individuals, including the use of AI tools, are appropriately acknowledged through citation. By making this declaration, I acknowledge that any violation of this statement constitutes academic misconduct. I understand that such misconduct may lead to expulsion from the program and/or disqualification from receiving the degree.</w:t>
       </w:r>
     </w:p>
     <w:p>
@@ -596,7 +596,7 @@
           <w:sz w:val="24"/>
           <w:szCs w:val="24"/>
         </w:rPr>
-        <w:t xml:space="preserve">Signature of the Candidate: ……………………………                    Date: ……………………</w:t>
+        <w:t xml:space="preserve">Signature of the Candidate:                    Date: 10/08/2026</w:t>
       </w:r>
     </w:p>
     <w:p>
@@ -1133,23 +1133,6 @@
           <w:szCs w:val="28"/>
         </w:rPr>
         <w:t xml:space="preserve">List of Tables</w:t>
-      </w:r>
-    </w:p>
-    <w:p>
-      <w:pPr>
-        <w:spacing w:after="120" w:line="360"/>
-        <w:jc w:val="left"/>
-      </w:pPr>
-      <w:r>
-        <w:rPr>
-          <w:rFonts w:ascii="Times New Roman" w:cs="Times New Roman" w:eastAsia="Times New Roman" w:hAnsi="Times New Roman"/>
-          <w:i/>
-          <w:iCs/>
-          <w:color w:val="000000"/>
-          <w:sz w:val="24"/>
-          <w:szCs w:val="24"/>
-        </w:rPr>
-        <w:t xml:space="preserve">(To be written sequentially as they appear in the text)</w:t>
       </w:r>
     </w:p>
     <w:p>
@@ -2329,23 +2312,6 @@
           <w:szCs w:val="28"/>
         </w:rPr>
         <w:t xml:space="preserve">List of Figures</w:t>
-      </w:r>
-    </w:p>
-    <w:p>
-      <w:pPr>
-        <w:spacing w:after="120" w:line="360"/>
-        <w:jc w:val="left"/>
-      </w:pPr>
-      <w:r>
-        <w:rPr>
-          <w:rFonts w:ascii="Times New Roman" w:cs="Times New Roman" w:eastAsia="Times New Roman" w:hAnsi="Times New Roman"/>
-          <w:i/>
-          <w:iCs/>
-          <w:color w:val="000000"/>
-          <w:sz w:val="24"/>
-          <w:szCs w:val="24"/>
-        </w:rPr>
-        <w:t xml:space="preserve">(List of Images, Graphs, Charts sequentially as they appear in the text)</w:t>
       </w:r>
     </w:p>
     <w:p>

</xml_diff>

<commit_message>
docs: correct the table count and record the dead tables
Section 5.1 said a database built from the full migration chain holds
eight tables. It holds ten. Migration V3 creates batch_requests and
batch_items for a batch feature that was never built, and neither is
dropped later; nothing in the Java source refers to either name. The
earlier correction caught the vestigial subscriptions table and stopped
there, so the count was wrong in both directions of the audit.

The three unused tables are now named in Section 5.1, listed as a
limitation in Table 9.01 and recorded in the README schema section.
They are harmless while ddl-auto stays on validate, but the schema
should describe only what the system uses.
</commit_message>
<xml_diff>
--- a/docs/ResumeForge_Applied_Software_Project_Report.docx
+++ b/docs/ResumeForge_Applied_Software_Project_Report.docx
@@ -11177,7 +11177,7 @@
           <w:sz w:val="24"/>
           <w:szCs w:val="24"/>
         </w:rPr>
-        <w:t xml:space="preserve">Tables, with primary keys and the columns that carry meaning. Seven tables carry the domain; migration V8 also creates a subscriptions table left over from a removed payment integration, which no entity maps and no code writes to, so a database built from the full migration chain holds eight tables rather than seven:</w:t>
+        <w:t xml:space="preserve">Tables, with primary keys and the columns that carry meaning. Seven tables carry the domain, and the migration chain creates three more that nothing uses. Migration V3 adds batch_requests and batch_items for a batch-processing feature that was never built, and migration V8 recreates a subscriptions table left over from a removed payment integration after migration V7 had dropped it. No entity maps any of the three and no code reads or writes them, so a database built from the full chain holds ten tables rather than the seven the application needs:</w:t>
       </w:r>
     </w:p>
     <w:p>
@@ -19093,6 +19093,64 @@
                 <w:szCs w:val="22"/>
               </w:rPr>
               <w:t xml:space="preserve">The worker writes to the resume service’s tables with native SQL, bypassing the optimistic lock. Remedied by routing writes through an owning service.</w:t>
+            </w:r>
+          </w:p>
+        </w:tc>
+      </w:tr>
+      <w:tr>
+        <w:tc>
+          <w:tcPr>
+            <w:tcW w:type="dxa" w:w="2490"/>
+            <w:tcMar>
+              <w:top w:type="dxa" w:w="70"/>
+              <w:left w:type="dxa" w:w="110"/>
+              <w:bottom w:type="dxa" w:w="70"/>
+              <w:right w:type="dxa" w:w="110"/>
+            </w:tcMar>
+          </w:tcPr>
+          <w:p>
+            <w:pPr>
+              <w:spacing w:after="0" w:line="240"/>
+              <w:jc w:val="left"/>
+            </w:pPr>
+            <w:r>
+              <w:rPr>
+                <w:rFonts w:ascii="Times New Roman" w:cs="Times New Roman" w:eastAsia="Times New Roman" w:hAnsi="Times New Roman"/>
+                <w:b w:val="false"/>
+                <w:bCs w:val="false"/>
+                <w:color w:val="000000"/>
+                <w:sz w:val="22"/>
+                <w:szCs w:val="22"/>
+              </w:rPr>
+              <w:t xml:space="preserve">Dead tables in the migration chain</w:t>
+            </w:r>
+          </w:p>
+        </w:tc>
+        <w:tc>
+          <w:tcPr>
+            <w:tcW w:type="dxa" w:w="5810"/>
+            <w:tcMar>
+              <w:top w:type="dxa" w:w="70"/>
+              <w:left w:type="dxa" w:w="110"/>
+              <w:bottom w:type="dxa" w:w="70"/>
+              <w:right w:type="dxa" w:w="110"/>
+            </w:tcMar>
+          </w:tcPr>
+          <w:p>
+            <w:pPr>
+              <w:spacing w:after="0" w:line="240"/>
+              <w:jc w:val="left"/>
+            </w:pPr>
+            <w:r>
+              <w:rPr>
+                <w:rFonts w:ascii="Times New Roman" w:cs="Times New Roman" w:eastAsia="Times New Roman" w:hAnsi="Times New Roman"/>
+                <w:b w:val="false"/>
+                <w:bCs w:val="false"/>
+                <w:color w:val="000000"/>
+                <w:sz w:val="22"/>
+                <w:szCs w:val="22"/>
+              </w:rPr>
+              <w:t xml:space="preserve">A database built from V1 to V8 holds three tables no entity maps and no code touches: batch_requests and batch_items from an abandoned batch feature, and subscriptions from a removed payment integration. They are harmless because ddl-auto is set to validate rather than update, but they should be removed by a further migration so the schema describes only what the system uses.</w:t>
             </w:r>
           </w:p>
         </w:tc>

</xml_diff>